<commit_message>
spring boot and microservices intro
</commit_message>
<xml_diff>
--- a/Phase 3 Api Endpoints.docx
+++ b/Phase 3 Api Endpoints.docx
@@ -5009,6 +5009,9 @@
         <w:ind w:left="360" w:firstLine="0"/>
       </w:pPr>
       <w:r>
+        <w:rPr>
+          <w:noProof/>
+        </w:rPr>
         <w:lastRenderedPageBreak/>
         <w:drawing>
           <wp:inline distT="0" distB="0" distL="0" distR="0" wp14:anchorId="2CFD8939" wp14:editId="142CDB06">
@@ -5101,6 +5104,9 @@
         <w:ind w:left="360" w:firstLine="0"/>
       </w:pPr>
       <w:r>
+        <w:rPr>
+          <w:noProof/>
+        </w:rPr>
         <w:lastRenderedPageBreak/>
         <w:drawing>
           <wp:inline distT="0" distB="0" distL="0" distR="0" wp14:anchorId="0BCFEC57" wp14:editId="39BA12BC">
@@ -5165,6 +5171,9 @@
         <w:ind w:left="360" w:firstLine="0"/>
       </w:pPr>
       <w:r>
+        <w:rPr>
+          <w:noProof/>
+        </w:rPr>
         <w:drawing>
           <wp:inline distT="0" distB="0" distL="0" distR="0" wp14:anchorId="69538871" wp14:editId="30BB0B01">
             <wp:extent cx="5943600" cy="3091180"/>
@@ -5358,6 +5367,9 @@
         <w:ind w:left="0" w:firstLine="0"/>
       </w:pPr>
       <w:r>
+        <w:rPr>
+          <w:noProof/>
+        </w:rPr>
         <w:drawing>
           <wp:inline distT="0" distB="0" distL="0" distR="0" wp14:anchorId="768A834B" wp14:editId="6A0B6A4C">
             <wp:extent cx="5943600" cy="814705"/>
@@ -5411,6 +5423,9 @@
         <w:ind w:left="0" w:firstLine="0"/>
       </w:pPr>
       <w:r>
+        <w:rPr>
+          <w:noProof/>
+        </w:rPr>
         <w:lastRenderedPageBreak/>
         <w:drawing>
           <wp:inline distT="0" distB="0" distL="0" distR="0" wp14:anchorId="3178BEB4" wp14:editId="0BE93E58">
@@ -5470,6 +5485,9 @@
         <w:ind w:left="0" w:firstLine="0"/>
       </w:pPr>
       <w:r>
+        <w:rPr>
+          <w:noProof/>
+        </w:rPr>
         <w:drawing>
           <wp:inline distT="0" distB="0" distL="0" distR="0" wp14:anchorId="27C73FE2" wp14:editId="7759EFD6">
             <wp:extent cx="5943600" cy="1869440"/>
@@ -5523,6 +5541,9 @@
         <w:ind w:left="0" w:firstLine="0"/>
       </w:pPr>
       <w:r>
+        <w:rPr>
+          <w:noProof/>
+        </w:rPr>
         <w:lastRenderedPageBreak/>
         <w:drawing>
           <wp:inline distT="0" distB="0" distL="0" distR="0" wp14:anchorId="37C776A5" wp14:editId="3D7625AC">
@@ -5577,6 +5598,9 @@
         <w:ind w:left="0" w:firstLine="0"/>
       </w:pPr>
       <w:r>
+        <w:rPr>
+          <w:noProof/>
+        </w:rPr>
         <w:drawing>
           <wp:inline distT="0" distB="0" distL="0" distR="0" wp14:anchorId="6F10E536" wp14:editId="678A4646">
             <wp:extent cx="5943600" cy="2390775"/>
@@ -5639,6 +5663,9 @@
         <w:ind w:left="0" w:firstLine="0"/>
       </w:pPr>
       <w:r>
+        <w:rPr>
+          <w:noProof/>
+        </w:rPr>
         <w:drawing>
           <wp:inline distT="0" distB="0" distL="0" distR="0" wp14:anchorId="75D5CB40" wp14:editId="1B2982A0">
             <wp:extent cx="5943600" cy="4473575"/>
@@ -5684,6 +5711,1121 @@
         <w:t>Right now we will keep only three operations and later we can implement update &amp; delete, now in the webservice we must create controllers to invoke create and read profiles, but we will keep same URL but different HTTP methods.</w:t>
       </w:r>
     </w:p>
+    <w:p>
+      <w:pPr>
+        <w:ind w:left="0" w:firstLine="0"/>
+      </w:pPr>
+      <w:r>
+        <w:rPr>
+          <w:highlight w:val="yellow"/>
+        </w:rPr>
+        <w:t>09-05-2026</w:t>
+      </w:r>
+    </w:p>
+    <w:p>
+      <w:pPr>
+        <w:ind w:left="0" w:firstLine="0"/>
+      </w:pPr>
+      <w:r>
+        <w:t>DELETE &amp; UPDATE: To delete or update you can use HTTP methods like DELETE &amp; PUT/PATCH</w:t>
+      </w:r>
+    </w:p>
+    <w:p>
+      <w:pPr>
+        <w:ind w:left="0" w:firstLine="0"/>
+      </w:pPr>
+      <w:r>
+        <w:t>For Update you don’t have any method inside the JpaRepository, you just get the entity and set the value, then it automatically updates the entity and reflects in the table</w:t>
+      </w:r>
+    </w:p>
+    <w:p>
+      <w:pPr>
+        <w:ind w:left="0" w:firstLine="0"/>
+      </w:pPr>
+      <w:r>
+        <w:t>Profile profile = findProfile(100);</w:t>
+      </w:r>
+      <w:r>
+        <w:br/>
+        <w:t>if(profile != null) profile.setPhone(93892323); // this automatically saves changes to the DB</w:t>
+      </w:r>
+    </w:p>
+    <w:p>
+      <w:pPr>
+        <w:ind w:left="0" w:firstLine="0"/>
+      </w:pPr>
+      <w:r>
+        <w:lastRenderedPageBreak/>
+        <w:t>For Delete you can use deleteById(ID id) method of JpaRepository</w:t>
+      </w:r>
+    </w:p>
+    <w:p>
+      <w:pPr>
+        <w:ind w:left="0" w:firstLine="0"/>
+      </w:pPr>
+      <w:r>
+        <w:t>dao.deleteById(100);</w:t>
+      </w:r>
+    </w:p>
+    <w:p>
+      <w:pPr>
+        <w:ind w:left="0" w:firstLine="0"/>
+      </w:pPr>
+      <w:r>
+        <w:rPr>
+          <w:highlight w:val="yellow"/>
+        </w:rPr>
+        <w:t>Update Profile</w:t>
+      </w:r>
+    </w:p>
+    <w:p>
+      <w:pPr>
+        <w:ind w:left="0" w:firstLine="0"/>
+      </w:pPr>
+      <w:r>
+        <w:drawing>
+          <wp:inline distT="0" distB="0" distL="0" distR="0" wp14:anchorId="0D36A0FB" wp14:editId="07540371">
+            <wp:extent cx="5943600" cy="3937635"/>
+            <wp:effectExtent l="0" t="0" r="0" b="5715"/>
+            <wp:docPr id="518589958" name="Picture 1"/>
+            <wp:cNvGraphicFramePr>
+              <a:graphicFrameLocks xmlns:a="http://schemas.openxmlformats.org/drawingml/2006/main" noChangeAspect="1"/>
+            </wp:cNvGraphicFramePr>
+            <a:graphic xmlns:a="http://schemas.openxmlformats.org/drawingml/2006/main">
+              <a:graphicData uri="http://schemas.openxmlformats.org/drawingml/2006/picture">
+                <pic:pic xmlns:pic="http://schemas.openxmlformats.org/drawingml/2006/picture">
+                  <pic:nvPicPr>
+                    <pic:cNvPr id="518589958" name=""/>
+                    <pic:cNvPicPr/>
+                  </pic:nvPicPr>
+                  <pic:blipFill>
+                    <a:blip r:embed="rId53"/>
+                    <a:stretch>
+                      <a:fillRect/>
+                    </a:stretch>
+                  </pic:blipFill>
+                  <pic:spPr>
+                    <a:xfrm>
+                      <a:off x="0" y="0"/>
+                      <a:ext cx="5943600" cy="3937635"/>
+                    </a:xfrm>
+                    <a:prstGeom prst="rect">
+                      <a:avLst/>
+                    </a:prstGeom>
+                  </pic:spPr>
+                </pic:pic>
+              </a:graphicData>
+            </a:graphic>
+          </wp:inline>
+        </w:drawing>
+      </w:r>
+    </w:p>
+    <w:p>
+      <w:pPr>
+        <w:ind w:left="0" w:firstLine="0"/>
+      </w:pPr>
+      <w:r>
+        <w:rPr>
+          <w:highlight w:val="yellow"/>
+        </w:rPr>
+        <w:t>Profile.java</w:t>
+      </w:r>
+    </w:p>
+    <w:p>
+      <w:pPr>
+        <w:ind w:left="0" w:firstLine="0"/>
+      </w:pPr>
+      <w:r>
+        <w:lastRenderedPageBreak/>
+        <w:drawing>
+          <wp:inline distT="0" distB="0" distL="0" distR="0" wp14:anchorId="55C5C3BC" wp14:editId="7802E20B">
+            <wp:extent cx="5943600" cy="5031740"/>
+            <wp:effectExtent l="0" t="0" r="0" b="0"/>
+            <wp:docPr id="1181390551" name="Picture 1"/>
+            <wp:cNvGraphicFramePr>
+              <a:graphicFrameLocks xmlns:a="http://schemas.openxmlformats.org/drawingml/2006/main" noChangeAspect="1"/>
+            </wp:cNvGraphicFramePr>
+            <a:graphic xmlns:a="http://schemas.openxmlformats.org/drawingml/2006/main">
+              <a:graphicData uri="http://schemas.openxmlformats.org/drawingml/2006/picture">
+                <pic:pic xmlns:pic="http://schemas.openxmlformats.org/drawingml/2006/picture">
+                  <pic:nvPicPr>
+                    <pic:cNvPr id="1181390551" name=""/>
+                    <pic:cNvPicPr/>
+                  </pic:nvPicPr>
+                  <pic:blipFill>
+                    <a:blip r:embed="rId54"/>
+                    <a:stretch>
+                      <a:fillRect/>
+                    </a:stretch>
+                  </pic:blipFill>
+                  <pic:spPr>
+                    <a:xfrm>
+                      <a:off x="0" y="0"/>
+                      <a:ext cx="5943600" cy="5031740"/>
+                    </a:xfrm>
+                    <a:prstGeom prst="rect">
+                      <a:avLst/>
+                    </a:prstGeom>
+                  </pic:spPr>
+                </pic:pic>
+              </a:graphicData>
+            </a:graphic>
+          </wp:inline>
+        </w:drawing>
+      </w:r>
+    </w:p>
+    <w:p>
+      <w:pPr>
+        <w:ind w:left="0" w:firstLine="0"/>
+      </w:pPr>
+      <w:r>
+        <w:rPr>
+          <w:highlight w:val="yellow"/>
+        </w:rPr>
+        <w:t>ProfileApi.java</w:t>
+      </w:r>
+    </w:p>
+    <w:p>
+      <w:pPr>
+        <w:ind w:left="0" w:firstLine="0"/>
+      </w:pPr>
+      <w:r>
+        <w:lastRenderedPageBreak/>
+        <w:drawing>
+          <wp:inline distT="0" distB="0" distL="0" distR="0" wp14:anchorId="74DCD4AC" wp14:editId="04E77E69">
+            <wp:extent cx="5943600" cy="4549140"/>
+            <wp:effectExtent l="0" t="0" r="0" b="3810"/>
+            <wp:docPr id="1569005286" name="Picture 1"/>
+            <wp:cNvGraphicFramePr>
+              <a:graphicFrameLocks xmlns:a="http://schemas.openxmlformats.org/drawingml/2006/main" noChangeAspect="1"/>
+            </wp:cNvGraphicFramePr>
+            <a:graphic xmlns:a="http://schemas.openxmlformats.org/drawingml/2006/main">
+              <a:graphicData uri="http://schemas.openxmlformats.org/drawingml/2006/picture">
+                <pic:pic xmlns:pic="http://schemas.openxmlformats.org/drawingml/2006/picture">
+                  <pic:nvPicPr>
+                    <pic:cNvPr id="1569005286" name=""/>
+                    <pic:cNvPicPr/>
+                  </pic:nvPicPr>
+                  <pic:blipFill>
+                    <a:blip r:embed="rId55"/>
+                    <a:stretch>
+                      <a:fillRect/>
+                    </a:stretch>
+                  </pic:blipFill>
+                  <pic:spPr>
+                    <a:xfrm>
+                      <a:off x="0" y="0"/>
+                      <a:ext cx="5943600" cy="4549140"/>
+                    </a:xfrm>
+                    <a:prstGeom prst="rect">
+                      <a:avLst/>
+                    </a:prstGeom>
+                  </pic:spPr>
+                </pic:pic>
+              </a:graphicData>
+            </a:graphic>
+          </wp:inline>
+        </w:drawing>
+      </w:r>
+    </w:p>
+    <w:p>
+      <w:pPr>
+        <w:ind w:left="0" w:firstLine="0"/>
+      </w:pPr>
+      <w:r>
+        <w:t>Note: For PutMapping, we are sending partial data just for learning purpose, but in real time we use PutMapping whenever we want to perform full update</w:t>
+      </w:r>
+    </w:p>
+    <w:p>
+      <w:pPr>
+        <w:ind w:left="0" w:firstLine="0"/>
+      </w:pPr>
+      <w:r>
+        <w:t>Note: For long type the spring library is sending null, hence we use Long instead of long</w:t>
+      </w:r>
+    </w:p>
+    <w:p>
+      <w:pPr>
+        <w:ind w:left="0" w:firstLine="0"/>
+      </w:pPr>
+      <w:r>
+        <w:rPr>
+          <w:highlight w:val="yellow"/>
+        </w:rPr>
+        <w:t>Activity:</w:t>
+      </w:r>
+    </w:p>
+    <w:p>
+      <w:pPr>
+        <w:ind w:left="0" w:firstLine="0"/>
+      </w:pPr>
+      <w:r>
+        <w:t>Implement Delete operation, where you send id as a path parameter and the profile with an id should be deleted</w:t>
+      </w:r>
+      <w:r>
+        <w:t>.</w:t>
+      </w:r>
+    </w:p>
+    <w:p>
+      <w:pPr>
+        <w:ind w:left="0" w:firstLine="0"/>
+      </w:pPr>
+    </w:p>
+    <w:p>
+      <w:pPr>
+        <w:ind w:left="0" w:firstLine="0"/>
+      </w:pPr>
+      <w:r>
+        <w:rPr>
+          <w:highlight w:val="yellow"/>
+        </w:rPr>
+        <w:t>AOP</w:t>
+      </w:r>
+      <w:r>
+        <w:t>: Aspect Oriented Programming, it enables implementing cross cutting concerns in the application</w:t>
+      </w:r>
+    </w:p>
+    <w:p>
+      <w:pPr>
+        <w:ind w:left="0" w:firstLine="0"/>
+      </w:pPr>
+      <w:r>
+        <w:lastRenderedPageBreak/>
+        <w:t>Cross Cutting concerns are the logics that are executed when some other logics are executed.</w:t>
+      </w:r>
+    </w:p>
+    <w:p>
+      <w:pPr>
+        <w:ind w:left="0" w:firstLine="0"/>
+      </w:pPr>
+      <w:r>
+        <w:t>ex: logging</w:t>
+      </w:r>
+      <w:r>
+        <w:t>, tracing</w:t>
+      </w:r>
+    </w:p>
+    <w:p>
+      <w:pPr>
+        <w:ind w:left="0" w:firstLine="0"/>
+      </w:pPr>
+      <w:r>
+        <w:rPr>
+          <w:highlight w:val="yellow"/>
+        </w:rPr>
+        <w:t>AOP terminologies</w:t>
+      </w:r>
+    </w:p>
+    <w:p>
+      <w:pPr>
+        <w:pStyle w:val="ListParagraph"/>
+        <w:numPr>
+          <w:ilvl w:val="0"/>
+          <w:numId w:val="25"/>
+        </w:numPr>
+      </w:pPr>
+      <w:r>
+        <w:t>Advice: These are the logics or cross cutting concerns that needs to be called when a particular logic gets executed</w:t>
+      </w:r>
+    </w:p>
+    <w:p>
+      <w:pPr>
+        <w:pStyle w:val="ListParagraph"/>
+        <w:numPr>
+          <w:ilvl w:val="0"/>
+          <w:numId w:val="25"/>
+        </w:numPr>
+      </w:pPr>
+      <w:r>
+        <w:t>Aspect: These are classes which will have advice</w:t>
+      </w:r>
+      <w:r>
+        <w:t xml:space="preserve"> </w:t>
+      </w:r>
+    </w:p>
+    <w:p>
+      <w:pPr>
+        <w:pStyle w:val="ListParagraph"/>
+        <w:numPr>
+          <w:ilvl w:val="0"/>
+          <w:numId w:val="25"/>
+        </w:numPr>
+      </w:pPr>
+      <w:r>
+        <w:t>Join Point: These are the logics for which cross cutting concerns are applied</w:t>
+      </w:r>
+      <w:r>
+        <w:t>, this is the actual business logics</w:t>
+      </w:r>
+    </w:p>
+    <w:p>
+      <w:pPr>
+        <w:ind w:left="0" w:firstLine="0"/>
+      </w:pPr>
+    </w:p>
+    <w:p>
+      <w:pPr>
+        <w:ind w:left="0" w:firstLine="0"/>
+      </w:pPr>
+      <w:r>
+        <w:t>@Aspect</w:t>
+      </w:r>
+      <w:r>
+        <w:br/>
+        <w:t xml:space="preserve">class AspectDemo { </w:t>
+      </w:r>
+      <w:r>
+        <w:br/>
+        <w:t xml:space="preserve">  @Before</w:t>
+      </w:r>
+      <w:r>
+        <w:t>(“</w:t>
+      </w:r>
+      <w:r>
+        <w:t>execution(“com.examples.ProfileServiceImpl.createProfile”)</w:t>
+      </w:r>
+      <w:r>
+        <w:t xml:space="preserve">”) </w:t>
+      </w:r>
+      <w:r>
+        <w:br/>
+        <w:t xml:space="preserve">  public void beforeExec()  { .. } </w:t>
+      </w:r>
+      <w:r>
+        <w:br/>
+        <w:t xml:space="preserve">  @After</w:t>
+      </w:r>
+      <w:r>
+        <w:t>(“</w:t>
+      </w:r>
+      <w:r>
+        <w:t>execution(“com.examples.ProfileServiceImpl.createProfile”)</w:t>
+      </w:r>
+      <w:r>
+        <w:t>”)</w:t>
+      </w:r>
+      <w:r>
+        <w:br/>
+        <w:t xml:space="preserve">  </w:t>
+      </w:r>
+      <w:r>
+        <w:t xml:space="preserve"> </w:t>
+      </w:r>
+      <w:r>
+        <w:t xml:space="preserve">   public void afterExce() { .. }</w:t>
+      </w:r>
+      <w:r>
+        <w:br/>
+        <w:t>}</w:t>
+      </w:r>
+    </w:p>
+    <w:p>
+      <w:pPr>
+        <w:ind w:left="0" w:firstLine="0"/>
+      </w:pPr>
+      <w:r>
+        <w:rPr>
+          <w:highlight w:val="yellow"/>
+        </w:rPr>
+        <w:t>We must use following libraries</w:t>
+      </w:r>
+      <w:r>
+        <w:t xml:space="preserve"> </w:t>
+      </w:r>
+    </w:p>
+    <w:p>
+      <w:pPr>
+        <w:pStyle w:val="ListParagraph"/>
+        <w:numPr>
+          <w:ilvl w:val="0"/>
+          <w:numId w:val="26"/>
+        </w:numPr>
+      </w:pPr>
+      <w:r>
+        <w:t>spring boot aop starter</w:t>
+      </w:r>
+    </w:p>
+    <w:p>
+      <w:pPr>
+        <w:pStyle w:val="ListParagraph"/>
+        <w:numPr>
+          <w:ilvl w:val="0"/>
+          <w:numId w:val="26"/>
+        </w:numPr>
+      </w:pPr>
+      <w:r>
+        <w:t>aspectjweaver</w:t>
+      </w:r>
+    </w:p>
+    <w:p>
+      <w:pPr>
+        <w:ind w:left="0" w:firstLine="0"/>
+      </w:pPr>
+    </w:p>
+    <w:p>
+      <w:pPr>
+        <w:ind w:left="0" w:firstLine="0"/>
+      </w:pPr>
+      <w:r>
+        <w:rPr>
+          <w:highlight w:val="yellow"/>
+        </w:rPr>
+        <w:t>What are microservices?</w:t>
+      </w:r>
+    </w:p>
+    <w:p>
+      <w:pPr>
+        <w:ind w:left="0" w:firstLine="0"/>
+      </w:pPr>
+      <w:r>
+        <w:t xml:space="preserve">These are independent services which you can develop and deploy independently </w:t>
+      </w:r>
+      <w:r>
+        <w:t>to create loosely coupled services</w:t>
+      </w:r>
+    </w:p>
+    <w:p>
+      <w:pPr>
+        <w:ind w:left="0" w:firstLine="0"/>
+      </w:pPr>
+      <w:r>
+        <w:rPr>
+          <w:highlight w:val="yellow"/>
+        </w:rPr>
+        <w:t>Monolithic architecture</w:t>
+      </w:r>
+      <w:r>
+        <w:t xml:space="preserve"> </w:t>
+      </w:r>
+    </w:p>
+    <w:p>
+      <w:pPr>
+        <w:ind w:left="0" w:firstLine="0"/>
+      </w:pPr>
+      <w:r>
+        <w:lastRenderedPageBreak/>
+        <w:t>In monolithic architecture all the services are packaged and deployed into a single artifact, this increases dependency because when you make changes in any service other services need to be tested, you can’t scale single service, if the server goes down then all the services go down.</w:t>
+      </w:r>
+    </w:p>
+    <w:p>
+      <w:pPr>
+        <w:ind w:left="0" w:firstLine="0"/>
+      </w:pPr>
+      <w:r>
+        <w:drawing>
+          <wp:inline distT="0" distB="0" distL="0" distR="0" wp14:anchorId="4F2CEF36" wp14:editId="6E38F70F">
+            <wp:extent cx="5943600" cy="2633345"/>
+            <wp:effectExtent l="0" t="0" r="0" b="0"/>
+            <wp:docPr id="1747741849" name="Picture 1"/>
+            <wp:cNvGraphicFramePr>
+              <a:graphicFrameLocks xmlns:a="http://schemas.openxmlformats.org/drawingml/2006/main" noChangeAspect="1"/>
+            </wp:cNvGraphicFramePr>
+            <a:graphic xmlns:a="http://schemas.openxmlformats.org/drawingml/2006/main">
+              <a:graphicData uri="http://schemas.openxmlformats.org/drawingml/2006/picture">
+                <pic:pic xmlns:pic="http://schemas.openxmlformats.org/drawingml/2006/picture">
+                  <pic:nvPicPr>
+                    <pic:cNvPr id="1747741849" name=""/>
+                    <pic:cNvPicPr/>
+                  </pic:nvPicPr>
+                  <pic:blipFill>
+                    <a:blip r:embed="rId56"/>
+                    <a:stretch>
+                      <a:fillRect/>
+                    </a:stretch>
+                  </pic:blipFill>
+                  <pic:spPr>
+                    <a:xfrm>
+                      <a:off x="0" y="0"/>
+                      <a:ext cx="5943600" cy="2633345"/>
+                    </a:xfrm>
+                    <a:prstGeom prst="rect">
+                      <a:avLst/>
+                    </a:prstGeom>
+                  </pic:spPr>
+                </pic:pic>
+              </a:graphicData>
+            </a:graphic>
+          </wp:inline>
+        </w:drawing>
+      </w:r>
+    </w:p>
+    <w:p>
+      <w:pPr>
+        <w:ind w:left="0" w:firstLine="0"/>
+      </w:pPr>
+    </w:p>
+    <w:p>
+      <w:pPr>
+        <w:ind w:left="0" w:firstLine="0"/>
+      </w:pPr>
+      <w:r>
+        <w:t>In Microservices architecture each service are developed, tested and deployed independently, you can scale whichever the service gets high traffic without scaling other services, if you modify any one service you can only test that service, without testing other services, if any service goes down, other services will be still working, releasing new feature is quicker</w:t>
+      </w:r>
+    </w:p>
+    <w:p>
+      <w:pPr>
+        <w:ind w:left="0" w:firstLine="0"/>
+      </w:pPr>
+      <w:r>
+        <w:lastRenderedPageBreak/>
+        <w:drawing>
+          <wp:inline distT="0" distB="0" distL="0" distR="0" wp14:anchorId="774EF095" wp14:editId="2C65338D">
+            <wp:extent cx="5943600" cy="2809875"/>
+            <wp:effectExtent l="0" t="0" r="0" b="9525"/>
+            <wp:docPr id="1543908012" name="Picture 1"/>
+            <wp:cNvGraphicFramePr>
+              <a:graphicFrameLocks xmlns:a="http://schemas.openxmlformats.org/drawingml/2006/main" noChangeAspect="1"/>
+            </wp:cNvGraphicFramePr>
+            <a:graphic xmlns:a="http://schemas.openxmlformats.org/drawingml/2006/main">
+              <a:graphicData uri="http://schemas.openxmlformats.org/drawingml/2006/picture">
+                <pic:pic xmlns:pic="http://schemas.openxmlformats.org/drawingml/2006/picture">
+                  <pic:nvPicPr>
+                    <pic:cNvPr id="1543908012" name=""/>
+                    <pic:cNvPicPr/>
+                  </pic:nvPicPr>
+                  <pic:blipFill>
+                    <a:blip r:embed="rId57"/>
+                    <a:stretch>
+                      <a:fillRect/>
+                    </a:stretch>
+                  </pic:blipFill>
+                  <pic:spPr>
+                    <a:xfrm>
+                      <a:off x="0" y="0"/>
+                      <a:ext cx="5943600" cy="2809875"/>
+                    </a:xfrm>
+                    <a:prstGeom prst="rect">
+                      <a:avLst/>
+                    </a:prstGeom>
+                  </pic:spPr>
+                </pic:pic>
+              </a:graphicData>
+            </a:graphic>
+          </wp:inline>
+        </w:drawing>
+      </w:r>
+    </w:p>
+    <w:p>
+      <w:pPr>
+        <w:ind w:left="0" w:firstLine="0"/>
+      </w:pPr>
+    </w:p>
+    <w:p>
+      <w:pPr>
+        <w:ind w:left="0" w:firstLine="0"/>
+      </w:pPr>
+      <w:r>
+        <w:rPr>
+          <w:highlight w:val="yellow"/>
+        </w:rPr>
+        <w:t>Guidelines to follow while developing microservices</w:t>
+      </w:r>
+      <w:r>
+        <w:t xml:space="preserve"> </w:t>
+      </w:r>
+    </w:p>
+    <w:p>
+      <w:pPr>
+        <w:pStyle w:val="ListParagraph"/>
+        <w:numPr>
+          <w:ilvl w:val="0"/>
+          <w:numId w:val="27"/>
+        </w:numPr>
+      </w:pPr>
+      <w:r>
+        <w:t>Discovery Server -&gt; This registers all the microservices, so that microservices can locate other microservices to communicate</w:t>
+      </w:r>
+    </w:p>
+    <w:p>
+      <w:pPr>
+        <w:ind w:left="0" w:firstLine="0"/>
+      </w:pPr>
+      <w:r>
+        <w:drawing>
+          <wp:inline distT="0" distB="0" distL="0" distR="0" wp14:anchorId="72A1ACCC" wp14:editId="26CDAE15">
+            <wp:extent cx="5943600" cy="3055620"/>
+            <wp:effectExtent l="0" t="0" r="0" b="0"/>
+            <wp:docPr id="220492803" name="Picture 1"/>
+            <wp:cNvGraphicFramePr>
+              <a:graphicFrameLocks xmlns:a="http://schemas.openxmlformats.org/drawingml/2006/main" noChangeAspect="1"/>
+            </wp:cNvGraphicFramePr>
+            <a:graphic xmlns:a="http://schemas.openxmlformats.org/drawingml/2006/main">
+              <a:graphicData uri="http://schemas.openxmlformats.org/drawingml/2006/picture">
+                <pic:pic xmlns:pic="http://schemas.openxmlformats.org/drawingml/2006/picture">
+                  <pic:nvPicPr>
+                    <pic:cNvPr id="220492803" name=""/>
+                    <pic:cNvPicPr/>
+                  </pic:nvPicPr>
+                  <pic:blipFill>
+                    <a:blip r:embed="rId58"/>
+                    <a:stretch>
+                      <a:fillRect/>
+                    </a:stretch>
+                  </pic:blipFill>
+                  <pic:spPr>
+                    <a:xfrm>
+                      <a:off x="0" y="0"/>
+                      <a:ext cx="5943600" cy="3055620"/>
+                    </a:xfrm>
+                    <a:prstGeom prst="rect">
+                      <a:avLst/>
+                    </a:prstGeom>
+                  </pic:spPr>
+                </pic:pic>
+              </a:graphicData>
+            </a:graphic>
+          </wp:inline>
+        </w:drawing>
+      </w:r>
+    </w:p>
+    <w:p>
+      <w:pPr>
+        <w:ind w:left="0" w:firstLine="0"/>
+      </w:pPr>
+    </w:p>
+    <w:p>
+      <w:pPr>
+        <w:ind w:left="0" w:firstLine="0"/>
+      </w:pPr>
+      <w:r>
+        <w:lastRenderedPageBreak/>
+        <w:t>Spring Microservices - This uses 2 projects to develop microservices</w:t>
+      </w:r>
+    </w:p>
+    <w:p>
+      <w:pPr>
+        <w:pStyle w:val="ListParagraph"/>
+        <w:numPr>
+          <w:ilvl w:val="0"/>
+          <w:numId w:val="28"/>
+        </w:numPr>
+      </w:pPr>
+      <w:r>
+        <w:t>spring boot - automates the configuration</w:t>
+      </w:r>
+    </w:p>
+    <w:p>
+      <w:pPr>
+        <w:pStyle w:val="ListParagraph"/>
+        <w:numPr>
+          <w:ilvl w:val="0"/>
+          <w:numId w:val="28"/>
+        </w:numPr>
+      </w:pPr>
+      <w:r>
+        <w:t xml:space="preserve">spring cloud - implements all the microservice best practices like Service Discovery, Load Balancing, Distributed Cloud Configuration </w:t>
+      </w:r>
+    </w:p>
+    <w:p>
+      <w:pPr>
+        <w:ind w:left="0" w:firstLine="0"/>
+      </w:pPr>
+      <w:r>
+        <w:rPr>
+          <w:highlight w:val="yellow"/>
+        </w:rPr>
+        <w:t>Spring Cloud</w:t>
+      </w:r>
+      <w:r>
+        <w:t xml:space="preserve"> - it is a library that provides all the necessary design patterns to develop microservices, </w:t>
+      </w:r>
+    </w:p>
+    <w:p>
+      <w:pPr>
+        <w:ind w:left="0" w:firstLine="0"/>
+      </w:pPr>
+      <w:r>
+        <w:t xml:space="preserve">Service Discovery - Eureka Server is the library spring microservices provide to create the service discovery </w:t>
+      </w:r>
+    </w:p>
+    <w:p>
+      <w:pPr>
+        <w:ind w:left="0" w:firstLine="0"/>
+      </w:pPr>
+      <w:r>
+        <w:t>Eureka Client - These are microservices that register with eureka server</w:t>
+      </w:r>
+    </w:p>
+    <w:p>
+      <w:pPr>
+        <w:ind w:left="0" w:firstLine="0"/>
+      </w:pPr>
+    </w:p>
+    <w:p>
+      <w:pPr>
+        <w:ind w:left="0" w:firstLine="0"/>
+      </w:pPr>
+      <w:r>
+        <w:drawing>
+          <wp:inline distT="0" distB="0" distL="0" distR="0" wp14:anchorId="56F55736" wp14:editId="66FABC1A">
+            <wp:extent cx="5943600" cy="2632075"/>
+            <wp:effectExtent l="0" t="0" r="0" b="0"/>
+            <wp:docPr id="679111690" name="Picture 1"/>
+            <wp:cNvGraphicFramePr>
+              <a:graphicFrameLocks xmlns:a="http://schemas.openxmlformats.org/drawingml/2006/main" noChangeAspect="1"/>
+            </wp:cNvGraphicFramePr>
+            <a:graphic xmlns:a="http://schemas.openxmlformats.org/drawingml/2006/main">
+              <a:graphicData uri="http://schemas.openxmlformats.org/drawingml/2006/picture">
+                <pic:pic xmlns:pic="http://schemas.openxmlformats.org/drawingml/2006/picture">
+                  <pic:nvPicPr>
+                    <pic:cNvPr id="679111690" name=""/>
+                    <pic:cNvPicPr/>
+                  </pic:nvPicPr>
+                  <pic:blipFill>
+                    <a:blip r:embed="rId59"/>
+                    <a:stretch>
+                      <a:fillRect/>
+                    </a:stretch>
+                  </pic:blipFill>
+                  <pic:spPr>
+                    <a:xfrm>
+                      <a:off x="0" y="0"/>
+                      <a:ext cx="5943600" cy="2632075"/>
+                    </a:xfrm>
+                    <a:prstGeom prst="rect">
+                      <a:avLst/>
+                    </a:prstGeom>
+                  </pic:spPr>
+                </pic:pic>
+              </a:graphicData>
+            </a:graphic>
+          </wp:inline>
+        </w:drawing>
+      </w:r>
+      <w:r>
+        <w:rPr>
+          <w:highlight w:val="yellow"/>
+        </w:rPr>
+        <w:t>Benefits of using eureka server</w:t>
+      </w:r>
+    </w:p>
+    <w:p>
+      <w:pPr>
+        <w:pStyle w:val="ListParagraph"/>
+        <w:numPr>
+          <w:ilvl w:val="0"/>
+          <w:numId w:val="16"/>
+        </w:numPr>
+      </w:pPr>
+      <w:r>
+        <w:t xml:space="preserve">It creates service discovery </w:t>
+      </w:r>
+    </w:p>
+    <w:p>
+      <w:pPr>
+        <w:pStyle w:val="ListParagraph"/>
+        <w:numPr>
+          <w:ilvl w:val="0"/>
+          <w:numId w:val="16"/>
+        </w:numPr>
+      </w:pPr>
+      <w:r>
+        <w:t>it allows all the clients (microservices) to register with an unique name called instance id</w:t>
+      </w:r>
+    </w:p>
+    <w:p>
+      <w:pPr>
+        <w:pStyle w:val="ListParagraph"/>
+        <w:numPr>
+          <w:ilvl w:val="0"/>
+          <w:numId w:val="16"/>
+        </w:numPr>
+      </w:pPr>
+      <w:r>
+        <w:t>It provides a web page that you can use to see all the registered microservices</w:t>
+      </w:r>
+    </w:p>
+    <w:p>
+      <w:pPr>
+        <w:ind w:left="0" w:firstLine="0"/>
+      </w:pPr>
+      <w:r>
+        <w:rPr>
+          <w:highlight w:val="yellow"/>
+        </w:rPr>
+        <w:t>Benefits of using eureka client</w:t>
+      </w:r>
+    </w:p>
+    <w:p>
+      <w:pPr>
+        <w:pStyle w:val="ListParagraph"/>
+        <w:numPr>
+          <w:ilvl w:val="0"/>
+          <w:numId w:val="16"/>
+        </w:numPr>
+      </w:pPr>
+      <w:r>
+        <w:t>It is a microservice (will be having controller, service, dao and etc)</w:t>
+      </w:r>
+    </w:p>
+    <w:p>
+      <w:pPr>
+        <w:pStyle w:val="ListParagraph"/>
+        <w:numPr>
+          <w:ilvl w:val="0"/>
+          <w:numId w:val="16"/>
+        </w:numPr>
+      </w:pPr>
+      <w:r>
+        <w:lastRenderedPageBreak/>
+        <w:t>it searches automatically the eureka server in 8761 by default</w:t>
+      </w:r>
+    </w:p>
+    <w:p>
+      <w:pPr>
+        <w:ind w:left="360" w:firstLine="0"/>
+      </w:pPr>
+      <w:r>
+        <w:rPr>
+          <w:highlight w:val="yellow"/>
+        </w:rPr>
+        <w:t>Note:</w:t>
+      </w:r>
+      <w:r>
+        <w:t xml:space="preserve"> You can change the location of the eureka server &amp; configure eureka client to look eureka server in different port</w:t>
+      </w:r>
+    </w:p>
+    <w:p>
+      <w:pPr>
+        <w:ind w:left="360" w:firstLine="0"/>
+      </w:pPr>
+    </w:p>
+    <w:p>
+      <w:pPr>
+        <w:ind w:left="360" w:firstLine="0"/>
+      </w:pPr>
+      <w:r>
+        <w:drawing>
+          <wp:inline distT="0" distB="0" distL="0" distR="0" wp14:anchorId="5A09AE55" wp14:editId="30E99D8F">
+            <wp:extent cx="5943600" cy="2950845"/>
+            <wp:effectExtent l="0" t="0" r="0" b="1905"/>
+            <wp:docPr id="1990469835" name="Picture 1"/>
+            <wp:cNvGraphicFramePr>
+              <a:graphicFrameLocks xmlns:a="http://schemas.openxmlformats.org/drawingml/2006/main" noChangeAspect="1"/>
+            </wp:cNvGraphicFramePr>
+            <a:graphic xmlns:a="http://schemas.openxmlformats.org/drawingml/2006/main">
+              <a:graphicData uri="http://schemas.openxmlformats.org/drawingml/2006/picture">
+                <pic:pic xmlns:pic="http://schemas.openxmlformats.org/drawingml/2006/picture">
+                  <pic:nvPicPr>
+                    <pic:cNvPr id="1990469835" name=""/>
+                    <pic:cNvPicPr/>
+                  </pic:nvPicPr>
+                  <pic:blipFill>
+                    <a:blip r:embed="rId60"/>
+                    <a:stretch>
+                      <a:fillRect/>
+                    </a:stretch>
+                  </pic:blipFill>
+                  <pic:spPr>
+                    <a:xfrm>
+                      <a:off x="0" y="0"/>
+                      <a:ext cx="5943600" cy="2950845"/>
+                    </a:xfrm>
+                    <a:prstGeom prst="rect">
+                      <a:avLst/>
+                    </a:prstGeom>
+                  </pic:spPr>
+                </pic:pic>
+              </a:graphicData>
+            </a:graphic>
+          </wp:inline>
+        </w:drawing>
+      </w:r>
+    </w:p>
+    <w:p>
+      <w:pPr>
+        <w:ind w:left="360" w:firstLine="0"/>
+      </w:pPr>
+    </w:p>
+    <w:p>
+      <w:pPr>
+        <w:ind w:left="360" w:firstLine="0"/>
+      </w:pPr>
+      <w:r>
+        <w:rPr>
+          <w:highlight w:val="yellow"/>
+        </w:rPr>
+        <w:t>Steps to develop microservice</w:t>
+      </w:r>
+    </w:p>
+    <w:p>
+      <w:pPr>
+        <w:pStyle w:val="ListParagraph"/>
+        <w:numPr>
+          <w:ilvl w:val="0"/>
+          <w:numId w:val="30"/>
+        </w:numPr>
+      </w:pPr>
+      <w:r>
+        <w:t>You must create 2 projects minimum</w:t>
+      </w:r>
+    </w:p>
+    <w:p>
+      <w:pPr>
+        <w:pStyle w:val="ListParagraph"/>
+        <w:numPr>
+          <w:ilvl w:val="1"/>
+          <w:numId w:val="30"/>
+        </w:numPr>
+      </w:pPr>
+      <w:r>
+        <w:t>Service Discovery - libraries : eureka server, devtools</w:t>
+      </w:r>
+    </w:p>
+    <w:p>
+      <w:pPr>
+        <w:pStyle w:val="ListParagraph"/>
+        <w:numPr>
+          <w:ilvl w:val="1"/>
+          <w:numId w:val="30"/>
+        </w:numPr>
+      </w:pPr>
+      <w:r>
+        <w:t>Microservice - libraries : eureka client, devtools, web, jpa and so on</w:t>
+      </w:r>
+    </w:p>
+    <w:p>
+      <w:pPr>
+        <w:ind w:left="0" w:firstLine="0"/>
+      </w:pPr>
+      <w:r>
+        <w:rPr>
+          <w:highlight w:val="yellow"/>
+        </w:rPr>
+        <w:t>Changes in Service Discovery</w:t>
+      </w:r>
+    </w:p>
+    <w:p>
+      <w:pPr>
+        <w:pStyle w:val="ListParagraph"/>
+        <w:numPr>
+          <w:ilvl w:val="0"/>
+          <w:numId w:val="31"/>
+        </w:numPr>
+      </w:pPr>
+      <w:r>
+        <w:t xml:space="preserve">application.properties -&gt; port = 8761, disable client features </w:t>
+      </w:r>
+    </w:p>
+    <w:p>
+      <w:pPr>
+        <w:pStyle w:val="ListParagraph"/>
+        <w:numPr>
+          <w:ilvl w:val="0"/>
+          <w:numId w:val="31"/>
+        </w:numPr>
+      </w:pPr>
+      <w:r>
+        <w:t xml:space="preserve">@EnableEurekaServer -&gt; This enables your program as a service discovery </w:t>
+      </w:r>
+    </w:p>
+    <w:p>
+      <w:pPr>
+        <w:ind w:left="0" w:firstLine="0"/>
+      </w:pPr>
+      <w:r>
+        <w:rPr>
+          <w:highlight w:val="yellow"/>
+        </w:rPr>
+        <w:t>application.properties</w:t>
+      </w:r>
+    </w:p>
+    <w:p>
+      <w:pPr>
+        <w:ind w:left="0" w:firstLine="0"/>
+      </w:pPr>
+      <w:r>
+        <w:lastRenderedPageBreak/>
+        <w:drawing>
+          <wp:inline distT="0" distB="0" distL="0" distR="0" wp14:anchorId="0E36BB21" wp14:editId="022A6FDE">
+            <wp:extent cx="5943600" cy="1756410"/>
+            <wp:effectExtent l="0" t="0" r="0" b="0"/>
+            <wp:docPr id="1544581416" name="Picture 1"/>
+            <wp:cNvGraphicFramePr>
+              <a:graphicFrameLocks xmlns:a="http://schemas.openxmlformats.org/drawingml/2006/main" noChangeAspect="1"/>
+            </wp:cNvGraphicFramePr>
+            <a:graphic xmlns:a="http://schemas.openxmlformats.org/drawingml/2006/main">
+              <a:graphicData uri="http://schemas.openxmlformats.org/drawingml/2006/picture">
+                <pic:pic xmlns:pic="http://schemas.openxmlformats.org/drawingml/2006/picture">
+                  <pic:nvPicPr>
+                    <pic:cNvPr id="1544581416" name=""/>
+                    <pic:cNvPicPr/>
+                  </pic:nvPicPr>
+                  <pic:blipFill>
+                    <a:blip r:embed="rId61"/>
+                    <a:stretch>
+                      <a:fillRect/>
+                    </a:stretch>
+                  </pic:blipFill>
+                  <pic:spPr>
+                    <a:xfrm>
+                      <a:off x="0" y="0"/>
+                      <a:ext cx="5943600" cy="1756410"/>
+                    </a:xfrm>
+                    <a:prstGeom prst="rect">
+                      <a:avLst/>
+                    </a:prstGeom>
+                  </pic:spPr>
+                </pic:pic>
+              </a:graphicData>
+            </a:graphic>
+          </wp:inline>
+        </w:drawing>
+      </w:r>
+    </w:p>
+    <w:p>
+      <w:pPr>
+        <w:ind w:left="0" w:firstLine="0"/>
+      </w:pPr>
+      <w:r>
+        <w:rPr>
+          <w:highlight w:val="yellow"/>
+        </w:rPr>
+        <w:t>Adding @EnableEurekaServer</w:t>
+      </w:r>
+    </w:p>
+    <w:p>
+      <w:pPr>
+        <w:ind w:left="0" w:firstLine="0"/>
+      </w:pPr>
+      <w:r>
+        <w:drawing>
+          <wp:inline distT="0" distB="0" distL="0" distR="0" wp14:anchorId="3DD4C316" wp14:editId="3997945C">
+            <wp:extent cx="5943600" cy="2672080"/>
+            <wp:effectExtent l="0" t="0" r="0" b="0"/>
+            <wp:docPr id="200502264" name="Picture 1"/>
+            <wp:cNvGraphicFramePr>
+              <a:graphicFrameLocks xmlns:a="http://schemas.openxmlformats.org/drawingml/2006/main" noChangeAspect="1"/>
+            </wp:cNvGraphicFramePr>
+            <a:graphic xmlns:a="http://schemas.openxmlformats.org/drawingml/2006/main">
+              <a:graphicData uri="http://schemas.openxmlformats.org/drawingml/2006/picture">
+                <pic:pic xmlns:pic="http://schemas.openxmlformats.org/drawingml/2006/picture">
+                  <pic:nvPicPr>
+                    <pic:cNvPr id="200502264" name=""/>
+                    <pic:cNvPicPr/>
+                  </pic:nvPicPr>
+                  <pic:blipFill>
+                    <a:blip r:embed="rId62"/>
+                    <a:stretch>
+                      <a:fillRect/>
+                    </a:stretch>
+                  </pic:blipFill>
+                  <pic:spPr>
+                    <a:xfrm>
+                      <a:off x="0" y="0"/>
+                      <a:ext cx="5943600" cy="2672080"/>
+                    </a:xfrm>
+                    <a:prstGeom prst="rect">
+                      <a:avLst/>
+                    </a:prstGeom>
+                  </pic:spPr>
+                </pic:pic>
+              </a:graphicData>
+            </a:graphic>
+          </wp:inline>
+        </w:drawing>
+      </w:r>
+    </w:p>
     <w:sectPr>
       <w:pgSz w:w="12240" w:h="15840"/>
       <w:pgMar w:top="1440" w:right="1440" w:bottom="1440" w:left="1440" w:header="720" w:footer="720" w:gutter="0"/>
@@ -5697,6 +6839,95 @@
 <file path=word/numbering.xml><?xml version="1.0" encoding="utf-8"?>
 <w:numbering xmlns:wpc="http://schemas.microsoft.com/office/word/2010/wordprocessingCanvas" xmlns:cx="http://schemas.microsoft.com/office/drawing/2014/chartex" xmlns:cx1="http://schemas.microsoft.com/office/drawing/2015/9/8/chartex" xmlns:cx2="http://schemas.microsoft.com/office/drawing/2015/10/21/chartex" xmlns:cx3="http://schemas.microsoft.com/office/drawing/2016/5/9/chartex" xmlns:cx4="http://schemas.microsoft.com/office/drawing/2016/5/10/chartex" xmlns:cx5="http://schemas.microsoft.com/office/drawing/2016/5/11/chartex" xmlns:cx6="http://schemas.microsoft.com/office/drawing/2016/5/12/chartex" xmlns:cx7="http://schemas.microsoft.com/office/drawing/2016/5/13/chartex" xmlns:cx8="http://schemas.microsoft.com/office/drawing/2016/5/14/chartex" xmlns:mc="http://schemas.openxmlformats.org/markup-compatibility/2006" xmlns:aink="http://schemas.microsoft.com/office/drawing/2016/ink" xmlns:am3d="http://schemas.microsoft.com/office/drawing/2017/model3d" xmlns:o="urn:schemas-microsoft-com:office:office" xmlns:oel="http://schemas.microsoft.com/office/2019/extlst" xmlns:r="http://schemas.openxmlformats.org/officeDocument/2006/relationships" xmlns:m="http://schemas.openxmlformats.org/officeDocument/2006/math" xmlns:v="urn:schemas-microsoft-com:vml" xmlns:wp14="http://schemas.microsoft.com/office/word/2010/wordprocessingDrawing" xmlns:wp="http://schemas.openxmlformats.org/drawingml/2006/wordprocessingDrawing" xmlns:w10="urn:schemas-microsoft-com:office:word" xmlns:w="http://schemas.openxmlformats.org/wordprocessingml/2006/main" xmlns:w14="http://schemas.microsoft.com/office/word/2010/wordml" xmlns:w15="http://schemas.microsoft.com/office/word/2012/wordml" xmlns:w16cex="http://schemas.microsoft.com/office/word/2018/wordml/cex" xmlns:w16cid="http://schemas.microsoft.com/office/word/2016/wordml/cid" xmlns:w16="http://schemas.microsoft.com/office/word/2018/wordml" xmlns:w16du="http://schemas.microsoft.com/office/word/2023/wordml/word16du" xmlns:w16sdtdh="http://schemas.microsoft.com/office/word/2020/wordml/sdtdatahash" xmlns:w16sdtfl="http://schemas.microsoft.com/office/word/2024/wordml/sdtformatlock" xmlns:w16se="http://schemas.microsoft.com/office/word/2015/wordml/symex" xmlns:wpg="http://schemas.microsoft.com/office/word/2010/wordprocessingGroup" xmlns:wpi="http://schemas.microsoft.com/office/word/2010/wordprocessingInk" xmlns:wne="http://schemas.microsoft.com/office/word/2006/wordml" xmlns:wps="http://schemas.microsoft.com/office/word/2010/wordprocessingShape" mc:Ignorable="w14 w15 w16se w16cid w16 w16cex w16sdtdh w16sdtfl w16du wp14">
   <w:abstractNum w:abstractNumId="0" w15:restartNumberingAfterBreak="0">
+    <w:nsid w:val="01C6436C"/>
+    <w:multiLevelType w:val="hybridMultilevel"/>
+    <w:tmpl w:val="C46CE6E6"/>
+    <w:lvl w:ilvl="0" w:tplc="0409000F">
+      <w:start w:val="1"/>
+      <w:numFmt w:val="decimal"/>
+      <w:lvlText w:val="%1."/>
+      <w:lvlJc w:val="left"/>
+      <w:pPr>
+        <w:ind w:left="720" w:hanging="360"/>
+      </w:pPr>
+      <w:rPr>
+        <w:rFonts w:hint="default"/>
+      </w:rPr>
+    </w:lvl>
+    <w:lvl w:ilvl="1" w:tplc="04090019" w:tentative="1">
+      <w:start w:val="1"/>
+      <w:numFmt w:val="lowerLetter"/>
+      <w:lvlText w:val="%2."/>
+      <w:lvlJc w:val="left"/>
+      <w:pPr>
+        <w:ind w:left="1440" w:hanging="360"/>
+      </w:pPr>
+    </w:lvl>
+    <w:lvl w:ilvl="2" w:tplc="0409001B" w:tentative="1">
+      <w:start w:val="1"/>
+      <w:numFmt w:val="lowerRoman"/>
+      <w:lvlText w:val="%3."/>
+      <w:lvlJc w:val="right"/>
+      <w:pPr>
+        <w:ind w:left="2160" w:hanging="180"/>
+      </w:pPr>
+    </w:lvl>
+    <w:lvl w:ilvl="3" w:tplc="0409000F" w:tentative="1">
+      <w:start w:val="1"/>
+      <w:numFmt w:val="decimal"/>
+      <w:lvlText w:val="%4."/>
+      <w:lvlJc w:val="left"/>
+      <w:pPr>
+        <w:ind w:left="2880" w:hanging="360"/>
+      </w:pPr>
+    </w:lvl>
+    <w:lvl w:ilvl="4" w:tplc="04090019" w:tentative="1">
+      <w:start w:val="1"/>
+      <w:numFmt w:val="lowerLetter"/>
+      <w:lvlText w:val="%5."/>
+      <w:lvlJc w:val="left"/>
+      <w:pPr>
+        <w:ind w:left="3600" w:hanging="360"/>
+      </w:pPr>
+    </w:lvl>
+    <w:lvl w:ilvl="5" w:tplc="0409001B" w:tentative="1">
+      <w:start w:val="1"/>
+      <w:numFmt w:val="lowerRoman"/>
+      <w:lvlText w:val="%6."/>
+      <w:lvlJc w:val="right"/>
+      <w:pPr>
+        <w:ind w:left="4320" w:hanging="180"/>
+      </w:pPr>
+    </w:lvl>
+    <w:lvl w:ilvl="6" w:tplc="0409000F" w:tentative="1">
+      <w:start w:val="1"/>
+      <w:numFmt w:val="decimal"/>
+      <w:lvlText w:val="%7."/>
+      <w:lvlJc w:val="left"/>
+      <w:pPr>
+        <w:ind w:left="5040" w:hanging="360"/>
+      </w:pPr>
+    </w:lvl>
+    <w:lvl w:ilvl="7" w:tplc="04090019" w:tentative="1">
+      <w:start w:val="1"/>
+      <w:numFmt w:val="lowerLetter"/>
+      <w:lvlText w:val="%8."/>
+      <w:lvlJc w:val="left"/>
+      <w:pPr>
+        <w:ind w:left="5760" w:hanging="360"/>
+      </w:pPr>
+    </w:lvl>
+    <w:lvl w:ilvl="8" w:tplc="0409001B" w:tentative="1">
+      <w:start w:val="1"/>
+      <w:numFmt w:val="lowerRoman"/>
+      <w:lvlText w:val="%9."/>
+      <w:lvlJc w:val="right"/>
+      <w:pPr>
+        <w:ind w:left="6480" w:hanging="180"/>
+      </w:pPr>
+    </w:lvl>
+  </w:abstractNum>
+  <w:abstractNum w:abstractNumId="1" w15:restartNumberingAfterBreak="0">
     <w:nsid w:val="0A1D34D6"/>
     <w:multiLevelType w:val="hybridMultilevel"/>
     <w:tmpl w:val="2A3A3ADA"/>
@@ -5785,7 +7016,7 @@
       </w:pPr>
     </w:lvl>
   </w:abstractNum>
-  <w:abstractNum w:abstractNumId="1" w15:restartNumberingAfterBreak="0">
+  <w:abstractNum w:abstractNumId="2" w15:restartNumberingAfterBreak="0">
     <w:nsid w:val="1482674B"/>
     <w:multiLevelType w:val="hybridMultilevel"/>
     <w:tmpl w:val="C700C030"/>
@@ -5874,7 +7105,96 @@
       </w:pPr>
     </w:lvl>
   </w:abstractNum>
-  <w:abstractNum w:abstractNumId="2" w15:restartNumberingAfterBreak="0">
+  <w:abstractNum w:abstractNumId="3" w15:restartNumberingAfterBreak="0">
+    <w:nsid w:val="16EE63D6"/>
+    <w:multiLevelType w:val="hybridMultilevel"/>
+    <w:tmpl w:val="A5BC9698"/>
+    <w:lvl w:ilvl="0" w:tplc="0409000F">
+      <w:start w:val="1"/>
+      <w:numFmt w:val="decimal"/>
+      <w:lvlText w:val="%1."/>
+      <w:lvlJc w:val="left"/>
+      <w:pPr>
+        <w:ind w:left="720" w:hanging="360"/>
+      </w:pPr>
+      <w:rPr>
+        <w:rFonts w:hint="default"/>
+      </w:rPr>
+    </w:lvl>
+    <w:lvl w:ilvl="1" w:tplc="04090019">
+      <w:start w:val="1"/>
+      <w:numFmt w:val="lowerLetter"/>
+      <w:lvlText w:val="%2."/>
+      <w:lvlJc w:val="left"/>
+      <w:pPr>
+        <w:ind w:left="1440" w:hanging="360"/>
+      </w:pPr>
+    </w:lvl>
+    <w:lvl w:ilvl="2" w:tplc="0409001B" w:tentative="1">
+      <w:start w:val="1"/>
+      <w:numFmt w:val="lowerRoman"/>
+      <w:lvlText w:val="%3."/>
+      <w:lvlJc w:val="right"/>
+      <w:pPr>
+        <w:ind w:left="2160" w:hanging="180"/>
+      </w:pPr>
+    </w:lvl>
+    <w:lvl w:ilvl="3" w:tplc="0409000F" w:tentative="1">
+      <w:start w:val="1"/>
+      <w:numFmt w:val="decimal"/>
+      <w:lvlText w:val="%4."/>
+      <w:lvlJc w:val="left"/>
+      <w:pPr>
+        <w:ind w:left="2880" w:hanging="360"/>
+      </w:pPr>
+    </w:lvl>
+    <w:lvl w:ilvl="4" w:tplc="04090019" w:tentative="1">
+      <w:start w:val="1"/>
+      <w:numFmt w:val="lowerLetter"/>
+      <w:lvlText w:val="%5."/>
+      <w:lvlJc w:val="left"/>
+      <w:pPr>
+        <w:ind w:left="3600" w:hanging="360"/>
+      </w:pPr>
+    </w:lvl>
+    <w:lvl w:ilvl="5" w:tplc="0409001B" w:tentative="1">
+      <w:start w:val="1"/>
+      <w:numFmt w:val="lowerRoman"/>
+      <w:lvlText w:val="%6."/>
+      <w:lvlJc w:val="right"/>
+      <w:pPr>
+        <w:ind w:left="4320" w:hanging="180"/>
+      </w:pPr>
+    </w:lvl>
+    <w:lvl w:ilvl="6" w:tplc="0409000F" w:tentative="1">
+      <w:start w:val="1"/>
+      <w:numFmt w:val="decimal"/>
+      <w:lvlText w:val="%7."/>
+      <w:lvlJc w:val="left"/>
+      <w:pPr>
+        <w:ind w:left="5040" w:hanging="360"/>
+      </w:pPr>
+    </w:lvl>
+    <w:lvl w:ilvl="7" w:tplc="04090019" w:tentative="1">
+      <w:start w:val="1"/>
+      <w:numFmt w:val="lowerLetter"/>
+      <w:lvlText w:val="%8."/>
+      <w:lvlJc w:val="left"/>
+      <w:pPr>
+        <w:ind w:left="5760" w:hanging="360"/>
+      </w:pPr>
+    </w:lvl>
+    <w:lvl w:ilvl="8" w:tplc="0409001B" w:tentative="1">
+      <w:start w:val="1"/>
+      <w:numFmt w:val="lowerRoman"/>
+      <w:lvlText w:val="%9."/>
+      <w:lvlJc w:val="right"/>
+      <w:pPr>
+        <w:ind w:left="6480" w:hanging="180"/>
+      </w:pPr>
+    </w:lvl>
+  </w:abstractNum>
+  <w:abstractNum w:abstractNumId="4" w15:restartNumberingAfterBreak="0">
     <w:nsid w:val="230F2A23"/>
     <w:multiLevelType w:val="hybridMultilevel"/>
     <w:tmpl w:val="15B29E9E"/>
@@ -5963,7 +7283,96 @@
       </w:pPr>
     </w:lvl>
   </w:abstractNum>
-  <w:abstractNum w:abstractNumId="3" w15:restartNumberingAfterBreak="0">
+  <w:abstractNum w:abstractNumId="5" w15:restartNumberingAfterBreak="0">
+    <w:nsid w:val="28493337"/>
+    <w:multiLevelType w:val="hybridMultilevel"/>
+    <w:tmpl w:val="A6FCAE60"/>
+    <w:lvl w:ilvl="0" w:tplc="0409000F">
+      <w:start w:val="1"/>
+      <w:numFmt w:val="decimal"/>
+      <w:lvlText w:val="%1."/>
+      <w:lvlJc w:val="left"/>
+      <w:pPr>
+        <w:ind w:left="720" w:hanging="360"/>
+      </w:pPr>
+      <w:rPr>
+        <w:rFonts w:hint="default"/>
+      </w:rPr>
+    </w:lvl>
+    <w:lvl w:ilvl="1" w:tplc="04090019" w:tentative="1">
+      <w:start w:val="1"/>
+      <w:numFmt w:val="lowerLetter"/>
+      <w:lvlText w:val="%2."/>
+      <w:lvlJc w:val="left"/>
+      <w:pPr>
+        <w:ind w:left="1440" w:hanging="360"/>
+      </w:pPr>
+    </w:lvl>
+    <w:lvl w:ilvl="2" w:tplc="0409001B" w:tentative="1">
+      <w:start w:val="1"/>
+      <w:numFmt w:val="lowerRoman"/>
+      <w:lvlText w:val="%3."/>
+      <w:lvlJc w:val="right"/>
+      <w:pPr>
+        <w:ind w:left="2160" w:hanging="180"/>
+      </w:pPr>
+    </w:lvl>
+    <w:lvl w:ilvl="3" w:tplc="0409000F" w:tentative="1">
+      <w:start w:val="1"/>
+      <w:numFmt w:val="decimal"/>
+      <w:lvlText w:val="%4."/>
+      <w:lvlJc w:val="left"/>
+      <w:pPr>
+        <w:ind w:left="2880" w:hanging="360"/>
+      </w:pPr>
+    </w:lvl>
+    <w:lvl w:ilvl="4" w:tplc="04090019" w:tentative="1">
+      <w:start w:val="1"/>
+      <w:numFmt w:val="lowerLetter"/>
+      <w:lvlText w:val="%5."/>
+      <w:lvlJc w:val="left"/>
+      <w:pPr>
+        <w:ind w:left="3600" w:hanging="360"/>
+      </w:pPr>
+    </w:lvl>
+    <w:lvl w:ilvl="5" w:tplc="0409001B" w:tentative="1">
+      <w:start w:val="1"/>
+      <w:numFmt w:val="lowerRoman"/>
+      <w:lvlText w:val="%6."/>
+      <w:lvlJc w:val="right"/>
+      <w:pPr>
+        <w:ind w:left="4320" w:hanging="180"/>
+      </w:pPr>
+    </w:lvl>
+    <w:lvl w:ilvl="6" w:tplc="0409000F" w:tentative="1">
+      <w:start w:val="1"/>
+      <w:numFmt w:val="decimal"/>
+      <w:lvlText w:val="%7."/>
+      <w:lvlJc w:val="left"/>
+      <w:pPr>
+        <w:ind w:left="5040" w:hanging="360"/>
+      </w:pPr>
+    </w:lvl>
+    <w:lvl w:ilvl="7" w:tplc="04090019" w:tentative="1">
+      <w:start w:val="1"/>
+      <w:numFmt w:val="lowerLetter"/>
+      <w:lvlText w:val="%8."/>
+      <w:lvlJc w:val="left"/>
+      <w:pPr>
+        <w:ind w:left="5760" w:hanging="360"/>
+      </w:pPr>
+    </w:lvl>
+    <w:lvl w:ilvl="8" w:tplc="0409001B" w:tentative="1">
+      <w:start w:val="1"/>
+      <w:numFmt w:val="lowerRoman"/>
+      <w:lvlText w:val="%9."/>
+      <w:lvlJc w:val="right"/>
+      <w:pPr>
+        <w:ind w:left="6480" w:hanging="180"/>
+      </w:pPr>
+    </w:lvl>
+  </w:abstractNum>
+  <w:abstractNum w:abstractNumId="6" w15:restartNumberingAfterBreak="0">
     <w:nsid w:val="29531BAF"/>
     <w:multiLevelType w:val="hybridMultilevel"/>
     <w:tmpl w:val="825EDB6C"/>
@@ -6052,7 +7461,7 @@
       </w:pPr>
     </w:lvl>
   </w:abstractNum>
-  <w:abstractNum w:abstractNumId="4" w15:restartNumberingAfterBreak="0">
+  <w:abstractNum w:abstractNumId="7" w15:restartNumberingAfterBreak="0">
     <w:nsid w:val="2E57703E"/>
     <w:multiLevelType w:val="hybridMultilevel"/>
     <w:tmpl w:val="2954CD1E"/>
@@ -6141,7 +7550,7 @@
       </w:pPr>
     </w:lvl>
   </w:abstractNum>
-  <w:abstractNum w:abstractNumId="5" w15:restartNumberingAfterBreak="0">
+  <w:abstractNum w:abstractNumId="8" w15:restartNumberingAfterBreak="0">
     <w:nsid w:val="2E8E3B7C"/>
     <w:multiLevelType w:val="hybridMultilevel"/>
     <w:tmpl w:val="642A09EE"/>
@@ -6230,7 +7639,7 @@
       </w:pPr>
     </w:lvl>
   </w:abstractNum>
-  <w:abstractNum w:abstractNumId="6" w15:restartNumberingAfterBreak="0">
+  <w:abstractNum w:abstractNumId="9" w15:restartNumberingAfterBreak="0">
     <w:nsid w:val="316C2ABE"/>
     <w:multiLevelType w:val="hybridMultilevel"/>
     <w:tmpl w:val="B8122270"/>
@@ -6319,7 +7728,96 @@
       </w:pPr>
     </w:lvl>
   </w:abstractNum>
-  <w:abstractNum w:abstractNumId="7" w15:restartNumberingAfterBreak="0">
+  <w:abstractNum w:abstractNumId="10" w15:restartNumberingAfterBreak="0">
+    <w:nsid w:val="34C354E6"/>
+    <w:multiLevelType w:val="hybridMultilevel"/>
+    <w:tmpl w:val="FABEE6F8"/>
+    <w:lvl w:ilvl="0" w:tplc="0409000F">
+      <w:start w:val="1"/>
+      <w:numFmt w:val="decimal"/>
+      <w:lvlText w:val="%1."/>
+      <w:lvlJc w:val="left"/>
+      <w:pPr>
+        <w:ind w:left="720" w:hanging="360"/>
+      </w:pPr>
+      <w:rPr>
+        <w:rFonts w:hint="default"/>
+      </w:rPr>
+    </w:lvl>
+    <w:lvl w:ilvl="1" w:tplc="04090019" w:tentative="1">
+      <w:start w:val="1"/>
+      <w:numFmt w:val="lowerLetter"/>
+      <w:lvlText w:val="%2."/>
+      <w:lvlJc w:val="left"/>
+      <w:pPr>
+        <w:ind w:left="1440" w:hanging="360"/>
+      </w:pPr>
+    </w:lvl>
+    <w:lvl w:ilvl="2" w:tplc="0409001B" w:tentative="1">
+      <w:start w:val="1"/>
+      <w:numFmt w:val="lowerRoman"/>
+      <w:lvlText w:val="%3."/>
+      <w:lvlJc w:val="right"/>
+      <w:pPr>
+        <w:ind w:left="2160" w:hanging="180"/>
+      </w:pPr>
+    </w:lvl>
+    <w:lvl w:ilvl="3" w:tplc="0409000F" w:tentative="1">
+      <w:start w:val="1"/>
+      <w:numFmt w:val="decimal"/>
+      <w:lvlText w:val="%4."/>
+      <w:lvlJc w:val="left"/>
+      <w:pPr>
+        <w:ind w:left="2880" w:hanging="360"/>
+      </w:pPr>
+    </w:lvl>
+    <w:lvl w:ilvl="4" w:tplc="04090019" w:tentative="1">
+      <w:start w:val="1"/>
+      <w:numFmt w:val="lowerLetter"/>
+      <w:lvlText w:val="%5."/>
+      <w:lvlJc w:val="left"/>
+      <w:pPr>
+        <w:ind w:left="3600" w:hanging="360"/>
+      </w:pPr>
+    </w:lvl>
+    <w:lvl w:ilvl="5" w:tplc="0409001B" w:tentative="1">
+      <w:start w:val="1"/>
+      <w:numFmt w:val="lowerRoman"/>
+      <w:lvlText w:val="%6."/>
+      <w:lvlJc w:val="right"/>
+      <w:pPr>
+        <w:ind w:left="4320" w:hanging="180"/>
+      </w:pPr>
+    </w:lvl>
+    <w:lvl w:ilvl="6" w:tplc="0409000F" w:tentative="1">
+      <w:start w:val="1"/>
+      <w:numFmt w:val="decimal"/>
+      <w:lvlText w:val="%7."/>
+      <w:lvlJc w:val="left"/>
+      <w:pPr>
+        <w:ind w:left="5040" w:hanging="360"/>
+      </w:pPr>
+    </w:lvl>
+    <w:lvl w:ilvl="7" w:tplc="04090019" w:tentative="1">
+      <w:start w:val="1"/>
+      <w:numFmt w:val="lowerLetter"/>
+      <w:lvlText w:val="%8."/>
+      <w:lvlJc w:val="left"/>
+      <w:pPr>
+        <w:ind w:left="5760" w:hanging="360"/>
+      </w:pPr>
+    </w:lvl>
+    <w:lvl w:ilvl="8" w:tplc="0409001B" w:tentative="1">
+      <w:start w:val="1"/>
+      <w:numFmt w:val="lowerRoman"/>
+      <w:lvlText w:val="%9."/>
+      <w:lvlJc w:val="right"/>
+      <w:pPr>
+        <w:ind w:left="6480" w:hanging="180"/>
+      </w:pPr>
+    </w:lvl>
+  </w:abstractNum>
+  <w:abstractNum w:abstractNumId="11" w15:restartNumberingAfterBreak="0">
     <w:nsid w:val="35105F3F"/>
     <w:multiLevelType w:val="hybridMultilevel"/>
     <w:tmpl w:val="5836731C"/>
@@ -6408,7 +7906,7 @@
       </w:pPr>
     </w:lvl>
   </w:abstractNum>
-  <w:abstractNum w:abstractNumId="8" w15:restartNumberingAfterBreak="0">
+  <w:abstractNum w:abstractNumId="12" w15:restartNumberingAfterBreak="0">
     <w:nsid w:val="379F1E0F"/>
     <w:multiLevelType w:val="hybridMultilevel"/>
     <w:tmpl w:val="0B867A42"/>
@@ -6497,7 +7995,7 @@
       </w:pPr>
     </w:lvl>
   </w:abstractNum>
-  <w:abstractNum w:abstractNumId="9" w15:restartNumberingAfterBreak="0">
+  <w:abstractNum w:abstractNumId="13" w15:restartNumberingAfterBreak="0">
     <w:nsid w:val="44CA2C52"/>
     <w:multiLevelType w:val="hybridMultilevel"/>
     <w:tmpl w:val="CE54277C"/>
@@ -6586,7 +8084,7 @@
       </w:pPr>
     </w:lvl>
   </w:abstractNum>
-  <w:abstractNum w:abstractNumId="10" w15:restartNumberingAfterBreak="0">
+  <w:abstractNum w:abstractNumId="14" w15:restartNumberingAfterBreak="0">
     <w:nsid w:val="46044801"/>
     <w:multiLevelType w:val="hybridMultilevel"/>
     <w:tmpl w:val="5ACEF4C4"/>
@@ -6675,7 +8173,7 @@
       </w:pPr>
     </w:lvl>
   </w:abstractNum>
-  <w:abstractNum w:abstractNumId="11" w15:restartNumberingAfterBreak="0">
+  <w:abstractNum w:abstractNumId="15" w15:restartNumberingAfterBreak="0">
     <w:nsid w:val="4AC07085"/>
     <w:multiLevelType w:val="hybridMultilevel"/>
     <w:tmpl w:val="3C1447BA"/>
@@ -6764,7 +8262,7 @@
       </w:pPr>
     </w:lvl>
   </w:abstractNum>
-  <w:abstractNum w:abstractNumId="12" w15:restartNumberingAfterBreak="0">
+  <w:abstractNum w:abstractNumId="16" w15:restartNumberingAfterBreak="0">
     <w:nsid w:val="4FAA6A76"/>
     <w:multiLevelType w:val="hybridMultilevel"/>
     <w:tmpl w:val="E74AB79A"/>
@@ -6853,7 +8351,7 @@
       </w:pPr>
     </w:lvl>
   </w:abstractNum>
-  <w:abstractNum w:abstractNumId="13" w15:restartNumberingAfterBreak="0">
+  <w:abstractNum w:abstractNumId="17" w15:restartNumberingAfterBreak="0">
     <w:nsid w:val="51370263"/>
     <w:multiLevelType w:val="hybridMultilevel"/>
     <w:tmpl w:val="A19EA814"/>
@@ -6942,7 +8440,7 @@
       </w:pPr>
     </w:lvl>
   </w:abstractNum>
-  <w:abstractNum w:abstractNumId="14" w15:restartNumberingAfterBreak="0">
+  <w:abstractNum w:abstractNumId="18" w15:restartNumberingAfterBreak="0">
     <w:nsid w:val="582E2516"/>
     <w:multiLevelType w:val="hybridMultilevel"/>
     <w:tmpl w:val="E55C935C"/>
@@ -7031,7 +8529,7 @@
       </w:pPr>
     </w:lvl>
   </w:abstractNum>
-  <w:abstractNum w:abstractNumId="15" w15:restartNumberingAfterBreak="0">
+  <w:abstractNum w:abstractNumId="19" w15:restartNumberingAfterBreak="0">
     <w:nsid w:val="58EC0FA2"/>
     <w:multiLevelType w:val="hybridMultilevel"/>
     <w:tmpl w:val="CE3EAE10"/>
@@ -7120,7 +8618,7 @@
       </w:pPr>
     </w:lvl>
   </w:abstractNum>
-  <w:abstractNum w:abstractNumId="16" w15:restartNumberingAfterBreak="0">
+  <w:abstractNum w:abstractNumId="20" w15:restartNumberingAfterBreak="0">
     <w:nsid w:val="5B3F3CEC"/>
     <w:multiLevelType w:val="hybridMultilevel"/>
     <w:tmpl w:val="71460F90"/>
@@ -7209,7 +8707,96 @@
       </w:pPr>
     </w:lvl>
   </w:abstractNum>
-  <w:abstractNum w:abstractNumId="17" w15:restartNumberingAfterBreak="0">
+  <w:abstractNum w:abstractNumId="21" w15:restartNumberingAfterBreak="0">
+    <w:nsid w:val="5E176280"/>
+    <w:multiLevelType w:val="hybridMultilevel"/>
+    <w:tmpl w:val="A412E02A"/>
+    <w:lvl w:ilvl="0" w:tplc="0409000F">
+      <w:start w:val="1"/>
+      <w:numFmt w:val="decimal"/>
+      <w:lvlText w:val="%1."/>
+      <w:lvlJc w:val="left"/>
+      <w:pPr>
+        <w:ind w:left="720" w:hanging="360"/>
+      </w:pPr>
+      <w:rPr>
+        <w:rFonts w:hint="default"/>
+      </w:rPr>
+    </w:lvl>
+    <w:lvl w:ilvl="1" w:tplc="04090019" w:tentative="1">
+      <w:start w:val="1"/>
+      <w:numFmt w:val="lowerLetter"/>
+      <w:lvlText w:val="%2."/>
+      <w:lvlJc w:val="left"/>
+      <w:pPr>
+        <w:ind w:left="1440" w:hanging="360"/>
+      </w:pPr>
+    </w:lvl>
+    <w:lvl w:ilvl="2" w:tplc="0409001B" w:tentative="1">
+      <w:start w:val="1"/>
+      <w:numFmt w:val="lowerRoman"/>
+      <w:lvlText w:val="%3."/>
+      <w:lvlJc w:val="right"/>
+      <w:pPr>
+        <w:ind w:left="2160" w:hanging="180"/>
+      </w:pPr>
+    </w:lvl>
+    <w:lvl w:ilvl="3" w:tplc="0409000F" w:tentative="1">
+      <w:start w:val="1"/>
+      <w:numFmt w:val="decimal"/>
+      <w:lvlText w:val="%4."/>
+      <w:lvlJc w:val="left"/>
+      <w:pPr>
+        <w:ind w:left="2880" w:hanging="360"/>
+      </w:pPr>
+    </w:lvl>
+    <w:lvl w:ilvl="4" w:tplc="04090019" w:tentative="1">
+      <w:start w:val="1"/>
+      <w:numFmt w:val="lowerLetter"/>
+      <w:lvlText w:val="%5."/>
+      <w:lvlJc w:val="left"/>
+      <w:pPr>
+        <w:ind w:left="3600" w:hanging="360"/>
+      </w:pPr>
+    </w:lvl>
+    <w:lvl w:ilvl="5" w:tplc="0409001B" w:tentative="1">
+      <w:start w:val="1"/>
+      <w:numFmt w:val="lowerRoman"/>
+      <w:lvlText w:val="%6."/>
+      <w:lvlJc w:val="right"/>
+      <w:pPr>
+        <w:ind w:left="4320" w:hanging="180"/>
+      </w:pPr>
+    </w:lvl>
+    <w:lvl w:ilvl="6" w:tplc="0409000F" w:tentative="1">
+      <w:start w:val="1"/>
+      <w:numFmt w:val="decimal"/>
+      <w:lvlText w:val="%7."/>
+      <w:lvlJc w:val="left"/>
+      <w:pPr>
+        <w:ind w:left="5040" w:hanging="360"/>
+      </w:pPr>
+    </w:lvl>
+    <w:lvl w:ilvl="7" w:tplc="04090019" w:tentative="1">
+      <w:start w:val="1"/>
+      <w:numFmt w:val="lowerLetter"/>
+      <w:lvlText w:val="%8."/>
+      <w:lvlJc w:val="left"/>
+      <w:pPr>
+        <w:ind w:left="5760" w:hanging="360"/>
+      </w:pPr>
+    </w:lvl>
+    <w:lvl w:ilvl="8" w:tplc="0409001B" w:tentative="1">
+      <w:start w:val="1"/>
+      <w:numFmt w:val="lowerRoman"/>
+      <w:lvlText w:val="%9."/>
+      <w:lvlJc w:val="right"/>
+      <w:pPr>
+        <w:ind w:left="6480" w:hanging="180"/>
+      </w:pPr>
+    </w:lvl>
+  </w:abstractNum>
+  <w:abstractNum w:abstractNumId="22" w15:restartNumberingAfterBreak="0">
     <w:nsid w:val="5ED30FF7"/>
     <w:multiLevelType w:val="hybridMultilevel"/>
     <w:tmpl w:val="B3AC66B8"/>
@@ -7298,7 +8885,7 @@
       </w:pPr>
     </w:lvl>
   </w:abstractNum>
-  <w:abstractNum w:abstractNumId="18" w15:restartNumberingAfterBreak="0">
+  <w:abstractNum w:abstractNumId="23" w15:restartNumberingAfterBreak="0">
     <w:nsid w:val="6561046C"/>
     <w:multiLevelType w:val="hybridMultilevel"/>
     <w:tmpl w:val="54BC4562"/>
@@ -7387,7 +8974,96 @@
       </w:pPr>
     </w:lvl>
   </w:abstractNum>
-  <w:abstractNum w:abstractNumId="19" w15:restartNumberingAfterBreak="0">
+  <w:abstractNum w:abstractNumId="24" w15:restartNumberingAfterBreak="0">
+    <w:nsid w:val="664C2B59"/>
+    <w:multiLevelType w:val="hybridMultilevel"/>
+    <w:tmpl w:val="1CF0A4EA"/>
+    <w:lvl w:ilvl="0" w:tplc="0409000F">
+      <w:start w:val="1"/>
+      <w:numFmt w:val="decimal"/>
+      <w:lvlText w:val="%1."/>
+      <w:lvlJc w:val="left"/>
+      <w:pPr>
+        <w:ind w:left="720" w:hanging="360"/>
+      </w:pPr>
+      <w:rPr>
+        <w:rFonts w:hint="default"/>
+      </w:rPr>
+    </w:lvl>
+    <w:lvl w:ilvl="1" w:tplc="04090019" w:tentative="1">
+      <w:start w:val="1"/>
+      <w:numFmt w:val="lowerLetter"/>
+      <w:lvlText w:val="%2."/>
+      <w:lvlJc w:val="left"/>
+      <w:pPr>
+        <w:ind w:left="1440" w:hanging="360"/>
+      </w:pPr>
+    </w:lvl>
+    <w:lvl w:ilvl="2" w:tplc="0409001B" w:tentative="1">
+      <w:start w:val="1"/>
+      <w:numFmt w:val="lowerRoman"/>
+      <w:lvlText w:val="%3."/>
+      <w:lvlJc w:val="right"/>
+      <w:pPr>
+        <w:ind w:left="2160" w:hanging="180"/>
+      </w:pPr>
+    </w:lvl>
+    <w:lvl w:ilvl="3" w:tplc="0409000F" w:tentative="1">
+      <w:start w:val="1"/>
+      <w:numFmt w:val="decimal"/>
+      <w:lvlText w:val="%4."/>
+      <w:lvlJc w:val="left"/>
+      <w:pPr>
+        <w:ind w:left="2880" w:hanging="360"/>
+      </w:pPr>
+    </w:lvl>
+    <w:lvl w:ilvl="4" w:tplc="04090019" w:tentative="1">
+      <w:start w:val="1"/>
+      <w:numFmt w:val="lowerLetter"/>
+      <w:lvlText w:val="%5."/>
+      <w:lvlJc w:val="left"/>
+      <w:pPr>
+        <w:ind w:left="3600" w:hanging="360"/>
+      </w:pPr>
+    </w:lvl>
+    <w:lvl w:ilvl="5" w:tplc="0409001B" w:tentative="1">
+      <w:start w:val="1"/>
+      <w:numFmt w:val="lowerRoman"/>
+      <w:lvlText w:val="%6."/>
+      <w:lvlJc w:val="right"/>
+      <w:pPr>
+        <w:ind w:left="4320" w:hanging="180"/>
+      </w:pPr>
+    </w:lvl>
+    <w:lvl w:ilvl="6" w:tplc="0409000F" w:tentative="1">
+      <w:start w:val="1"/>
+      <w:numFmt w:val="decimal"/>
+      <w:lvlText w:val="%7."/>
+      <w:lvlJc w:val="left"/>
+      <w:pPr>
+        <w:ind w:left="5040" w:hanging="360"/>
+      </w:pPr>
+    </w:lvl>
+    <w:lvl w:ilvl="7" w:tplc="04090019" w:tentative="1">
+      <w:start w:val="1"/>
+      <w:numFmt w:val="lowerLetter"/>
+      <w:lvlText w:val="%8."/>
+      <w:lvlJc w:val="left"/>
+      <w:pPr>
+        <w:ind w:left="5760" w:hanging="360"/>
+      </w:pPr>
+    </w:lvl>
+    <w:lvl w:ilvl="8" w:tplc="0409001B" w:tentative="1">
+      <w:start w:val="1"/>
+      <w:numFmt w:val="lowerRoman"/>
+      <w:lvlText w:val="%9."/>
+      <w:lvlJc w:val="right"/>
+      <w:pPr>
+        <w:ind w:left="6480" w:hanging="180"/>
+      </w:pPr>
+    </w:lvl>
+  </w:abstractNum>
+  <w:abstractNum w:abstractNumId="25" w15:restartNumberingAfterBreak="0">
     <w:nsid w:val="676E2B6B"/>
     <w:multiLevelType w:val="hybridMultilevel"/>
     <w:tmpl w:val="E7204440"/>
@@ -7500,7 +9176,7 @@
       </w:rPr>
     </w:lvl>
   </w:abstractNum>
-  <w:abstractNum w:abstractNumId="20" w15:restartNumberingAfterBreak="0">
+  <w:abstractNum w:abstractNumId="26" w15:restartNumberingAfterBreak="0">
     <w:nsid w:val="6F9628B0"/>
     <w:multiLevelType w:val="hybridMultilevel"/>
     <w:tmpl w:val="58B2F9FA"/>
@@ -7589,7 +9265,7 @@
       </w:pPr>
     </w:lvl>
   </w:abstractNum>
-  <w:abstractNum w:abstractNumId="21" w15:restartNumberingAfterBreak="0">
+  <w:abstractNum w:abstractNumId="27" w15:restartNumberingAfterBreak="0">
     <w:nsid w:val="78CF66F5"/>
     <w:multiLevelType w:val="hybridMultilevel"/>
     <w:tmpl w:val="FD460E22"/>
@@ -7678,7 +9354,7 @@
       </w:pPr>
     </w:lvl>
   </w:abstractNum>
-  <w:abstractNum w:abstractNumId="22" w15:restartNumberingAfterBreak="0">
+  <w:abstractNum w:abstractNumId="28" w15:restartNumberingAfterBreak="0">
     <w:nsid w:val="78FE7F30"/>
     <w:multiLevelType w:val="hybridMultilevel"/>
     <w:tmpl w:val="545CA6A2"/>
@@ -7767,7 +9443,96 @@
       </w:pPr>
     </w:lvl>
   </w:abstractNum>
-  <w:abstractNum w:abstractNumId="23" w15:restartNumberingAfterBreak="0">
+  <w:abstractNum w:abstractNumId="29" w15:restartNumberingAfterBreak="0">
+    <w:nsid w:val="7C953AEA"/>
+    <w:multiLevelType w:val="hybridMultilevel"/>
+    <w:tmpl w:val="7CCC41C4"/>
+    <w:lvl w:ilvl="0" w:tplc="0409000F">
+      <w:start w:val="1"/>
+      <w:numFmt w:val="decimal"/>
+      <w:lvlText w:val="%1."/>
+      <w:lvlJc w:val="left"/>
+      <w:pPr>
+        <w:ind w:left="720" w:hanging="360"/>
+      </w:pPr>
+      <w:rPr>
+        <w:rFonts w:hint="default"/>
+      </w:rPr>
+    </w:lvl>
+    <w:lvl w:ilvl="1" w:tplc="04090019" w:tentative="1">
+      <w:start w:val="1"/>
+      <w:numFmt w:val="lowerLetter"/>
+      <w:lvlText w:val="%2."/>
+      <w:lvlJc w:val="left"/>
+      <w:pPr>
+        <w:ind w:left="1440" w:hanging="360"/>
+      </w:pPr>
+    </w:lvl>
+    <w:lvl w:ilvl="2" w:tplc="0409001B" w:tentative="1">
+      <w:start w:val="1"/>
+      <w:numFmt w:val="lowerRoman"/>
+      <w:lvlText w:val="%3."/>
+      <w:lvlJc w:val="right"/>
+      <w:pPr>
+        <w:ind w:left="2160" w:hanging="180"/>
+      </w:pPr>
+    </w:lvl>
+    <w:lvl w:ilvl="3" w:tplc="0409000F" w:tentative="1">
+      <w:start w:val="1"/>
+      <w:numFmt w:val="decimal"/>
+      <w:lvlText w:val="%4."/>
+      <w:lvlJc w:val="left"/>
+      <w:pPr>
+        <w:ind w:left="2880" w:hanging="360"/>
+      </w:pPr>
+    </w:lvl>
+    <w:lvl w:ilvl="4" w:tplc="04090019" w:tentative="1">
+      <w:start w:val="1"/>
+      <w:numFmt w:val="lowerLetter"/>
+      <w:lvlText w:val="%5."/>
+      <w:lvlJc w:val="left"/>
+      <w:pPr>
+        <w:ind w:left="3600" w:hanging="360"/>
+      </w:pPr>
+    </w:lvl>
+    <w:lvl w:ilvl="5" w:tplc="0409001B" w:tentative="1">
+      <w:start w:val="1"/>
+      <w:numFmt w:val="lowerRoman"/>
+      <w:lvlText w:val="%6."/>
+      <w:lvlJc w:val="right"/>
+      <w:pPr>
+        <w:ind w:left="4320" w:hanging="180"/>
+      </w:pPr>
+    </w:lvl>
+    <w:lvl w:ilvl="6" w:tplc="0409000F" w:tentative="1">
+      <w:start w:val="1"/>
+      <w:numFmt w:val="decimal"/>
+      <w:lvlText w:val="%7."/>
+      <w:lvlJc w:val="left"/>
+      <w:pPr>
+        <w:ind w:left="5040" w:hanging="360"/>
+      </w:pPr>
+    </w:lvl>
+    <w:lvl w:ilvl="7" w:tplc="04090019" w:tentative="1">
+      <w:start w:val="1"/>
+      <w:numFmt w:val="lowerLetter"/>
+      <w:lvlText w:val="%8."/>
+      <w:lvlJc w:val="left"/>
+      <w:pPr>
+        <w:ind w:left="5760" w:hanging="360"/>
+      </w:pPr>
+    </w:lvl>
+    <w:lvl w:ilvl="8" w:tplc="0409001B" w:tentative="1">
+      <w:start w:val="1"/>
+      <w:numFmt w:val="lowerRoman"/>
+      <w:lvlText w:val="%9."/>
+      <w:lvlJc w:val="right"/>
+      <w:pPr>
+        <w:ind w:left="6480" w:hanging="180"/>
+      </w:pPr>
+    </w:lvl>
+  </w:abstractNum>
+  <w:abstractNum w:abstractNumId="30" w15:restartNumberingAfterBreak="0">
     <w:nsid w:val="7DB613C1"/>
     <w:multiLevelType w:val="hybridMultilevel"/>
     <w:tmpl w:val="CE10F88C"/>
@@ -7857,76 +9622,97 @@
     </w:lvl>
   </w:abstractNum>
   <w:num w:numId="1" w16cid:durableId="1918829433">
+    <w:abstractNumId w:val="2"/>
+  </w:num>
+  <w:num w:numId="2" w16cid:durableId="1596203068">
+    <w:abstractNumId w:val="19"/>
+  </w:num>
+  <w:num w:numId="3" w16cid:durableId="1960138834">
+    <w:abstractNumId w:val="7"/>
+  </w:num>
+  <w:num w:numId="4" w16cid:durableId="444156143">
+    <w:abstractNumId w:val="11"/>
+  </w:num>
+  <w:num w:numId="5" w16cid:durableId="1785925703">
+    <w:abstractNumId w:val="26"/>
+  </w:num>
+  <w:num w:numId="6" w16cid:durableId="1729105484">
+    <w:abstractNumId w:val="15"/>
+  </w:num>
+  <w:num w:numId="7" w16cid:durableId="34280185">
+    <w:abstractNumId w:val="27"/>
+  </w:num>
+  <w:num w:numId="8" w16cid:durableId="1777092839">
     <w:abstractNumId w:val="1"/>
   </w:num>
-  <w:num w:numId="2" w16cid:durableId="1596203068">
-    <w:abstractNumId w:val="15"/>
+  <w:num w:numId="9" w16cid:durableId="758718524">
+    <w:abstractNumId w:val="30"/>
   </w:num>
-  <w:num w:numId="3" w16cid:durableId="1960138834">
+  <w:num w:numId="10" w16cid:durableId="160897060">
+    <w:abstractNumId w:val="6"/>
+  </w:num>
+  <w:num w:numId="11" w16cid:durableId="419764462">
     <w:abstractNumId w:val="4"/>
   </w:num>
-  <w:num w:numId="4" w16cid:durableId="444156143">
-    <w:abstractNumId w:val="7"/>
+  <w:num w:numId="12" w16cid:durableId="1721898317">
+    <w:abstractNumId w:val="22"/>
   </w:num>
-  <w:num w:numId="5" w16cid:durableId="1785925703">
+  <w:num w:numId="13" w16cid:durableId="120151737">
+    <w:abstractNumId w:val="14"/>
+  </w:num>
+  <w:num w:numId="14" w16cid:durableId="1319262171">
+    <w:abstractNumId w:val="8"/>
+  </w:num>
+  <w:num w:numId="15" w16cid:durableId="1268582426">
+    <w:abstractNumId w:val="18"/>
+  </w:num>
+  <w:num w:numId="16" w16cid:durableId="2088308342">
+    <w:abstractNumId w:val="25"/>
+  </w:num>
+  <w:num w:numId="17" w16cid:durableId="1731228637">
+    <w:abstractNumId w:val="23"/>
+  </w:num>
+  <w:num w:numId="18" w16cid:durableId="1541242673">
+    <w:abstractNumId w:val="17"/>
+  </w:num>
+  <w:num w:numId="19" w16cid:durableId="654335855">
+    <w:abstractNumId w:val="16"/>
+  </w:num>
+  <w:num w:numId="20" w16cid:durableId="1070467808">
+    <w:abstractNumId w:val="13"/>
+  </w:num>
+  <w:num w:numId="21" w16cid:durableId="1911192305">
     <w:abstractNumId w:val="20"/>
   </w:num>
-  <w:num w:numId="6" w16cid:durableId="1729105484">
-    <w:abstractNumId w:val="11"/>
+  <w:num w:numId="22" w16cid:durableId="1167987115">
+    <w:abstractNumId w:val="12"/>
   </w:num>
-  <w:num w:numId="7" w16cid:durableId="34280185">
+  <w:num w:numId="23" w16cid:durableId="1645891084">
+    <w:abstractNumId w:val="9"/>
+  </w:num>
+  <w:num w:numId="24" w16cid:durableId="1099522345">
+    <w:abstractNumId w:val="28"/>
+  </w:num>
+  <w:num w:numId="25" w16cid:durableId="56437003">
     <w:abstractNumId w:val="21"/>
   </w:num>
-  <w:num w:numId="8" w16cid:durableId="1777092839">
+  <w:num w:numId="26" w16cid:durableId="1210337143">
+    <w:abstractNumId w:val="5"/>
+  </w:num>
+  <w:num w:numId="27" w16cid:durableId="1936326995">
+    <w:abstractNumId w:val="10"/>
+  </w:num>
+  <w:num w:numId="28" w16cid:durableId="2003309175">
+    <w:abstractNumId w:val="24"/>
+  </w:num>
+  <w:num w:numId="29" w16cid:durableId="654456774">
     <w:abstractNumId w:val="0"/>
   </w:num>
-  <w:num w:numId="9" w16cid:durableId="758718524">
-    <w:abstractNumId w:val="23"/>
-  </w:num>
-  <w:num w:numId="10" w16cid:durableId="160897060">
+  <w:num w:numId="30" w16cid:durableId="1986424941">
     <w:abstractNumId w:val="3"/>
   </w:num>
-  <w:num w:numId="11" w16cid:durableId="419764462">
-    <w:abstractNumId w:val="2"/>
-  </w:num>
-  <w:num w:numId="12" w16cid:durableId="1721898317">
-    <w:abstractNumId w:val="17"/>
-  </w:num>
-  <w:num w:numId="13" w16cid:durableId="120151737">
-    <w:abstractNumId w:val="10"/>
-  </w:num>
-  <w:num w:numId="14" w16cid:durableId="1319262171">
-    <w:abstractNumId w:val="5"/>
-  </w:num>
-  <w:num w:numId="15" w16cid:durableId="1268582426">
-    <w:abstractNumId w:val="14"/>
-  </w:num>
-  <w:num w:numId="16" w16cid:durableId="2088308342">
-    <w:abstractNumId w:val="19"/>
-  </w:num>
-  <w:num w:numId="17" w16cid:durableId="1731228637">
-    <w:abstractNumId w:val="18"/>
-  </w:num>
-  <w:num w:numId="18" w16cid:durableId="1541242673">
-    <w:abstractNumId w:val="13"/>
-  </w:num>
-  <w:num w:numId="19" w16cid:durableId="654335855">
-    <w:abstractNumId w:val="12"/>
-  </w:num>
-  <w:num w:numId="20" w16cid:durableId="1070467808">
-    <w:abstractNumId w:val="9"/>
-  </w:num>
-  <w:num w:numId="21" w16cid:durableId="1911192305">
-    <w:abstractNumId w:val="16"/>
-  </w:num>
-  <w:num w:numId="22" w16cid:durableId="1167987115">
-    <w:abstractNumId w:val="8"/>
-  </w:num>
-  <w:num w:numId="23" w16cid:durableId="1645891084">
-    <w:abstractNumId w:val="6"/>
-  </w:num>
-  <w:num w:numId="24" w16cid:durableId="1099522345">
-    <w:abstractNumId w:val="22"/>
+  <w:num w:numId="31" w16cid:durableId="30812947">
+    <w:abstractNumId w:val="29"/>
   </w:num>
 </w:numbering>
 </file>

</xml_diff>

<commit_message>
spring boot and microservices
</commit_message>
<xml_diff>
--- a/Phase 3 Api Endpoints.docx
+++ b/Phase 3 Api Endpoints.docx
@@ -144,9 +144,11 @@
           <w:numId w:val="3"/>
         </w:numPr>
       </w:pPr>
+      <w:proofErr w:type="spellStart"/>
       <w:r>
         <w:t>assertEquals</w:t>
       </w:r>
+      <w:proofErr w:type="spellEnd"/>
     </w:p>
     <w:p>
       <w:pPr>
@@ -156,9 +158,11 @@
           <w:numId w:val="3"/>
         </w:numPr>
       </w:pPr>
+      <w:proofErr w:type="spellStart"/>
       <w:r>
         <w:t>assertArrayEquals</w:t>
       </w:r>
+      <w:proofErr w:type="spellEnd"/>
     </w:p>
     <w:p>
       <w:pPr>
@@ -168,9 +172,11 @@
           <w:numId w:val="3"/>
         </w:numPr>
       </w:pPr>
+      <w:proofErr w:type="spellStart"/>
       <w:r>
         <w:t>assertThrows</w:t>
       </w:r>
+      <w:proofErr w:type="spellEnd"/>
     </w:p>
     <w:p>
       <w:pPr>
@@ -204,8 +210,13 @@
         <w:ind w:left="0" w:firstLine="0"/>
       </w:pPr>
       <w:r>
-        <w:t>Framework is like a semi implemented application which provides all the common functionalities an application needs</w:t>
-      </w:r>
+        <w:t xml:space="preserve">Framework is like a semi implemented application which provides all the common functionalities an application </w:t>
+      </w:r>
+      <w:proofErr w:type="gramStart"/>
+      <w:r>
+        <w:t>needs</w:t>
+      </w:r>
+      <w:proofErr w:type="gramEnd"/>
     </w:p>
     <w:p>
       <w:pPr>
@@ -263,7 +274,15 @@
         <w:t>Spring Framework:</w:t>
       </w:r>
       <w:r>
-        <w:t xml:space="preserve"> It is an application framework helps you to develop various types of applications like desktop, web, enterprise, cloud based applications</w:t>
+        <w:t xml:space="preserve"> It is an application framework helps you to develop various types of applications like desktop, web, enterprise, </w:t>
+      </w:r>
+      <w:proofErr w:type="gramStart"/>
+      <w:r>
+        <w:t>cloud based</w:t>
+      </w:r>
+      <w:proofErr w:type="gramEnd"/>
+      <w:r>
+        <w:t xml:space="preserve"> applications</w:t>
       </w:r>
     </w:p>
     <w:p>
@@ -331,18 +350,37 @@
         <w:ind w:left="0" w:firstLine="0"/>
       </w:pPr>
       <w:r>
-        <w:t>EmployeeDAO employeeDao</w:t>
-      </w:r>
+        <w:t xml:space="preserve">EmployeeDAO </w:t>
+      </w:r>
+      <w:proofErr w:type="spellStart"/>
+      <w:r>
+        <w:t>employeeDao</w:t>
+      </w:r>
+      <w:proofErr w:type="spellEnd"/>
       <w:r>
         <w:t xml:space="preserve">; </w:t>
       </w:r>
       <w:r>
         <w:br/>
-        <w:t>EmployeeService() {</w:t>
+      </w:r>
+      <w:proofErr w:type="gramStart"/>
+      <w:r>
+        <w:t>EmployeeService(</w:t>
+      </w:r>
+      <w:proofErr w:type="gramEnd"/>
+      <w:r>
+        <w:t>) {</w:t>
       </w:r>
       <w:r>
         <w:br/>
-        <w:t xml:space="preserve">employeeDao </w:t>
+      </w:r>
+      <w:proofErr w:type="spellStart"/>
+      <w:r>
+        <w:t>employeeDao</w:t>
+      </w:r>
+      <w:proofErr w:type="spellEnd"/>
+      <w:r>
+        <w:t xml:space="preserve"> </w:t>
       </w:r>
       <w:r>
         <w:t>= new EmployeeDao</w:t>
@@ -378,11 +416,26 @@
         <w:ind w:left="0" w:firstLine="0"/>
       </w:pPr>
       <w:r>
-        <w:t>EmployeeDAO employeeDao;</w:t>
+        <w:t xml:space="preserve">EmployeeDAO </w:t>
+      </w:r>
+      <w:proofErr w:type="spellStart"/>
+      <w:r>
+        <w:t>employeeDao</w:t>
+      </w:r>
+      <w:proofErr w:type="spellEnd"/>
+      <w:r>
+        <w:t>;</w:t>
       </w:r>
       <w:r>
         <w:br/>
-        <w:t>EmployeeService(EmployeeDao dao) {</w:t>
+      </w:r>
+      <w:proofErr w:type="gramStart"/>
+      <w:r>
+        <w:t>EmployeeService(</w:t>
+      </w:r>
+      <w:proofErr w:type="gramEnd"/>
+      <w:r>
+        <w:t>EmployeeDao dao) {</w:t>
       </w:r>
       <w:r>
         <w:br/>
@@ -414,7 +467,15 @@
         <w:ind w:left="0" w:firstLine="0"/>
       </w:pPr>
       <w:r>
-        <w:t>It implements the design pattern to create objects and supply objects, IOC is like a container that will maintain the objects created by spring.</w:t>
+        <w:t xml:space="preserve">It implements the design pattern to create objects and supply </w:t>
+      </w:r>
+      <w:proofErr w:type="gramStart"/>
+      <w:r>
+        <w:t>objects,</w:t>
+      </w:r>
+      <w:proofErr w:type="gramEnd"/>
+      <w:r>
+        <w:t xml:space="preserve"> IOC is like a container that will maintain the objects created by spring.</w:t>
       </w:r>
     </w:p>
     <w:p>
@@ -549,7 +610,15 @@
         </w:numPr>
       </w:pPr>
       <w:r>
-        <w:t>Handlings requests and forwarding to the controllers</w:t>
+        <w:t xml:space="preserve">Handlings </w:t>
+      </w:r>
+      <w:proofErr w:type="gramStart"/>
+      <w:r>
+        <w:t>requests</w:t>
+      </w:r>
+      <w:proofErr w:type="gramEnd"/>
+      <w:r>
+        <w:t xml:space="preserve"> and forwarding to the controllers</w:t>
       </w:r>
     </w:p>
     <w:p>
@@ -592,8 +661,13 @@
       <w:pPr>
         <w:ind w:left="0" w:firstLine="0"/>
       </w:pPr>
-      <w:r>
-        <w:t xml:space="preserve">DBUtil -&gt; spring creates </w:t>
+      <w:proofErr w:type="spellStart"/>
+      <w:r>
+        <w:t>DBUtil</w:t>
+      </w:r>
+      <w:proofErr w:type="spellEnd"/>
+      <w:r>
+        <w:t xml:space="preserve"> -&gt; spring creates </w:t>
       </w:r>
       <w:r>
         <w:t xml:space="preserve">the object &amp; manages </w:t>
@@ -719,15 +793,31 @@
         <w:t>dbUtil</w:t>
       </w:r>
       <w:r>
-        <w:t>” class = “com.exampels.DBUtil” /&gt;</w:t>
-      </w:r>
-    </w:p>
-    <w:p>
-      <w:pPr>
-        <w:ind w:left="0" w:firstLine="0"/>
-      </w:pPr>
-      <w:r>
-        <w:t>&lt;bean id = “datasource” class = “com.examples.Datasource”&gt;</w:t>
+        <w:t>” class = “</w:t>
+      </w:r>
+      <w:proofErr w:type="gramStart"/>
+      <w:r>
+        <w:t>com.exampels</w:t>
+      </w:r>
+      <w:proofErr w:type="gramEnd"/>
+      <w:r>
+        <w:t>.DBUtil” /&gt;</w:t>
+      </w:r>
+    </w:p>
+    <w:p>
+      <w:pPr>
+        <w:ind w:left="0" w:firstLine="0"/>
+      </w:pPr>
+      <w:r>
+        <w:t>&lt;bean id = “datasource” class = “</w:t>
+      </w:r>
+      <w:proofErr w:type="gramStart"/>
+      <w:r>
+        <w:t>com.examples</w:t>
+      </w:r>
+      <w:proofErr w:type="gramEnd"/>
+      <w:r>
+        <w:t>.Datasource”&gt;</w:t>
       </w:r>
       <w:r>
         <w:br/>
@@ -982,7 +1072,15 @@
         <w:ind w:left="0" w:firstLine="0"/>
       </w:pPr>
       <w:r>
-        <w:t>ApplicationContext context = new ClassPathXMLApplicationContext(“beans.xml”);</w:t>
+        <w:t xml:space="preserve">ApplicationContext context = new </w:t>
+      </w:r>
+      <w:proofErr w:type="spellStart"/>
+      <w:r>
+        <w:t>ClassPathXMLApplicationContext</w:t>
+      </w:r>
+      <w:proofErr w:type="spellEnd"/>
+      <w:r>
+        <w:t>(“beans.xml”);</w:t>
       </w:r>
     </w:p>
     <w:p>
@@ -1324,7 +1422,15 @@
         <w:t>Constructor injection:</w:t>
       </w:r>
       <w:r>
-        <w:t xml:space="preserve"> Here the data is supplied through constructor argument, and in the XML you will use &lt;constructor-arg&gt; tag</w:t>
+        <w:t xml:space="preserve"> Here the data is supplied through constructor argument, and in the </w:t>
+      </w:r>
+      <w:proofErr w:type="gramStart"/>
+      <w:r>
+        <w:t>XML</w:t>
+      </w:r>
+      <w:proofErr w:type="gramEnd"/>
+      <w:r>
+        <w:t xml:space="preserve"> you will use &lt;constructor-arg&gt; tag</w:t>
       </w:r>
     </w:p>
     <w:p>
@@ -1481,7 +1587,20 @@
               <w:ind w:left="0" w:firstLine="0"/>
             </w:pPr>
             <w:r>
-              <w:t>DB Connection you must establish, using getConnection(url, username, password)</w:t>
+              <w:t xml:space="preserve">DB Connection you must establish, using </w:t>
+            </w:r>
+            <w:proofErr w:type="spellStart"/>
+            <w:proofErr w:type="gramStart"/>
+            <w:r>
+              <w:t>getConnection</w:t>
+            </w:r>
+            <w:proofErr w:type="spellEnd"/>
+            <w:r>
+              <w:t>(</w:t>
+            </w:r>
+            <w:proofErr w:type="gramEnd"/>
+            <w:r>
+              <w:t>url, username, password)</w:t>
             </w:r>
           </w:p>
         </w:tc>
@@ -1517,7 +1636,23 @@
               <w:ind w:left="0" w:firstLine="0"/>
             </w:pPr>
             <w:r>
-              <w:t>ex: result.getInt(“ID”) or statement.setInt(1, value)</w:t>
+              <w:t xml:space="preserve">ex: </w:t>
+            </w:r>
+            <w:proofErr w:type="gramStart"/>
+            <w:r>
+              <w:t>result.getInt</w:t>
+            </w:r>
+            <w:proofErr w:type="gramEnd"/>
+            <w:r>
+              <w:t xml:space="preserve">(“ID”) or </w:t>
+            </w:r>
+            <w:proofErr w:type="gramStart"/>
+            <w:r>
+              <w:t>statement.setInt</w:t>
+            </w:r>
+            <w:proofErr w:type="gramEnd"/>
+            <w:r>
+              <w:t>(1, value)</w:t>
             </w:r>
           </w:p>
         </w:tc>
@@ -1563,16 +1698,26 @@
       <w:pPr>
         <w:ind w:left="0" w:firstLine="0"/>
       </w:pPr>
-      <w:r>
-        <w:t>update(“query”, parameters): This method is used to execute insert, update &amp; delete queries</w:t>
-      </w:r>
-    </w:p>
-    <w:p>
-      <w:pPr>
-        <w:ind w:left="0" w:firstLine="0"/>
-      </w:pPr>
-      <w:r>
-        <w:t>query(“query”, RowMapper): This method is used to execute select query for multiple records, RowMapper converts ResultSet to Java object</w:t>
+      <w:proofErr w:type="gramStart"/>
+      <w:r>
+        <w:t>update(</w:t>
+      </w:r>
+      <w:proofErr w:type="gramEnd"/>
+      <w:r>
+        <w:t>“query”, parameters): This method is used to execute insert, update &amp; delete queries</w:t>
+      </w:r>
+    </w:p>
+    <w:p>
+      <w:pPr>
+        <w:ind w:left="0" w:firstLine="0"/>
+      </w:pPr>
+      <w:proofErr w:type="gramStart"/>
+      <w:r>
+        <w:t>query(</w:t>
+      </w:r>
+      <w:proofErr w:type="gramEnd"/>
+      <w:r>
+        <w:t>“query”, RowMapper): This method is used to execute select query for multiple records, RowMapper converts ResultSet to Java object</w:t>
       </w:r>
     </w:p>
     <w:p>
@@ -1613,7 +1758,15 @@
         <w:ind w:left="0" w:firstLine="0"/>
       </w:pPr>
       <w:r>
-        <w:t>&lt;bean id = “datasource” class = “org.springframework…DriverManagerDataSource”&gt;</w:t>
+        <w:t>&lt;bean id = “datasource” class = “</w:t>
+      </w:r>
+      <w:proofErr w:type="gramStart"/>
+      <w:r>
+        <w:t>org.springframework</w:t>
+      </w:r>
+      <w:proofErr w:type="gramEnd"/>
+      <w:r>
+        <w:t>…DriverManagerDataSource”&gt;</w:t>
       </w:r>
       <w:r>
         <w:br/>
@@ -1629,7 +1782,20 @@
         <w:ind w:left="0" w:firstLine="0"/>
       </w:pPr>
       <w:r>
-        <w:t>&lt;bean id = “template” class = “org.spring…..JdbcTemplate”&gt;</w:t>
+        <w:t>&lt;bean id = “template” class = “</w:t>
+      </w:r>
+      <w:proofErr w:type="spellStart"/>
+      <w:proofErr w:type="gramStart"/>
+      <w:r>
+        <w:t>org.spring</w:t>
+      </w:r>
+      <w:proofErr w:type="spellEnd"/>
+      <w:r>
+        <w:t>…..</w:t>
+      </w:r>
+      <w:proofErr w:type="gramEnd"/>
+      <w:r>
+        <w:t>JdbcTemplate”&gt;</w:t>
       </w:r>
       <w:r>
         <w:br/>
@@ -1645,7 +1811,20 @@
         <w:ind w:left="0" w:firstLine="0"/>
       </w:pPr>
       <w:r>
-        <w:t>&lt;bean id = “dao” class = “com.example.ProfileDaoImpl”&gt;</w:t>
+        <w:t>&lt;bean id = “dao” class = “</w:t>
+      </w:r>
+      <w:proofErr w:type="spellStart"/>
+      <w:r>
+        <w:t>com.</w:t>
+      </w:r>
+      <w:proofErr w:type="gramStart"/>
+      <w:r>
+        <w:t>example.ProfileDaoImpl</w:t>
+      </w:r>
+      <w:proofErr w:type="spellEnd"/>
+      <w:proofErr w:type="gramEnd"/>
+      <w:r>
+        <w:t>”&gt;</w:t>
       </w:r>
       <w:r>
         <w:br/>
@@ -2085,11 +2264,19 @@
       <w:r>
         <w:t xml:space="preserve">JdbcTemplate has a method called </w:t>
       </w:r>
+      <w:proofErr w:type="gramStart"/>
       <w:r>
         <w:rPr>
           <w:color w:val="EE0000"/>
         </w:rPr>
-        <w:t xml:space="preserve">query() </w:t>
+        <w:t>query(</w:t>
+      </w:r>
+      <w:proofErr w:type="gramEnd"/>
+      <w:r>
+        <w:rPr>
+          <w:color w:val="EE0000"/>
+        </w:rPr>
+        <w:t xml:space="preserve">) </w:t>
       </w:r>
       <w:r>
         <w:t>which accepts SQL query and takes a RowMapper object</w:t>
@@ -2106,7 +2293,15 @@
         <w:t>RowMapper:</w:t>
       </w:r>
       <w:r>
-        <w:t xml:space="preserve"> It is an interface with one abstract method, which accepts ResultSet and row number as a parameter, we must implement this interface and the object the implementation we need to pass to the query() method</w:t>
+        <w:t xml:space="preserve"> It is an interface with one abstract method, which accepts ResultSet and row number as a parameter, we must implement this interface and the object the implementation we need to pass to the </w:t>
+      </w:r>
+      <w:proofErr w:type="gramStart"/>
+      <w:r>
+        <w:t>query(</w:t>
+      </w:r>
+      <w:proofErr w:type="gramEnd"/>
+      <w:r>
+        <w:t>) method</w:t>
       </w:r>
       <w:r>
         <w:t>, the query method takes care of calling the method present in the RowMapper as per the number of records</w:t>
@@ -2476,7 +2671,15 @@
         <w:ind w:left="0" w:firstLine="0"/>
       </w:pPr>
       <w:r>
-        <w:t>In Spring Framework we can also configure the beans using annotations and autowire as well, spring provides various annotations that are derived from @Component which you can write on top of classes, spring automatically create object of such classes &amp; maintains them in the container, some of the annotations are</w:t>
+        <w:t xml:space="preserve">In Spring </w:t>
+      </w:r>
+      <w:proofErr w:type="gramStart"/>
+      <w:r>
+        <w:t>Framework</w:t>
+      </w:r>
+      <w:proofErr w:type="gramEnd"/>
+      <w:r>
+        <w:t xml:space="preserve"> we can also configure the beans using annotations and autowire as well, spring provides various annotations that are derived from @Component which you can write on top of classes, spring automatically create object of such classes &amp; maintains them in the container, some of the annotations are</w:t>
       </w:r>
     </w:p>
     <w:p>
@@ -2516,7 +2719,15 @@
         <w:ind w:left="0" w:firstLine="0"/>
       </w:pPr>
       <w:r>
-        <w:t>&lt;context:component-scan base-package=”com” /&gt;</w:t>
+        <w:t>&lt;</w:t>
+      </w:r>
+      <w:proofErr w:type="gramStart"/>
+      <w:r>
+        <w:t>context:component</w:t>
+      </w:r>
+      <w:proofErr w:type="gramEnd"/>
+      <w:r>
+        <w:t>-scan base-package=”com” /&gt;</w:t>
       </w:r>
     </w:p>
     <w:p>
@@ -2728,7 +2939,21 @@
         <w:rPr>
           <w:highlight w:val="yellow"/>
         </w:rPr>
-        <w:t>Front Controller does following tasks</w:t>
+        <w:t xml:space="preserve">Front Controller does </w:t>
+      </w:r>
+      <w:proofErr w:type="gramStart"/>
+      <w:r>
+        <w:rPr>
+          <w:highlight w:val="yellow"/>
+        </w:rPr>
+        <w:t>following</w:t>
+      </w:r>
+      <w:proofErr w:type="gramEnd"/>
+      <w:r>
+        <w:rPr>
+          <w:highlight w:val="yellow"/>
+        </w:rPr>
+        <w:t xml:space="preserve"> tasks</w:t>
       </w:r>
     </w:p>
     <w:p>
@@ -2890,8 +3115,13 @@
         </w:numPr>
       </w:pPr>
       <w:r>
-        <w:t>spring-webmvc</w:t>
-      </w:r>
+        <w:t>spring-</w:t>
+      </w:r>
+      <w:proofErr w:type="spellStart"/>
+      <w:r>
+        <w:t>webmvc</w:t>
+      </w:r>
+      <w:proofErr w:type="spellEnd"/>
     </w:p>
     <w:p>
       <w:pPr>
@@ -3194,11 +3424,27 @@
       </w:r>
       <w:r>
         <w:br/>
-        <w:t xml:space="preserve">  @RequestMapping(path = “/test”, method = RequestMethod.GET)</w:t>
+        <w:t xml:space="preserve">  @</w:t>
+      </w:r>
+      <w:proofErr w:type="gramStart"/>
+      <w:r>
+        <w:t>RequestMapping(</w:t>
+      </w:r>
+      <w:proofErr w:type="gramEnd"/>
+      <w:r>
+        <w:t>path = “/test”, method = RequestMethod.GET)</w:t>
       </w:r>
       <w:r>
         <w:br/>
-        <w:t xml:space="preserve">  public ModelAndView hello() { </w:t>
+        <w:t xml:space="preserve">  public ModelAndView </w:t>
+      </w:r>
+      <w:proofErr w:type="gramStart"/>
+      <w:r>
+        <w:t>hello(</w:t>
+      </w:r>
+      <w:proofErr w:type="gramEnd"/>
+      <w:r>
+        <w:t xml:space="preserve">) { </w:t>
       </w:r>
       <w:r>
         <w:br/>
@@ -3206,8 +3452,21 @@
       </w:r>
       <w:r>
         <w:br/>
-        <w:t xml:space="preserve">        ModelAndView mav = new ModelAndView(</w:t>
-      </w:r>
+        <w:t xml:space="preserve">        ModelAndView </w:t>
+      </w:r>
+      <w:proofErr w:type="spellStart"/>
+      <w:r>
+        <w:t>mav</w:t>
+      </w:r>
+      <w:proofErr w:type="spellEnd"/>
+      <w:r>
+        <w:t xml:space="preserve"> = new </w:t>
+      </w:r>
+      <w:proofErr w:type="gramStart"/>
+      <w:r>
+        <w:t>ModelAndView(</w:t>
+      </w:r>
+      <w:proofErr w:type="gramEnd"/>
       <w:r>
         <w:t xml:space="preserve">“display”, “obj”, </w:t>
       </w:r>
@@ -3219,7 +3478,15 @@
       </w:r>
       <w:r>
         <w:br/>
-        <w:t xml:space="preserve">        return mav;</w:t>
+        <w:t xml:space="preserve">        return </w:t>
+      </w:r>
+      <w:proofErr w:type="spellStart"/>
+      <w:r>
+        <w:t>mav</w:t>
+      </w:r>
+      <w:proofErr w:type="spellEnd"/>
+      <w:r>
+        <w:t>;</w:t>
       </w:r>
       <w:r>
         <w:br/>
@@ -3238,8 +3505,13 @@
         <w:t xml:space="preserve">Front Controller -&gt; View Resolver </w:t>
       </w:r>
       <w:r>
-        <w:t>-&gt; WEB-INF/pages/display.jsp</w:t>
-      </w:r>
+        <w:t>-&gt; WEB-INF/pages/</w:t>
+      </w:r>
+      <w:proofErr w:type="spellStart"/>
+      <w:r>
+        <w:t>display.jsp</w:t>
+      </w:r>
+      <w:proofErr w:type="spellEnd"/>
     </w:p>
     <w:p>
       <w:pPr>
@@ -3492,12 +3764,14 @@
       <w:pPr>
         <w:ind w:left="0" w:firstLine="0"/>
       </w:pPr>
+      <w:proofErr w:type="spellStart"/>
       <w:r>
         <w:rPr>
           <w:highlight w:val="yellow"/>
         </w:rPr>
         <w:t>display.jsp</w:t>
       </w:r>
+      <w:proofErr w:type="spellEnd"/>
     </w:p>
     <w:p>
       <w:pPr>
@@ -4775,9 +5049,11 @@
       <w:r>
         <w:t xml:space="preserve">Send a PUT request with phone number and profileId in the URL, read </w:t>
       </w:r>
+      <w:proofErr w:type="gramStart"/>
       <w:r>
         <w:t>those value</w:t>
       </w:r>
+      <w:proofErr w:type="gramEnd"/>
       <w:r>
         <w:t xml:space="preserve"> in the webservice and return </w:t>
       </w:r>
@@ -4905,7 +5181,15 @@
         </w:numPr>
       </w:pPr>
       <w:r>
-        <w:t>JpaRepository&lt;T,ID&gt; extends CrudRepository&lt;T, ID&gt;</w:t>
+        <w:t>JpaRepository&lt;</w:t>
+      </w:r>
+      <w:proofErr w:type="gramStart"/>
+      <w:r>
+        <w:t>T,ID</w:t>
+      </w:r>
+      <w:proofErr w:type="gramEnd"/>
+      <w:r>
+        <w:t>&gt; extends CrudRepository&lt;T, ID&gt;</w:t>
       </w:r>
     </w:p>
     <w:p>
@@ -4976,7 +5260,39 @@
         <w:ind w:left="360" w:firstLine="0"/>
       </w:pPr>
       <w:r>
-        <w:t>CrudRepository&lt;T, ID&gt;: it provides generic methods to perform CRUD operations like save(T), deleteById(ID), findById(ID), findAll(), count()</w:t>
+        <w:t xml:space="preserve">CrudRepository&lt;T, ID&gt;: it provides generic methods to perform CRUD operations like save(T), </w:t>
+      </w:r>
+      <w:proofErr w:type="gramStart"/>
+      <w:r>
+        <w:t>deleteById(</w:t>
+      </w:r>
+      <w:proofErr w:type="gramEnd"/>
+      <w:r>
+        <w:t xml:space="preserve">ID), </w:t>
+      </w:r>
+      <w:proofErr w:type="gramStart"/>
+      <w:r>
+        <w:t>findById(</w:t>
+      </w:r>
+      <w:proofErr w:type="gramEnd"/>
+      <w:r>
+        <w:t xml:space="preserve">ID), </w:t>
+      </w:r>
+      <w:proofErr w:type="gramStart"/>
+      <w:r>
+        <w:t>findAll(</w:t>
+      </w:r>
+      <w:proofErr w:type="gramEnd"/>
+      <w:r>
+        <w:t xml:space="preserve">), </w:t>
+      </w:r>
+      <w:proofErr w:type="gramStart"/>
+      <w:r>
+        <w:t>count(</w:t>
+      </w:r>
+      <w:proofErr w:type="gramEnd"/>
+      <w:r>
+        <w:t>)</w:t>
       </w:r>
     </w:p>
     <w:p>
@@ -5081,12 +5397,14 @@
       <w:r>
         <w:t xml:space="preserve">Spring Data JPA looks for </w:t>
       </w:r>
+      <w:proofErr w:type="gramStart"/>
       <w:r>
         <w:rPr>
           <w:highlight w:val="yellow"/>
         </w:rPr>
         <w:t>application.properties</w:t>
       </w:r>
+      <w:proofErr w:type="gramEnd"/>
       <w:r>
         <w:t xml:space="preserve"> for database information like </w:t>
       </w:r>
@@ -5231,7 +5549,23 @@
         </w:numPr>
       </w:pPr>
       <w:r>
-        <w:t>public T save(T t): Here T is an entity class</w:t>
+        <w:t xml:space="preserve">public T </w:t>
+      </w:r>
+      <w:proofErr w:type="gramStart"/>
+      <w:r>
+        <w:t>save(</w:t>
+      </w:r>
+      <w:proofErr w:type="gramEnd"/>
+      <w:r>
+        <w:t xml:space="preserve">T t): Here </w:t>
+      </w:r>
+      <w:proofErr w:type="spellStart"/>
+      <w:r>
+        <w:t>T</w:t>
+      </w:r>
+      <w:proofErr w:type="spellEnd"/>
+      <w:r>
+        <w:t xml:space="preserve"> is an entity class</w:t>
       </w:r>
     </w:p>
     <w:p>
@@ -5244,7 +5578,15 @@
       </w:pPr>
       <w:r>
         <w:lastRenderedPageBreak/>
-        <w:t>public Optional&lt;T&gt; findById(ID id): Here Optional is an object that either stores entity or null</w:t>
+        <w:t xml:space="preserve">public Optional&lt;T&gt; </w:t>
+      </w:r>
+      <w:proofErr w:type="gramStart"/>
+      <w:r>
+        <w:t>findById(</w:t>
+      </w:r>
+      <w:proofErr w:type="gramEnd"/>
+      <w:r>
+        <w:t>ID id): Here Optional is an object that either stores entity or null</w:t>
       </w:r>
     </w:p>
     <w:p>
@@ -5256,7 +5598,15 @@
         </w:numPr>
       </w:pPr>
       <w:r>
-        <w:t xml:space="preserve">public List&lt;T&gt; findAll(): Here findAll returns all the entities </w:t>
+        <w:t xml:space="preserve">public List&lt;T&gt; </w:t>
+      </w:r>
+      <w:proofErr w:type="gramStart"/>
+      <w:r>
+        <w:t>findAll(</w:t>
+      </w:r>
+      <w:proofErr w:type="gramEnd"/>
+      <w:r>
+        <w:t xml:space="preserve">): Here findAll returns all the entities </w:t>
       </w:r>
     </w:p>
     <w:p>
@@ -5268,7 +5618,15 @@
         </w:numPr>
       </w:pPr>
       <w:r>
-        <w:t>public void deleteById(ID id): Here ID is a primary key value</w:t>
+        <w:t xml:space="preserve">public void </w:t>
+      </w:r>
+      <w:proofErr w:type="gramStart"/>
+      <w:r>
+        <w:t>deleteById(</w:t>
+      </w:r>
+      <w:proofErr w:type="gramEnd"/>
+      <w:r>
+        <w:t>ID id): Here ID is a primary key value</w:t>
       </w:r>
     </w:p>
     <w:p>
@@ -5311,8 +5669,13 @@
         </w:numPr>
       </w:pPr>
       <w:r>
-        <w:t>Use datasource information in application.properties</w:t>
-      </w:r>
+        <w:t xml:space="preserve">Use datasource information in </w:t>
+      </w:r>
+      <w:proofErr w:type="gramStart"/>
+      <w:r>
+        <w:t>application.properties</w:t>
+      </w:r>
+      <w:proofErr w:type="gramEnd"/>
     </w:p>
     <w:p>
       <w:pPr>
@@ -5473,12 +5836,14 @@
       <w:pPr>
         <w:ind w:left="0" w:firstLine="0"/>
       </w:pPr>
+      <w:proofErr w:type="gramStart"/>
       <w:r>
         <w:rPr>
           <w:highlight w:val="yellow"/>
         </w:rPr>
         <w:t>application.properties</w:t>
       </w:r>
+      <w:proofErr w:type="gramEnd"/>
     </w:p>
     <w:p>
       <w:pPr>
@@ -5708,7 +6073,15 @@
         <w:ind w:left="0" w:firstLine="0"/>
       </w:pPr>
       <w:r>
-        <w:t>Right now we will keep only three operations and later we can implement update &amp; delete, now in the webservice we must create controllers to invoke create and read profiles, but we will keep same URL but different HTTP methods.</w:t>
+        <w:t xml:space="preserve">Right </w:t>
+      </w:r>
+      <w:proofErr w:type="gramStart"/>
+      <w:r>
+        <w:t>now</w:t>
+      </w:r>
+      <w:proofErr w:type="gramEnd"/>
+      <w:r>
+        <w:t xml:space="preserve"> we will keep only three operations and later we can implement update &amp; delete, now in the webservice we must create controllers to invoke create and read profiles, but we will keep same URL but different HTTP methods.</w:t>
       </w:r>
     </w:p>
     <w:p>
@@ -5743,11 +6116,42 @@
         <w:ind w:left="0" w:firstLine="0"/>
       </w:pPr>
       <w:r>
-        <w:t>Profile profile = findProfile(100);</w:t>
+        <w:t xml:space="preserve">Profile </w:t>
+      </w:r>
+      <w:proofErr w:type="spellStart"/>
+      <w:r>
+        <w:t>profile</w:t>
+      </w:r>
+      <w:proofErr w:type="spellEnd"/>
+      <w:r>
+        <w:t xml:space="preserve"> = </w:t>
+      </w:r>
+      <w:proofErr w:type="gramStart"/>
+      <w:r>
+        <w:t>findProfile(</w:t>
+      </w:r>
+      <w:proofErr w:type="gramEnd"/>
+      <w:r>
+        <w:t>100);</w:t>
       </w:r>
       <w:r>
         <w:br/>
-        <w:t>if(profile != null) profile.setPhone(93892323); // this automatically saves changes to the DB</w:t>
+      </w:r>
+      <w:proofErr w:type="gramStart"/>
+      <w:r>
+        <w:t>if(profile !</w:t>
+      </w:r>
+      <w:proofErr w:type="gramEnd"/>
+      <w:r>
+        <w:t xml:space="preserve">= null) </w:t>
+      </w:r>
+      <w:proofErr w:type="gramStart"/>
+      <w:r>
+        <w:t>profile.setPhone</w:t>
+      </w:r>
+      <w:proofErr w:type="gramEnd"/>
+      <w:r>
+        <w:t>(93892323); // this automatically saves changes to the DB</w:t>
       </w:r>
     </w:p>
     <w:p>
@@ -5756,15 +6160,30 @@
       </w:pPr>
       <w:r>
         <w:lastRenderedPageBreak/>
-        <w:t>For Delete you can use deleteById(ID id) method of JpaRepository</w:t>
-      </w:r>
-    </w:p>
-    <w:p>
-      <w:pPr>
-        <w:ind w:left="0" w:firstLine="0"/>
-      </w:pPr>
-      <w:r>
-        <w:t>dao.deleteById(100);</w:t>
+        <w:t xml:space="preserve">For Delete you can use </w:t>
+      </w:r>
+      <w:proofErr w:type="gramStart"/>
+      <w:r>
+        <w:t>deleteById(</w:t>
+      </w:r>
+      <w:proofErr w:type="gramEnd"/>
+      <w:r>
+        <w:t>ID id) method of JpaRepository</w:t>
+      </w:r>
+    </w:p>
+    <w:p>
+      <w:pPr>
+        <w:ind w:left="0" w:firstLine="0"/>
+      </w:pPr>
+      <w:proofErr w:type="spellStart"/>
+      <w:proofErr w:type="gramStart"/>
+      <w:r>
+        <w:t>dao.deleteById</w:t>
+      </w:r>
+      <w:proofErr w:type="spellEnd"/>
+      <w:proofErr w:type="gramEnd"/>
+      <w:r>
+        <w:t>(100);</w:t>
       </w:r>
     </w:p>
     <w:p>
@@ -5783,6 +6202,9 @@
         <w:ind w:left="0" w:firstLine="0"/>
       </w:pPr>
       <w:r>
+        <w:rPr>
+          <w:noProof/>
+        </w:rPr>
         <w:drawing>
           <wp:inline distT="0" distB="0" distL="0" distR="0" wp14:anchorId="0D36A0FB" wp14:editId="07540371">
             <wp:extent cx="5943600" cy="3937635"/>
@@ -5836,6 +6258,9 @@
         <w:ind w:left="0" w:firstLine="0"/>
       </w:pPr>
       <w:r>
+        <w:rPr>
+          <w:noProof/>
+        </w:rPr>
         <w:lastRenderedPageBreak/>
         <w:drawing>
           <wp:inline distT="0" distB="0" distL="0" distR="0" wp14:anchorId="55C5C3BC" wp14:editId="7802E20B">
@@ -5890,6 +6315,9 @@
         <w:ind w:left="0" w:firstLine="0"/>
       </w:pPr>
       <w:r>
+        <w:rPr>
+          <w:noProof/>
+        </w:rPr>
         <w:lastRenderedPageBreak/>
         <w:drawing>
           <wp:inline distT="0" distB="0" distL="0" distR="0" wp14:anchorId="74DCD4AC" wp14:editId="04E77E69">
@@ -6072,47 +6500,87 @@
       </w:r>
       <w:r>
         <w:br/>
-        <w:t xml:space="preserve">class AspectDemo { </w:t>
+        <w:t xml:space="preserve">class </w:t>
+      </w:r>
+      <w:proofErr w:type="spellStart"/>
+      <w:r>
+        <w:t>AspectDemo</w:t>
+      </w:r>
+      <w:proofErr w:type="spellEnd"/>
+      <w:r>
+        <w:t xml:space="preserve"> { </w:t>
       </w:r>
       <w:r>
         <w:br/>
         <w:t xml:space="preserve">  @Before</w:t>
       </w:r>
       <w:r>
-        <w:t>(“</w:t>
-      </w:r>
-      <w:r>
-        <w:t>execution(“com.examples.ProfileServiceImpl.createProfile”)</w:t>
-      </w:r>
-      <w:r>
-        <w:t xml:space="preserve">”) </w:t>
+        <w:t>(“execution(“</w:t>
+      </w:r>
+      <w:proofErr w:type="gramStart"/>
+      <w:r>
+        <w:t>com.examples</w:t>
+      </w:r>
+      <w:proofErr w:type="gramEnd"/>
+      <w:r>
+        <w:t xml:space="preserve">.ProfileServiceImpl.createProfile”)”) </w:t>
       </w:r>
       <w:r>
         <w:br/>
-        <w:t xml:space="preserve">  public void beforeExec()  { .. } </w:t>
+        <w:t xml:space="preserve">  public void </w:t>
+      </w:r>
+      <w:proofErr w:type="spellStart"/>
+      <w:proofErr w:type="gramStart"/>
+      <w:r>
+        <w:t>beforeExec</w:t>
+      </w:r>
+      <w:proofErr w:type="spellEnd"/>
+      <w:r>
+        <w:t>()  { ..</w:t>
+      </w:r>
+      <w:proofErr w:type="gramEnd"/>
+      <w:r>
+        <w:t xml:space="preserve"> } </w:t>
       </w:r>
       <w:r>
         <w:br/>
         <w:t xml:space="preserve">  @After</w:t>
       </w:r>
       <w:r>
-        <w:t>(“</w:t>
-      </w:r>
-      <w:r>
-        <w:t>execution(“com.examples.ProfileServiceImpl.createProfile”)</w:t>
-      </w:r>
-      <w:r>
-        <w:t>”)</w:t>
+        <w:t>(“execution(“</w:t>
+      </w:r>
+      <w:proofErr w:type="gramStart"/>
+      <w:r>
+        <w:t>com.examples</w:t>
+      </w:r>
+      <w:proofErr w:type="gramEnd"/>
+      <w:r>
+        <w:t>.ProfileServiceImpl.createProfile”)”)</w:t>
       </w:r>
       <w:r>
         <w:br/>
-        <w:t xml:space="preserve">  </w:t>
-      </w:r>
-      <w:r>
-        <w:t xml:space="preserve"> </w:t>
-      </w:r>
-      <w:r>
-        <w:t xml:space="preserve">   public void afterExce() { .. }</w:t>
+        <w:t xml:space="preserve">      public void </w:t>
+      </w:r>
+      <w:proofErr w:type="spellStart"/>
+      <w:proofErr w:type="gramStart"/>
+      <w:r>
+        <w:t>afterExce</w:t>
+      </w:r>
+      <w:proofErr w:type="spellEnd"/>
+      <w:r>
+        <w:t>(</w:t>
+      </w:r>
+      <w:proofErr w:type="gramEnd"/>
+      <w:r>
+        <w:t>) {</w:t>
+      </w:r>
+      <w:proofErr w:type="gramStart"/>
+      <w:r>
+        <w:t xml:space="preserve"> ..</w:t>
+      </w:r>
+      <w:proofErr w:type="gramEnd"/>
+      <w:r>
+        <w:t xml:space="preserve"> }</w:t>
       </w:r>
       <w:r>
         <w:br/>
@@ -6142,7 +6610,15 @@
         </w:numPr>
       </w:pPr>
       <w:r>
-        <w:t>spring boot aop starter</w:t>
+        <w:t xml:space="preserve">spring boot </w:t>
+      </w:r>
+      <w:proofErr w:type="spellStart"/>
+      <w:r>
+        <w:t>aop</w:t>
+      </w:r>
+      <w:proofErr w:type="spellEnd"/>
+      <w:r>
+        <w:t xml:space="preserve"> starter</w:t>
       </w:r>
     </w:p>
     <w:p>
@@ -6153,9 +6629,11 @@
           <w:numId w:val="26"/>
         </w:numPr>
       </w:pPr>
+      <w:proofErr w:type="spellStart"/>
       <w:r>
         <w:t>aspectjweaver</w:t>
       </w:r>
+      <w:proofErr w:type="spellEnd"/>
     </w:p>
     <w:p>
       <w:pPr>
@@ -6212,6 +6690,9 @@
         <w:ind w:left="0" w:firstLine="0"/>
       </w:pPr>
       <w:r>
+        <w:rPr>
+          <w:noProof/>
+        </w:rPr>
         <w:drawing>
           <wp:inline distT="0" distB="0" distL="0" distR="0" wp14:anchorId="4F2CEF36" wp14:editId="6E38F70F">
             <wp:extent cx="5943600" cy="2633345"/>
@@ -6259,14 +6740,25 @@
         <w:ind w:left="0" w:firstLine="0"/>
       </w:pPr>
       <w:r>
-        <w:t>In Microservices architecture each service are developed, tested and deployed independently, you can scale whichever the service gets high traffic without scaling other services, if you modify any one service you can only test that service, without testing other services, if any service goes down, other services will be still working, releasing new feature is quicker</w:t>
-      </w:r>
-    </w:p>
-    <w:p>
-      <w:pPr>
-        <w:ind w:left="0" w:firstLine="0"/>
-      </w:pPr>
-      <w:r>
+        <w:t xml:space="preserve">In Microservices architecture each service </w:t>
+      </w:r>
+      <w:proofErr w:type="gramStart"/>
+      <w:r>
+        <w:t>are</w:t>
+      </w:r>
+      <w:proofErr w:type="gramEnd"/>
+      <w:r>
+        <w:t xml:space="preserve"> developed, tested and deployed independently, you can scale whichever the service gets high traffic without scaling other services, if you modify any one service you can only test that service, without testing other services, if any service goes down, other services will be still working, releasing new feature is quicker</w:t>
+      </w:r>
+    </w:p>
+    <w:p>
+      <w:pPr>
+        <w:ind w:left="0" w:firstLine="0"/>
+      </w:pPr>
+      <w:r>
+        <w:rPr>
+          <w:noProof/>
+        </w:rPr>
         <w:lastRenderedPageBreak/>
         <w:drawing>
           <wp:inline distT="0" distB="0" distL="0" distR="0" wp14:anchorId="774EF095" wp14:editId="2C65338D">
@@ -6333,14 +6825,25 @@
         </w:numPr>
       </w:pPr>
       <w:r>
-        <w:t>Discovery Server -&gt; This registers all the microservices, so that microservices can locate other microservices to communicate</w:t>
-      </w:r>
-    </w:p>
-    <w:p>
-      <w:pPr>
-        <w:ind w:left="0" w:firstLine="0"/>
-      </w:pPr>
-      <w:r>
+        <w:t xml:space="preserve">Discovery Server -&gt; </w:t>
+      </w:r>
+      <w:proofErr w:type="gramStart"/>
+      <w:r>
+        <w:t>This registers</w:t>
+      </w:r>
+      <w:proofErr w:type="gramEnd"/>
+      <w:r>
+        <w:t xml:space="preserve"> all the microservices, so that microservices can locate other microservices to communicate</w:t>
+      </w:r>
+    </w:p>
+    <w:p>
+      <w:pPr>
+        <w:ind w:left="0" w:firstLine="0"/>
+      </w:pPr>
+      <w:r>
+        <w:rPr>
+          <w:noProof/>
+        </w:rPr>
         <w:drawing>
           <wp:inline distT="0" distB="0" distL="0" distR="0" wp14:anchorId="72A1ACCC" wp14:editId="26CDAE15">
             <wp:extent cx="5943600" cy="3055620"/>
@@ -6456,6 +6959,9 @@
         <w:ind w:left="0" w:firstLine="0"/>
       </w:pPr>
       <w:r>
+        <w:rPr>
+          <w:noProof/>
+        </w:rPr>
         <w:drawing>
           <wp:inline distT="0" distB="0" distL="0" distR="0" wp14:anchorId="56F55736" wp14:editId="66FABC1A">
             <wp:extent cx="5943600" cy="2632075"/>
@@ -6520,7 +7026,15 @@
         </w:numPr>
       </w:pPr>
       <w:r>
-        <w:t>it allows all the clients (microservices) to register with an unique name called instance id</w:t>
+        <w:t xml:space="preserve">it allows all the clients (microservices) to register with </w:t>
+      </w:r>
+      <w:proofErr w:type="gramStart"/>
+      <w:r>
+        <w:t>an</w:t>
+      </w:r>
+      <w:proofErr w:type="gramEnd"/>
+      <w:r>
+        <w:t xml:space="preserve"> unique name called instance id</w:t>
       </w:r>
     </w:p>
     <w:p>
@@ -6555,7 +7069,15 @@
         </w:numPr>
       </w:pPr>
       <w:r>
-        <w:t>It is a microservice (will be having controller, service, dao and etc)</w:t>
+        <w:t xml:space="preserve">It is a microservice (will be having controller, service, dao and </w:t>
+      </w:r>
+      <w:proofErr w:type="spellStart"/>
+      <w:r>
+        <w:t>etc</w:t>
+      </w:r>
+      <w:proofErr w:type="spellEnd"/>
+      <w:r>
+        <w:t>)</w:t>
       </w:r>
     </w:p>
     <w:p>
@@ -6595,6 +7117,9 @@
         <w:ind w:left="360" w:firstLine="0"/>
       </w:pPr>
       <w:r>
+        <w:rPr>
+          <w:noProof/>
+        </w:rPr>
         <w:drawing>
           <wp:inline distT="0" distB="0" distL="0" distR="0" wp14:anchorId="5A09AE55" wp14:editId="30E99D8F">
             <wp:extent cx="5943600" cy="2950845"/>
@@ -6669,8 +7194,21 @@
         </w:numPr>
       </w:pPr>
       <w:r>
-        <w:t>Service Discovery - libraries : eureka server, devtools</w:t>
-      </w:r>
+        <w:t xml:space="preserve">Service Discovery - </w:t>
+      </w:r>
+      <w:proofErr w:type="gramStart"/>
+      <w:r>
+        <w:t>libraries :</w:t>
+      </w:r>
+      <w:proofErr w:type="gramEnd"/>
+      <w:r>
+        <w:t xml:space="preserve"> eureka server, </w:t>
+      </w:r>
+      <w:proofErr w:type="spellStart"/>
+      <w:r>
+        <w:t>devtools</w:t>
+      </w:r>
+      <w:proofErr w:type="spellEnd"/>
     </w:p>
     <w:p>
       <w:pPr>
@@ -6681,7 +7219,31 @@
         </w:numPr>
       </w:pPr>
       <w:r>
-        <w:t>Microservice - libraries : eureka client, devtools, web, jpa and so on</w:t>
+        <w:t xml:space="preserve">Microservice - </w:t>
+      </w:r>
+      <w:proofErr w:type="gramStart"/>
+      <w:r>
+        <w:t>libraries :</w:t>
+      </w:r>
+      <w:proofErr w:type="gramEnd"/>
+      <w:r>
+        <w:t xml:space="preserve"> eureka client, </w:t>
+      </w:r>
+      <w:proofErr w:type="spellStart"/>
+      <w:r>
+        <w:t>devtools</w:t>
+      </w:r>
+      <w:proofErr w:type="spellEnd"/>
+      <w:r>
+        <w:t xml:space="preserve">, web, </w:t>
+      </w:r>
+      <w:proofErr w:type="spellStart"/>
+      <w:r>
+        <w:t>jpa</w:t>
+      </w:r>
+      <w:proofErr w:type="spellEnd"/>
+      <w:r>
+        <w:t xml:space="preserve"> and so on</w:t>
       </w:r>
     </w:p>
     <w:p>
@@ -6703,8 +7265,13 @@
           <w:numId w:val="31"/>
         </w:numPr>
       </w:pPr>
-      <w:r>
-        <w:t xml:space="preserve">application.properties -&gt; port = 8761, disable client features </w:t>
+      <w:proofErr w:type="gramStart"/>
+      <w:r>
+        <w:t>application.properties</w:t>
+      </w:r>
+      <w:proofErr w:type="gramEnd"/>
+      <w:r>
+        <w:t xml:space="preserve"> -&gt; port = 8761, disable client features </w:t>
       </w:r>
     </w:p>
     <w:p>
@@ -6723,18 +7290,23 @@
       <w:pPr>
         <w:ind w:left="0" w:firstLine="0"/>
       </w:pPr>
+      <w:proofErr w:type="gramStart"/>
       <w:r>
         <w:rPr>
           <w:highlight w:val="yellow"/>
         </w:rPr>
         <w:t>application.properties</w:t>
       </w:r>
-    </w:p>
-    <w:p>
-      <w:pPr>
-        <w:ind w:left="0" w:firstLine="0"/>
-      </w:pPr>
-      <w:r>
+      <w:proofErr w:type="gramEnd"/>
+    </w:p>
+    <w:p>
+      <w:pPr>
+        <w:ind w:left="0" w:firstLine="0"/>
+      </w:pPr>
+      <w:r>
+        <w:rPr>
+          <w:noProof/>
+        </w:rPr>
         <w:lastRenderedPageBreak/>
         <w:drawing>
           <wp:inline distT="0" distB="0" distL="0" distR="0" wp14:anchorId="0E36BB21" wp14:editId="022A6FDE">
@@ -6789,6 +7361,9 @@
         <w:ind w:left="0" w:firstLine="0"/>
       </w:pPr>
       <w:r>
+        <w:rPr>
+          <w:noProof/>
+        </w:rPr>
         <w:drawing>
           <wp:inline distT="0" distB="0" distL="0" distR="0" wp14:anchorId="3DD4C316" wp14:editId="3997945C">
             <wp:extent cx="5943600" cy="2672080"/>
@@ -6826,6 +7401,911 @@
         </w:drawing>
       </w:r>
     </w:p>
+    <w:p>
+      <w:pPr>
+        <w:ind w:left="0" w:firstLine="0"/>
+      </w:pPr>
+      <w:r>
+        <w:rPr>
+          <w:highlight w:val="yellow"/>
+        </w:rPr>
+        <w:t>10-05-2026</w:t>
+      </w:r>
+    </w:p>
+    <w:p>
+      <w:pPr>
+        <w:ind w:left="0" w:firstLine="0"/>
+      </w:pPr>
+      <w:r>
+        <w:rPr>
+          <w:highlight w:val="yellow"/>
+        </w:rPr>
+        <w:t>Creating microservice</w:t>
+      </w:r>
+    </w:p>
+    <w:p>
+      <w:pPr>
+        <w:ind w:left="0" w:firstLine="0"/>
+      </w:pPr>
+      <w:proofErr w:type="gramStart"/>
+      <w:r>
+        <w:rPr>
+          <w:highlight w:val="yellow"/>
+        </w:rPr>
+        <w:t>application.properties</w:t>
+      </w:r>
+      <w:proofErr w:type="gramEnd"/>
+    </w:p>
+    <w:p>
+      <w:pPr>
+        <w:ind w:left="0" w:firstLine="0"/>
+      </w:pPr>
+      <w:r>
+        <w:drawing>
+          <wp:inline distT="0" distB="0" distL="0" distR="0" wp14:anchorId="0F30A221" wp14:editId="57C89737">
+            <wp:extent cx="5687219" cy="1143160"/>
+            <wp:effectExtent l="0" t="0" r="0" b="0"/>
+            <wp:docPr id="1018567036" name="Picture 1"/>
+            <wp:cNvGraphicFramePr>
+              <a:graphicFrameLocks xmlns:a="http://schemas.openxmlformats.org/drawingml/2006/main" noChangeAspect="1"/>
+            </wp:cNvGraphicFramePr>
+            <a:graphic xmlns:a="http://schemas.openxmlformats.org/drawingml/2006/main">
+              <a:graphicData uri="http://schemas.openxmlformats.org/drawingml/2006/picture">
+                <pic:pic xmlns:pic="http://schemas.openxmlformats.org/drawingml/2006/picture">
+                  <pic:nvPicPr>
+                    <pic:cNvPr id="1018567036" name=""/>
+                    <pic:cNvPicPr/>
+                  </pic:nvPicPr>
+                  <pic:blipFill>
+                    <a:blip r:embed="rId63"/>
+                    <a:stretch>
+                      <a:fillRect/>
+                    </a:stretch>
+                  </pic:blipFill>
+                  <pic:spPr>
+                    <a:xfrm>
+                      <a:off x="0" y="0"/>
+                      <a:ext cx="5687219" cy="1143160"/>
+                    </a:xfrm>
+                    <a:prstGeom prst="rect">
+                      <a:avLst/>
+                    </a:prstGeom>
+                  </pic:spPr>
+                </pic:pic>
+              </a:graphicData>
+            </a:graphic>
+          </wp:inline>
+        </w:drawing>
+      </w:r>
+    </w:p>
+    <w:p>
+      <w:pPr>
+        <w:ind w:left="0" w:firstLine="0"/>
+      </w:pPr>
+      <w:r>
+        <w:rPr>
+          <w:highlight w:val="yellow"/>
+        </w:rPr>
+        <w:t>AccountApi.java</w:t>
+      </w:r>
+    </w:p>
+    <w:p>
+      <w:pPr>
+        <w:ind w:left="0" w:firstLine="0"/>
+      </w:pPr>
+      <w:r>
+        <w:lastRenderedPageBreak/>
+        <w:drawing>
+          <wp:inline distT="0" distB="0" distL="0" distR="0" wp14:anchorId="1C26ED7A" wp14:editId="2FA0A829">
+            <wp:extent cx="5943600" cy="3622040"/>
+            <wp:effectExtent l="0" t="0" r="0" b="0"/>
+            <wp:docPr id="334482046" name="Picture 1"/>
+            <wp:cNvGraphicFramePr>
+              <a:graphicFrameLocks xmlns:a="http://schemas.openxmlformats.org/drawingml/2006/main" noChangeAspect="1"/>
+            </wp:cNvGraphicFramePr>
+            <a:graphic xmlns:a="http://schemas.openxmlformats.org/drawingml/2006/main">
+              <a:graphicData uri="http://schemas.openxmlformats.org/drawingml/2006/picture">
+                <pic:pic xmlns:pic="http://schemas.openxmlformats.org/drawingml/2006/picture">
+                  <pic:nvPicPr>
+                    <pic:cNvPr id="334482046" name=""/>
+                    <pic:cNvPicPr/>
+                  </pic:nvPicPr>
+                  <pic:blipFill>
+                    <a:blip r:embed="rId64"/>
+                    <a:stretch>
+                      <a:fillRect/>
+                    </a:stretch>
+                  </pic:blipFill>
+                  <pic:spPr>
+                    <a:xfrm>
+                      <a:off x="0" y="0"/>
+                      <a:ext cx="5943600" cy="3622040"/>
+                    </a:xfrm>
+                    <a:prstGeom prst="rect">
+                      <a:avLst/>
+                    </a:prstGeom>
+                  </pic:spPr>
+                </pic:pic>
+              </a:graphicData>
+            </a:graphic>
+          </wp:inline>
+        </w:drawing>
+      </w:r>
+    </w:p>
+    <w:p>
+      <w:pPr>
+        <w:ind w:left="0" w:firstLine="0"/>
+      </w:pPr>
+      <w:r>
+        <w:rPr>
+          <w:highlight w:val="yellow"/>
+        </w:rPr>
+        <w:t>Second Microservice</w:t>
+      </w:r>
+    </w:p>
+    <w:p>
+      <w:pPr>
+        <w:ind w:left="0" w:firstLine="0"/>
+      </w:pPr>
+      <w:r>
+        <w:t>It must call the Account Service and use the data coming from the microservice and process it, like it can use the balance and display in the mobile screen your balance with some amount.</w:t>
+      </w:r>
+    </w:p>
+    <w:p>
+      <w:pPr>
+        <w:ind w:left="0" w:firstLine="0"/>
+      </w:pPr>
+      <w:r>
+        <w:rPr>
+          <w:highlight w:val="yellow"/>
+        </w:rPr>
+        <w:t>Feign Rest Client:</w:t>
+      </w:r>
+      <w:r>
+        <w:t xml:space="preserve"> This is a client that can use the remote microservice instance id and query the physical address of the remote microservice, by default this library wouldn’t be available, we must add this in our project</w:t>
+      </w:r>
+    </w:p>
+    <w:p>
+      <w:pPr>
+        <w:ind w:left="0" w:firstLine="0"/>
+      </w:pPr>
+      <w:r>
+        <w:rPr>
+          <w:highlight w:val="yellow"/>
+        </w:rPr>
+        <w:t>Note:</w:t>
+      </w:r>
+      <w:r>
+        <w:t xml:space="preserve"> Feign Client can do an intelligent routing even if there are multiple instances of the remote microservices, that is it sends requests to distribute the load across the instances</w:t>
+      </w:r>
+    </w:p>
+    <w:p>
+      <w:pPr>
+        <w:ind w:left="0" w:firstLine="0"/>
+      </w:pPr>
+      <w:r>
+        <w:t>@EnableFeignClients -&gt; This creates a feign client object for the Feign Client interfaces</w:t>
+      </w:r>
+    </w:p>
+    <w:p>
+      <w:pPr>
+        <w:ind w:left="0" w:firstLine="0"/>
+      </w:pPr>
+      <w:r>
+        <w:t xml:space="preserve">Feign Client </w:t>
+      </w:r>
+      <w:proofErr w:type="gramStart"/>
+      <w:r>
+        <w:t>interfaces :</w:t>
+      </w:r>
+      <w:proofErr w:type="gramEnd"/>
+      <w:r>
+        <w:t xml:space="preserve"> These are rest end points of remote </w:t>
+      </w:r>
+      <w:r>
+        <w:t>microser</w:t>
+      </w:r>
+      <w:r>
+        <w:t xml:space="preserve">vice </w:t>
+      </w:r>
+    </w:p>
+    <w:p>
+      <w:pPr>
+        <w:ind w:left="0" w:firstLine="0"/>
+      </w:pPr>
+      <w:r>
+        <w:t>@</w:t>
+      </w:r>
+      <w:proofErr w:type="gramStart"/>
+      <w:r>
+        <w:t>FeignClient(</w:t>
+      </w:r>
+      <w:proofErr w:type="gramEnd"/>
+      <w:r>
+        <w:t>path = “http://ACCOUNT-SERVICE”)</w:t>
+      </w:r>
+      <w:r>
+        <w:br/>
+        <w:t xml:space="preserve">interface AccountClient { </w:t>
+      </w:r>
+      <w:r>
+        <w:br/>
+        <w:t xml:space="preserve">     @GetMapping(“/account/balance”)</w:t>
+      </w:r>
+      <w:r>
+        <w:br/>
+      </w:r>
+      <w:r>
+        <w:lastRenderedPageBreak/>
+        <w:t xml:space="preserve">     public ResponseEntity&lt;Object&gt; </w:t>
+      </w:r>
+      <w:proofErr w:type="gramStart"/>
+      <w:r>
+        <w:t>fetchBalance(</w:t>
+      </w:r>
+      <w:proofErr w:type="gramEnd"/>
+      <w:r>
+        <w:t>);</w:t>
+      </w:r>
+      <w:r>
+        <w:br/>
+        <w:t>}</w:t>
+      </w:r>
+    </w:p>
+    <w:p>
+      <w:pPr>
+        <w:ind w:left="0" w:firstLine="0"/>
+      </w:pPr>
+      <w:r>
+        <w:t>@Autowired</w:t>
+      </w:r>
+      <w:r>
+        <w:br/>
+        <w:t>private AccountClient client;</w:t>
+      </w:r>
+    </w:p>
+    <w:p>
+      <w:pPr>
+        <w:ind w:left="0" w:firstLine="0"/>
+      </w:pPr>
+      <w:proofErr w:type="gramStart"/>
+      <w:r>
+        <w:t>client.fetchBalance</w:t>
+      </w:r>
+      <w:proofErr w:type="gramEnd"/>
+      <w:r>
+        <w:t>(); -&gt; send request to http://ACCOUNT-SERVICE/account/balance -&gt; Feign Client -&gt; query service discovery -&gt; finds ACCOUNT-SERVICE is mapped to which address -&gt; sends request to that address</w:t>
+      </w:r>
+    </w:p>
+    <w:p>
+      <w:pPr>
+        <w:ind w:left="0" w:firstLine="0"/>
+      </w:pPr>
+    </w:p>
+    <w:p>
+      <w:pPr>
+        <w:ind w:left="0" w:firstLine="0"/>
+      </w:pPr>
+      <w:r>
+        <w:drawing>
+          <wp:inline distT="0" distB="0" distL="0" distR="0" wp14:anchorId="50A56ACE" wp14:editId="0AEE05FF">
+            <wp:extent cx="5943600" cy="2386965"/>
+            <wp:effectExtent l="0" t="0" r="0" b="0"/>
+            <wp:docPr id="1999489727" name="Picture 1"/>
+            <wp:cNvGraphicFramePr>
+              <a:graphicFrameLocks xmlns:a="http://schemas.openxmlformats.org/drawingml/2006/main" noChangeAspect="1"/>
+            </wp:cNvGraphicFramePr>
+            <a:graphic xmlns:a="http://schemas.openxmlformats.org/drawingml/2006/main">
+              <a:graphicData uri="http://schemas.openxmlformats.org/drawingml/2006/picture">
+                <pic:pic xmlns:pic="http://schemas.openxmlformats.org/drawingml/2006/picture">
+                  <pic:nvPicPr>
+                    <pic:cNvPr id="1999489727" name=""/>
+                    <pic:cNvPicPr/>
+                  </pic:nvPicPr>
+                  <pic:blipFill>
+                    <a:blip r:embed="rId65"/>
+                    <a:stretch>
+                      <a:fillRect/>
+                    </a:stretch>
+                  </pic:blipFill>
+                  <pic:spPr>
+                    <a:xfrm>
+                      <a:off x="0" y="0"/>
+                      <a:ext cx="5943600" cy="2386965"/>
+                    </a:xfrm>
+                    <a:prstGeom prst="rect">
+                      <a:avLst/>
+                    </a:prstGeom>
+                  </pic:spPr>
+                </pic:pic>
+              </a:graphicData>
+            </a:graphic>
+          </wp:inline>
+        </w:drawing>
+      </w:r>
+    </w:p>
+    <w:p>
+      <w:pPr>
+        <w:ind w:left="0" w:firstLine="0"/>
+      </w:pPr>
+    </w:p>
+    <w:p>
+      <w:pPr>
+        <w:ind w:left="0" w:firstLine="0"/>
+      </w:pPr>
+      <w:r>
+        <w:rPr>
+          <w:highlight w:val="yellow"/>
+        </w:rPr>
+        <w:t>AccountClient.java</w:t>
+      </w:r>
+    </w:p>
+    <w:p>
+      <w:pPr>
+        <w:ind w:left="0" w:firstLine="0"/>
+      </w:pPr>
+      <w:r>
+        <w:lastRenderedPageBreak/>
+        <w:drawing>
+          <wp:inline distT="0" distB="0" distL="0" distR="0" wp14:anchorId="38ACD412" wp14:editId="73F5FB58">
+            <wp:extent cx="5943600" cy="3510280"/>
+            <wp:effectExtent l="0" t="0" r="0" b="0"/>
+            <wp:docPr id="1474650947" name="Picture 1"/>
+            <wp:cNvGraphicFramePr>
+              <a:graphicFrameLocks xmlns:a="http://schemas.openxmlformats.org/drawingml/2006/main" noChangeAspect="1"/>
+            </wp:cNvGraphicFramePr>
+            <a:graphic xmlns:a="http://schemas.openxmlformats.org/drawingml/2006/main">
+              <a:graphicData uri="http://schemas.openxmlformats.org/drawingml/2006/picture">
+                <pic:pic xmlns:pic="http://schemas.openxmlformats.org/drawingml/2006/picture">
+                  <pic:nvPicPr>
+                    <pic:cNvPr id="1474650947" name=""/>
+                    <pic:cNvPicPr/>
+                  </pic:nvPicPr>
+                  <pic:blipFill>
+                    <a:blip r:embed="rId66"/>
+                    <a:stretch>
+                      <a:fillRect/>
+                    </a:stretch>
+                  </pic:blipFill>
+                  <pic:spPr>
+                    <a:xfrm>
+                      <a:off x="0" y="0"/>
+                      <a:ext cx="5943600" cy="3510280"/>
+                    </a:xfrm>
+                    <a:prstGeom prst="rect">
+                      <a:avLst/>
+                    </a:prstGeom>
+                  </pic:spPr>
+                </pic:pic>
+              </a:graphicData>
+            </a:graphic>
+          </wp:inline>
+        </w:drawing>
+      </w:r>
+    </w:p>
+    <w:p>
+      <w:pPr>
+        <w:ind w:left="0" w:firstLine="0"/>
+      </w:pPr>
+      <w:r>
+        <w:rPr>
+          <w:highlight w:val="yellow"/>
+        </w:rPr>
+        <w:t>Add @EnableFeignClients to the application</w:t>
+      </w:r>
+    </w:p>
+    <w:p>
+      <w:pPr>
+        <w:ind w:left="0" w:firstLine="0"/>
+      </w:pPr>
+      <w:r>
+        <w:drawing>
+          <wp:inline distT="0" distB="0" distL="0" distR="0" wp14:anchorId="35E2E2B9" wp14:editId="3DCD6882">
+            <wp:extent cx="5943600" cy="3335020"/>
+            <wp:effectExtent l="0" t="0" r="0" b="0"/>
+            <wp:docPr id="1476199147" name="Picture 1"/>
+            <wp:cNvGraphicFramePr>
+              <a:graphicFrameLocks xmlns:a="http://schemas.openxmlformats.org/drawingml/2006/main" noChangeAspect="1"/>
+            </wp:cNvGraphicFramePr>
+            <a:graphic xmlns:a="http://schemas.openxmlformats.org/drawingml/2006/main">
+              <a:graphicData uri="http://schemas.openxmlformats.org/drawingml/2006/picture">
+                <pic:pic xmlns:pic="http://schemas.openxmlformats.org/drawingml/2006/picture">
+                  <pic:nvPicPr>
+                    <pic:cNvPr id="1476199147" name=""/>
+                    <pic:cNvPicPr/>
+                  </pic:nvPicPr>
+                  <pic:blipFill>
+                    <a:blip r:embed="rId67"/>
+                    <a:stretch>
+                      <a:fillRect/>
+                    </a:stretch>
+                  </pic:blipFill>
+                  <pic:spPr>
+                    <a:xfrm>
+                      <a:off x="0" y="0"/>
+                      <a:ext cx="5943600" cy="3335020"/>
+                    </a:xfrm>
+                    <a:prstGeom prst="rect">
+                      <a:avLst/>
+                    </a:prstGeom>
+                  </pic:spPr>
+                </pic:pic>
+              </a:graphicData>
+            </a:graphic>
+          </wp:inline>
+        </w:drawing>
+      </w:r>
+    </w:p>
+    <w:p>
+      <w:pPr>
+        <w:ind w:left="0" w:firstLine="0"/>
+      </w:pPr>
+      <w:r>
+        <w:rPr>
+          <w:highlight w:val="yellow"/>
+        </w:rPr>
+        <w:t>UPIController.java</w:t>
+      </w:r>
+    </w:p>
+    <w:p>
+      <w:pPr>
+        <w:ind w:left="0" w:firstLine="0"/>
+      </w:pPr>
+      <w:r>
+        <w:lastRenderedPageBreak/>
+        <w:drawing>
+          <wp:inline distT="0" distB="0" distL="0" distR="0" wp14:anchorId="3FA2EE4A" wp14:editId="1B0B2CF6">
+            <wp:extent cx="5943600" cy="3196590"/>
+            <wp:effectExtent l="0" t="0" r="0" b="3810"/>
+            <wp:docPr id="1190180069" name="Picture 1"/>
+            <wp:cNvGraphicFramePr>
+              <a:graphicFrameLocks xmlns:a="http://schemas.openxmlformats.org/drawingml/2006/main" noChangeAspect="1"/>
+            </wp:cNvGraphicFramePr>
+            <a:graphic xmlns:a="http://schemas.openxmlformats.org/drawingml/2006/main">
+              <a:graphicData uri="http://schemas.openxmlformats.org/drawingml/2006/picture">
+                <pic:pic xmlns:pic="http://schemas.openxmlformats.org/drawingml/2006/picture">
+                  <pic:nvPicPr>
+                    <pic:cNvPr id="1190180069" name=""/>
+                    <pic:cNvPicPr/>
+                  </pic:nvPicPr>
+                  <pic:blipFill>
+                    <a:blip r:embed="rId68"/>
+                    <a:stretch>
+                      <a:fillRect/>
+                    </a:stretch>
+                  </pic:blipFill>
+                  <pic:spPr>
+                    <a:xfrm>
+                      <a:off x="0" y="0"/>
+                      <a:ext cx="5943600" cy="3196590"/>
+                    </a:xfrm>
+                    <a:prstGeom prst="rect">
+                      <a:avLst/>
+                    </a:prstGeom>
+                  </pic:spPr>
+                </pic:pic>
+              </a:graphicData>
+            </a:graphic>
+          </wp:inline>
+        </w:drawing>
+      </w:r>
+    </w:p>
+    <w:p>
+      <w:pPr>
+        <w:ind w:left="0" w:firstLine="0"/>
+      </w:pPr>
+    </w:p>
+    <w:p>
+      <w:pPr>
+        <w:ind w:left="0" w:firstLine="0"/>
+      </w:pPr>
+      <w:r>
+        <w:t>Create another microservice that would send the request to the same account service, but the balance must be modified to extra 1000 RS, so that when you send request to this new microservice it sends request to the account service and whatever the balance it gives to that add 1000 and display</w:t>
+      </w:r>
+      <w:r>
+        <w:br/>
+        <w:t>Ex: if account service balance is 5000, then the new microservice shows balance as 6000</w:t>
+      </w:r>
+    </w:p>
+    <w:p>
+      <w:pPr>
+        <w:ind w:left="0" w:firstLine="0"/>
+      </w:pPr>
+    </w:p>
+    <w:p>
+      <w:pPr>
+        <w:ind w:left="0" w:firstLine="0"/>
+      </w:pPr>
+      <w:r>
+        <w:rPr>
+          <w:highlight w:val="yellow"/>
+        </w:rPr>
+        <w:t>Spring Cloud Configuration</w:t>
+      </w:r>
+    </w:p>
+    <w:p>
+      <w:pPr>
+        <w:ind w:left="0" w:firstLine="0"/>
+      </w:pPr>
+      <w:r>
+        <w:t>It is mainly used when multiple microservices wants to use same configurations, so that you can maintain the configuration in a centralized GIT repository and all the microservices can pull those configurations, if you change the centralized configuration all the microservices get the changes</w:t>
+      </w:r>
+    </w:p>
+    <w:p>
+      <w:pPr>
+        <w:ind w:left="0" w:firstLine="0"/>
+      </w:pPr>
+      <w:r>
+        <w:t>Configuration Server: It is a program that connects to the common configuration repository and microservices connects to the configuration server</w:t>
+      </w:r>
+    </w:p>
+    <w:p>
+      <w:pPr>
+        <w:ind w:left="0" w:firstLine="0"/>
+      </w:pPr>
+    </w:p>
+    <w:p>
+      <w:pPr>
+        <w:ind w:left="0" w:firstLine="0"/>
+      </w:pPr>
+      <w:r>
+        <w:lastRenderedPageBreak/>
+        <w:drawing>
+          <wp:inline distT="0" distB="0" distL="0" distR="0" wp14:anchorId="114264E8" wp14:editId="49B2DFF2">
+            <wp:extent cx="5943600" cy="2945765"/>
+            <wp:effectExtent l="0" t="0" r="0" b="6985"/>
+            <wp:docPr id="1651092862" name="Picture 1"/>
+            <wp:cNvGraphicFramePr>
+              <a:graphicFrameLocks xmlns:a="http://schemas.openxmlformats.org/drawingml/2006/main" noChangeAspect="1"/>
+            </wp:cNvGraphicFramePr>
+            <a:graphic xmlns:a="http://schemas.openxmlformats.org/drawingml/2006/main">
+              <a:graphicData uri="http://schemas.openxmlformats.org/drawingml/2006/picture">
+                <pic:pic xmlns:pic="http://schemas.openxmlformats.org/drawingml/2006/picture">
+                  <pic:nvPicPr>
+                    <pic:cNvPr id="1651092862" name=""/>
+                    <pic:cNvPicPr/>
+                  </pic:nvPicPr>
+                  <pic:blipFill>
+                    <a:blip r:embed="rId69"/>
+                    <a:stretch>
+                      <a:fillRect/>
+                    </a:stretch>
+                  </pic:blipFill>
+                  <pic:spPr>
+                    <a:xfrm>
+                      <a:off x="0" y="0"/>
+                      <a:ext cx="5943600" cy="2945765"/>
+                    </a:xfrm>
+                    <a:prstGeom prst="rect">
+                      <a:avLst/>
+                    </a:prstGeom>
+                  </pic:spPr>
+                </pic:pic>
+              </a:graphicData>
+            </a:graphic>
+          </wp:inline>
+        </w:drawing>
+      </w:r>
+    </w:p>
+    <w:p>
+      <w:pPr>
+        <w:ind w:left="0" w:firstLine="0"/>
+      </w:pPr>
+      <w:r>
+        <w:drawing>
+          <wp:inline distT="0" distB="0" distL="0" distR="0" wp14:anchorId="61A9FF63" wp14:editId="5F169154">
+            <wp:extent cx="5943600" cy="2746375"/>
+            <wp:effectExtent l="0" t="0" r="0" b="0"/>
+            <wp:docPr id="337096965" name="Picture 1"/>
+            <wp:cNvGraphicFramePr>
+              <a:graphicFrameLocks xmlns:a="http://schemas.openxmlformats.org/drawingml/2006/main" noChangeAspect="1"/>
+            </wp:cNvGraphicFramePr>
+            <a:graphic xmlns:a="http://schemas.openxmlformats.org/drawingml/2006/main">
+              <a:graphicData uri="http://schemas.openxmlformats.org/drawingml/2006/picture">
+                <pic:pic xmlns:pic="http://schemas.openxmlformats.org/drawingml/2006/picture">
+                  <pic:nvPicPr>
+                    <pic:cNvPr id="337096965" name=""/>
+                    <pic:cNvPicPr/>
+                  </pic:nvPicPr>
+                  <pic:blipFill>
+                    <a:blip r:embed="rId70"/>
+                    <a:stretch>
+                      <a:fillRect/>
+                    </a:stretch>
+                  </pic:blipFill>
+                  <pic:spPr>
+                    <a:xfrm>
+                      <a:off x="0" y="0"/>
+                      <a:ext cx="5943600" cy="2746375"/>
+                    </a:xfrm>
+                    <a:prstGeom prst="rect">
+                      <a:avLst/>
+                    </a:prstGeom>
+                  </pic:spPr>
+                </pic:pic>
+              </a:graphicData>
+            </a:graphic>
+          </wp:inline>
+        </w:drawing>
+      </w:r>
+    </w:p>
+    <w:p>
+      <w:pPr>
+        <w:ind w:left="0" w:firstLine="0"/>
+      </w:pPr>
+      <w:r>
+        <w:t xml:space="preserve">You can pull different property files for the same microservice using </w:t>
+      </w:r>
+      <w:proofErr w:type="spellStart"/>
+      <w:proofErr w:type="gramStart"/>
+      <w:r>
+        <w:t>profiles.active</w:t>
+      </w:r>
+      <w:proofErr w:type="spellEnd"/>
+      <w:proofErr w:type="gramEnd"/>
+      <w:r>
+        <w:t xml:space="preserve"> so that no need to keep these properties in local environment.</w:t>
+      </w:r>
+    </w:p>
+    <w:p>
+      <w:pPr>
+        <w:ind w:left="0" w:firstLine="0"/>
+      </w:pPr>
+    </w:p>
+    <w:p>
+      <w:pPr>
+        <w:ind w:left="0" w:firstLine="0"/>
+      </w:pPr>
+    </w:p>
+    <w:p>
+      <w:pPr>
+        <w:ind w:left="0" w:firstLine="0"/>
+      </w:pPr>
+      <w:r>
+        <w:rPr>
+          <w:highlight w:val="yellow"/>
+        </w:rPr>
+        <w:lastRenderedPageBreak/>
+        <w:t>Configuration Server:</w:t>
+      </w:r>
+      <w:r>
+        <w:t xml:space="preserve"> @EnableConfigServer enables the application to connect to the git repository or </w:t>
+      </w:r>
+      <w:proofErr w:type="spellStart"/>
+      <w:r>
+        <w:t>aws</w:t>
+      </w:r>
+      <w:proofErr w:type="spellEnd"/>
+      <w:r>
+        <w:t xml:space="preserve"> or any cloud platform</w:t>
+      </w:r>
+      <w:r>
+        <w:t xml:space="preserve">, its </w:t>
+      </w:r>
+      <w:proofErr w:type="gramStart"/>
+      <w:r>
+        <w:t>application.properties</w:t>
+      </w:r>
+      <w:proofErr w:type="gramEnd"/>
+      <w:r>
+        <w:t xml:space="preserve"> will have the centralized configuration file location like git url or </w:t>
+      </w:r>
+      <w:proofErr w:type="spellStart"/>
+      <w:r>
+        <w:t>aws</w:t>
+      </w:r>
+      <w:proofErr w:type="spellEnd"/>
+      <w:r>
+        <w:t xml:space="preserve"> url or azure url.</w:t>
+      </w:r>
+    </w:p>
+    <w:p>
+      <w:pPr>
+        <w:ind w:left="0" w:firstLine="0"/>
+      </w:pPr>
+      <w:r>
+        <w:drawing>
+          <wp:inline distT="0" distB="0" distL="0" distR="0" wp14:anchorId="4909CDD4" wp14:editId="5910A93C">
+            <wp:extent cx="5943600" cy="3004820"/>
+            <wp:effectExtent l="0" t="0" r="0" b="5080"/>
+            <wp:docPr id="587146615" name="Picture 1"/>
+            <wp:cNvGraphicFramePr>
+              <a:graphicFrameLocks xmlns:a="http://schemas.openxmlformats.org/drawingml/2006/main" noChangeAspect="1"/>
+            </wp:cNvGraphicFramePr>
+            <a:graphic xmlns:a="http://schemas.openxmlformats.org/drawingml/2006/main">
+              <a:graphicData uri="http://schemas.openxmlformats.org/drawingml/2006/picture">
+                <pic:pic xmlns:pic="http://schemas.openxmlformats.org/drawingml/2006/picture">
+                  <pic:nvPicPr>
+                    <pic:cNvPr id="587146615" name=""/>
+                    <pic:cNvPicPr/>
+                  </pic:nvPicPr>
+                  <pic:blipFill>
+                    <a:blip r:embed="rId71"/>
+                    <a:stretch>
+                      <a:fillRect/>
+                    </a:stretch>
+                  </pic:blipFill>
+                  <pic:spPr>
+                    <a:xfrm>
+                      <a:off x="0" y="0"/>
+                      <a:ext cx="5943600" cy="3004820"/>
+                    </a:xfrm>
+                    <a:prstGeom prst="rect">
+                      <a:avLst/>
+                    </a:prstGeom>
+                  </pic:spPr>
+                </pic:pic>
+              </a:graphicData>
+            </a:graphic>
+          </wp:inline>
+        </w:drawing>
+      </w:r>
+    </w:p>
+    <w:p>
+      <w:pPr>
+        <w:ind w:left="0" w:firstLine="0"/>
+      </w:pPr>
+      <w:r>
+        <w:rPr>
+          <w:highlight w:val="yellow"/>
+        </w:rPr>
+        <w:t>Config Client</w:t>
+      </w:r>
+    </w:p>
+    <w:p>
+      <w:pPr>
+        <w:ind w:left="0" w:firstLine="0"/>
+      </w:pPr>
+      <w:r>
+        <w:drawing>
+          <wp:inline distT="0" distB="0" distL="0" distR="0" wp14:anchorId="52D5B250" wp14:editId="1DB1E615">
+            <wp:extent cx="5943600" cy="2357120"/>
+            <wp:effectExtent l="0" t="0" r="0" b="5080"/>
+            <wp:docPr id="128711931" name="Picture 1"/>
+            <wp:cNvGraphicFramePr>
+              <a:graphicFrameLocks xmlns:a="http://schemas.openxmlformats.org/drawingml/2006/main" noChangeAspect="1"/>
+            </wp:cNvGraphicFramePr>
+            <a:graphic xmlns:a="http://schemas.openxmlformats.org/drawingml/2006/main">
+              <a:graphicData uri="http://schemas.openxmlformats.org/drawingml/2006/picture">
+                <pic:pic xmlns:pic="http://schemas.openxmlformats.org/drawingml/2006/picture">
+                  <pic:nvPicPr>
+                    <pic:cNvPr id="128711931" name=""/>
+                    <pic:cNvPicPr/>
+                  </pic:nvPicPr>
+                  <pic:blipFill>
+                    <a:blip r:embed="rId72"/>
+                    <a:stretch>
+                      <a:fillRect/>
+                    </a:stretch>
+                  </pic:blipFill>
+                  <pic:spPr>
+                    <a:xfrm>
+                      <a:off x="0" y="0"/>
+                      <a:ext cx="5943600" cy="2357120"/>
+                    </a:xfrm>
+                    <a:prstGeom prst="rect">
+                      <a:avLst/>
+                    </a:prstGeom>
+                  </pic:spPr>
+                </pic:pic>
+              </a:graphicData>
+            </a:graphic>
+          </wp:inline>
+        </w:drawing>
+      </w:r>
+    </w:p>
+    <w:p>
+      <w:pPr>
+        <w:ind w:left="0" w:firstLine="0"/>
+      </w:pPr>
+      <w:r>
+        <w:lastRenderedPageBreak/>
+        <w:drawing>
+          <wp:inline distT="0" distB="0" distL="0" distR="0" wp14:anchorId="2032DE3F" wp14:editId="4CDF8EBA">
+            <wp:extent cx="5943600" cy="2661920"/>
+            <wp:effectExtent l="0" t="0" r="0" b="5080"/>
+            <wp:docPr id="922804854" name="Picture 1"/>
+            <wp:cNvGraphicFramePr>
+              <a:graphicFrameLocks xmlns:a="http://schemas.openxmlformats.org/drawingml/2006/main" noChangeAspect="1"/>
+            </wp:cNvGraphicFramePr>
+            <a:graphic xmlns:a="http://schemas.openxmlformats.org/drawingml/2006/main">
+              <a:graphicData uri="http://schemas.openxmlformats.org/drawingml/2006/picture">
+                <pic:pic xmlns:pic="http://schemas.openxmlformats.org/drawingml/2006/picture">
+                  <pic:nvPicPr>
+                    <pic:cNvPr id="922804854" name=""/>
+                    <pic:cNvPicPr/>
+                  </pic:nvPicPr>
+                  <pic:blipFill>
+                    <a:blip r:embed="rId73"/>
+                    <a:stretch>
+                      <a:fillRect/>
+                    </a:stretch>
+                  </pic:blipFill>
+                  <pic:spPr>
+                    <a:xfrm>
+                      <a:off x="0" y="0"/>
+                      <a:ext cx="5943600" cy="2661920"/>
+                    </a:xfrm>
+                    <a:prstGeom prst="rect">
+                      <a:avLst/>
+                    </a:prstGeom>
+                  </pic:spPr>
+                </pic:pic>
+              </a:graphicData>
+            </a:graphic>
+          </wp:inline>
+        </w:drawing>
+      </w:r>
+    </w:p>
+    <w:p>
+      <w:pPr>
+        <w:ind w:left="0" w:firstLine="0"/>
+      </w:pPr>
+      <w:r>
+        <w:rPr>
+          <w:highlight w:val="yellow"/>
+        </w:rPr>
+        <w:t>Things to run</w:t>
+      </w:r>
+    </w:p>
+    <w:p>
+      <w:pPr>
+        <w:pStyle w:val="ListParagraph"/>
+        <w:numPr>
+          <w:ilvl w:val="0"/>
+          <w:numId w:val="32"/>
+        </w:numPr>
+      </w:pPr>
+      <w:r>
+        <w:t>Service Discovery</w:t>
+      </w:r>
+    </w:p>
+    <w:p>
+      <w:pPr>
+        <w:pStyle w:val="ListParagraph"/>
+        <w:numPr>
+          <w:ilvl w:val="0"/>
+          <w:numId w:val="32"/>
+        </w:numPr>
+      </w:pPr>
+      <w:r>
+        <w:t>Configuration Server</w:t>
+      </w:r>
+    </w:p>
+    <w:p>
+      <w:pPr>
+        <w:pStyle w:val="ListParagraph"/>
+        <w:numPr>
+          <w:ilvl w:val="0"/>
+          <w:numId w:val="32"/>
+        </w:numPr>
+      </w:pPr>
+      <w:r>
+        <w:t>Configuration Client</w:t>
+      </w:r>
+    </w:p>
+    <w:p>
+      <w:pPr>
+        <w:ind w:left="0" w:firstLine="0"/>
+      </w:pPr>
+      <w:r>
+        <w:rPr>
+          <w:highlight w:val="yellow"/>
+        </w:rPr>
+        <w:t>Activity:</w:t>
+      </w:r>
+      <w:r>
+        <w:t xml:space="preserve"> Create DB properties in the GIT and in your project add spring data </w:t>
+      </w:r>
+      <w:proofErr w:type="spellStart"/>
+      <w:r>
+        <w:t>jpa</w:t>
+      </w:r>
+      <w:proofErr w:type="spellEnd"/>
+      <w:r>
+        <w:t xml:space="preserve"> and mysql library and test the DB connection</w:t>
+      </w:r>
+    </w:p>
     <w:sectPr>
       <w:pgSz w:w="12240" w:h="15840"/>
       <w:pgMar w:top="1440" w:right="1440" w:bottom="1440" w:left="1440" w:header="720" w:footer="720" w:gutter="0"/>
@@ -8441,6 +9921,95 @@
     </w:lvl>
   </w:abstractNum>
   <w:abstractNum w:abstractNumId="18" w15:restartNumberingAfterBreak="0">
+    <w:nsid w:val="5766271F"/>
+    <w:multiLevelType w:val="hybridMultilevel"/>
+    <w:tmpl w:val="6ABE5E62"/>
+    <w:lvl w:ilvl="0" w:tplc="0409000F">
+      <w:start w:val="1"/>
+      <w:numFmt w:val="decimal"/>
+      <w:lvlText w:val="%1."/>
+      <w:lvlJc w:val="left"/>
+      <w:pPr>
+        <w:ind w:left="720" w:hanging="360"/>
+      </w:pPr>
+      <w:rPr>
+        <w:rFonts w:hint="default"/>
+      </w:rPr>
+    </w:lvl>
+    <w:lvl w:ilvl="1" w:tplc="04090019" w:tentative="1">
+      <w:start w:val="1"/>
+      <w:numFmt w:val="lowerLetter"/>
+      <w:lvlText w:val="%2."/>
+      <w:lvlJc w:val="left"/>
+      <w:pPr>
+        <w:ind w:left="1440" w:hanging="360"/>
+      </w:pPr>
+    </w:lvl>
+    <w:lvl w:ilvl="2" w:tplc="0409001B" w:tentative="1">
+      <w:start w:val="1"/>
+      <w:numFmt w:val="lowerRoman"/>
+      <w:lvlText w:val="%3."/>
+      <w:lvlJc w:val="right"/>
+      <w:pPr>
+        <w:ind w:left="2160" w:hanging="180"/>
+      </w:pPr>
+    </w:lvl>
+    <w:lvl w:ilvl="3" w:tplc="0409000F" w:tentative="1">
+      <w:start w:val="1"/>
+      <w:numFmt w:val="decimal"/>
+      <w:lvlText w:val="%4."/>
+      <w:lvlJc w:val="left"/>
+      <w:pPr>
+        <w:ind w:left="2880" w:hanging="360"/>
+      </w:pPr>
+    </w:lvl>
+    <w:lvl w:ilvl="4" w:tplc="04090019" w:tentative="1">
+      <w:start w:val="1"/>
+      <w:numFmt w:val="lowerLetter"/>
+      <w:lvlText w:val="%5."/>
+      <w:lvlJc w:val="left"/>
+      <w:pPr>
+        <w:ind w:left="3600" w:hanging="360"/>
+      </w:pPr>
+    </w:lvl>
+    <w:lvl w:ilvl="5" w:tplc="0409001B" w:tentative="1">
+      <w:start w:val="1"/>
+      <w:numFmt w:val="lowerRoman"/>
+      <w:lvlText w:val="%6."/>
+      <w:lvlJc w:val="right"/>
+      <w:pPr>
+        <w:ind w:left="4320" w:hanging="180"/>
+      </w:pPr>
+    </w:lvl>
+    <w:lvl w:ilvl="6" w:tplc="0409000F" w:tentative="1">
+      <w:start w:val="1"/>
+      <w:numFmt w:val="decimal"/>
+      <w:lvlText w:val="%7."/>
+      <w:lvlJc w:val="left"/>
+      <w:pPr>
+        <w:ind w:left="5040" w:hanging="360"/>
+      </w:pPr>
+    </w:lvl>
+    <w:lvl w:ilvl="7" w:tplc="04090019" w:tentative="1">
+      <w:start w:val="1"/>
+      <w:numFmt w:val="lowerLetter"/>
+      <w:lvlText w:val="%8."/>
+      <w:lvlJc w:val="left"/>
+      <w:pPr>
+        <w:ind w:left="5760" w:hanging="360"/>
+      </w:pPr>
+    </w:lvl>
+    <w:lvl w:ilvl="8" w:tplc="0409001B" w:tentative="1">
+      <w:start w:val="1"/>
+      <w:numFmt w:val="lowerRoman"/>
+      <w:lvlText w:val="%9."/>
+      <w:lvlJc w:val="right"/>
+      <w:pPr>
+        <w:ind w:left="6480" w:hanging="180"/>
+      </w:pPr>
+    </w:lvl>
+  </w:abstractNum>
+  <w:abstractNum w:abstractNumId="19" w15:restartNumberingAfterBreak="0">
     <w:nsid w:val="582E2516"/>
     <w:multiLevelType w:val="hybridMultilevel"/>
     <w:tmpl w:val="E55C935C"/>
@@ -8529,7 +10098,7 @@
       </w:pPr>
     </w:lvl>
   </w:abstractNum>
-  <w:abstractNum w:abstractNumId="19" w15:restartNumberingAfterBreak="0">
+  <w:abstractNum w:abstractNumId="20" w15:restartNumberingAfterBreak="0">
     <w:nsid w:val="58EC0FA2"/>
     <w:multiLevelType w:val="hybridMultilevel"/>
     <w:tmpl w:val="CE3EAE10"/>
@@ -8618,7 +10187,7 @@
       </w:pPr>
     </w:lvl>
   </w:abstractNum>
-  <w:abstractNum w:abstractNumId="20" w15:restartNumberingAfterBreak="0">
+  <w:abstractNum w:abstractNumId="21" w15:restartNumberingAfterBreak="0">
     <w:nsid w:val="5B3F3CEC"/>
     <w:multiLevelType w:val="hybridMultilevel"/>
     <w:tmpl w:val="71460F90"/>
@@ -8707,7 +10276,7 @@
       </w:pPr>
     </w:lvl>
   </w:abstractNum>
-  <w:abstractNum w:abstractNumId="21" w15:restartNumberingAfterBreak="0">
+  <w:abstractNum w:abstractNumId="22" w15:restartNumberingAfterBreak="0">
     <w:nsid w:val="5E176280"/>
     <w:multiLevelType w:val="hybridMultilevel"/>
     <w:tmpl w:val="A412E02A"/>
@@ -8796,7 +10365,7 @@
       </w:pPr>
     </w:lvl>
   </w:abstractNum>
-  <w:abstractNum w:abstractNumId="22" w15:restartNumberingAfterBreak="0">
+  <w:abstractNum w:abstractNumId="23" w15:restartNumberingAfterBreak="0">
     <w:nsid w:val="5ED30FF7"/>
     <w:multiLevelType w:val="hybridMultilevel"/>
     <w:tmpl w:val="B3AC66B8"/>
@@ -8885,7 +10454,7 @@
       </w:pPr>
     </w:lvl>
   </w:abstractNum>
-  <w:abstractNum w:abstractNumId="23" w15:restartNumberingAfterBreak="0">
+  <w:abstractNum w:abstractNumId="24" w15:restartNumberingAfterBreak="0">
     <w:nsid w:val="6561046C"/>
     <w:multiLevelType w:val="hybridMultilevel"/>
     <w:tmpl w:val="54BC4562"/>
@@ -8974,7 +10543,7 @@
       </w:pPr>
     </w:lvl>
   </w:abstractNum>
-  <w:abstractNum w:abstractNumId="24" w15:restartNumberingAfterBreak="0">
+  <w:abstractNum w:abstractNumId="25" w15:restartNumberingAfterBreak="0">
     <w:nsid w:val="664C2B59"/>
     <w:multiLevelType w:val="hybridMultilevel"/>
     <w:tmpl w:val="1CF0A4EA"/>
@@ -9063,7 +10632,7 @@
       </w:pPr>
     </w:lvl>
   </w:abstractNum>
-  <w:abstractNum w:abstractNumId="25" w15:restartNumberingAfterBreak="0">
+  <w:abstractNum w:abstractNumId="26" w15:restartNumberingAfterBreak="0">
     <w:nsid w:val="676E2B6B"/>
     <w:multiLevelType w:val="hybridMultilevel"/>
     <w:tmpl w:val="E7204440"/>
@@ -9176,7 +10745,7 @@
       </w:rPr>
     </w:lvl>
   </w:abstractNum>
-  <w:abstractNum w:abstractNumId="26" w15:restartNumberingAfterBreak="0">
+  <w:abstractNum w:abstractNumId="27" w15:restartNumberingAfterBreak="0">
     <w:nsid w:val="6F9628B0"/>
     <w:multiLevelType w:val="hybridMultilevel"/>
     <w:tmpl w:val="58B2F9FA"/>
@@ -9265,7 +10834,7 @@
       </w:pPr>
     </w:lvl>
   </w:abstractNum>
-  <w:abstractNum w:abstractNumId="27" w15:restartNumberingAfterBreak="0">
+  <w:abstractNum w:abstractNumId="28" w15:restartNumberingAfterBreak="0">
     <w:nsid w:val="78CF66F5"/>
     <w:multiLevelType w:val="hybridMultilevel"/>
     <w:tmpl w:val="FD460E22"/>
@@ -9354,7 +10923,7 @@
       </w:pPr>
     </w:lvl>
   </w:abstractNum>
-  <w:abstractNum w:abstractNumId="28" w15:restartNumberingAfterBreak="0">
+  <w:abstractNum w:abstractNumId="29" w15:restartNumberingAfterBreak="0">
     <w:nsid w:val="78FE7F30"/>
     <w:multiLevelType w:val="hybridMultilevel"/>
     <w:tmpl w:val="545CA6A2"/>
@@ -9443,7 +11012,7 @@
       </w:pPr>
     </w:lvl>
   </w:abstractNum>
-  <w:abstractNum w:abstractNumId="29" w15:restartNumberingAfterBreak="0">
+  <w:abstractNum w:abstractNumId="30" w15:restartNumberingAfterBreak="0">
     <w:nsid w:val="7C953AEA"/>
     <w:multiLevelType w:val="hybridMultilevel"/>
     <w:tmpl w:val="7CCC41C4"/>
@@ -9532,7 +11101,7 @@
       </w:pPr>
     </w:lvl>
   </w:abstractNum>
-  <w:abstractNum w:abstractNumId="30" w15:restartNumberingAfterBreak="0">
+  <w:abstractNum w:abstractNumId="31" w15:restartNumberingAfterBreak="0">
     <w:nsid w:val="7DB613C1"/>
     <w:multiLevelType w:val="hybridMultilevel"/>
     <w:tmpl w:val="CE10F88C"/>
@@ -9625,7 +11194,7 @@
     <w:abstractNumId w:val="2"/>
   </w:num>
   <w:num w:numId="2" w16cid:durableId="1596203068">
-    <w:abstractNumId w:val="19"/>
+    <w:abstractNumId w:val="20"/>
   </w:num>
   <w:num w:numId="3" w16cid:durableId="1960138834">
     <w:abstractNumId w:val="7"/>
@@ -9634,19 +11203,19 @@
     <w:abstractNumId w:val="11"/>
   </w:num>
   <w:num w:numId="5" w16cid:durableId="1785925703">
-    <w:abstractNumId w:val="26"/>
+    <w:abstractNumId w:val="27"/>
   </w:num>
   <w:num w:numId="6" w16cid:durableId="1729105484">
     <w:abstractNumId w:val="15"/>
   </w:num>
   <w:num w:numId="7" w16cid:durableId="34280185">
-    <w:abstractNumId w:val="27"/>
+    <w:abstractNumId w:val="28"/>
   </w:num>
   <w:num w:numId="8" w16cid:durableId="1777092839">
     <w:abstractNumId w:val="1"/>
   </w:num>
   <w:num w:numId="9" w16cid:durableId="758718524">
-    <w:abstractNumId w:val="30"/>
+    <w:abstractNumId w:val="31"/>
   </w:num>
   <w:num w:numId="10" w16cid:durableId="160897060">
     <w:abstractNumId w:val="6"/>
@@ -9655,7 +11224,7 @@
     <w:abstractNumId w:val="4"/>
   </w:num>
   <w:num w:numId="12" w16cid:durableId="1721898317">
-    <w:abstractNumId w:val="22"/>
+    <w:abstractNumId w:val="23"/>
   </w:num>
   <w:num w:numId="13" w16cid:durableId="120151737">
     <w:abstractNumId w:val="14"/>
@@ -9664,13 +11233,13 @@
     <w:abstractNumId w:val="8"/>
   </w:num>
   <w:num w:numId="15" w16cid:durableId="1268582426">
-    <w:abstractNumId w:val="18"/>
+    <w:abstractNumId w:val="19"/>
   </w:num>
   <w:num w:numId="16" w16cid:durableId="2088308342">
-    <w:abstractNumId w:val="25"/>
+    <w:abstractNumId w:val="26"/>
   </w:num>
   <w:num w:numId="17" w16cid:durableId="1731228637">
-    <w:abstractNumId w:val="23"/>
+    <w:abstractNumId w:val="24"/>
   </w:num>
   <w:num w:numId="18" w16cid:durableId="1541242673">
     <w:abstractNumId w:val="17"/>
@@ -9682,7 +11251,7 @@
     <w:abstractNumId w:val="13"/>
   </w:num>
   <w:num w:numId="21" w16cid:durableId="1911192305">
-    <w:abstractNumId w:val="20"/>
+    <w:abstractNumId w:val="21"/>
   </w:num>
   <w:num w:numId="22" w16cid:durableId="1167987115">
     <w:abstractNumId w:val="12"/>
@@ -9691,10 +11260,10 @@
     <w:abstractNumId w:val="9"/>
   </w:num>
   <w:num w:numId="24" w16cid:durableId="1099522345">
-    <w:abstractNumId w:val="28"/>
+    <w:abstractNumId w:val="29"/>
   </w:num>
   <w:num w:numId="25" w16cid:durableId="56437003">
-    <w:abstractNumId w:val="21"/>
+    <w:abstractNumId w:val="22"/>
   </w:num>
   <w:num w:numId="26" w16cid:durableId="1210337143">
     <w:abstractNumId w:val="5"/>
@@ -9703,7 +11272,7 @@
     <w:abstractNumId w:val="10"/>
   </w:num>
   <w:num w:numId="28" w16cid:durableId="2003309175">
-    <w:abstractNumId w:val="24"/>
+    <w:abstractNumId w:val="25"/>
   </w:num>
   <w:num w:numId="29" w16cid:durableId="654456774">
     <w:abstractNumId w:val="0"/>
@@ -9712,7 +11281,10 @@
     <w:abstractNumId w:val="3"/>
   </w:num>
   <w:num w:numId="31" w16cid:durableId="30812947">
-    <w:abstractNumId w:val="29"/>
+    <w:abstractNumId w:val="30"/>
+  </w:num>
+  <w:num w:numId="32" w16cid:durableId="1839729555">
+    <w:abstractNumId w:val="18"/>
   </w:num>
 </w:numbering>
 </file>
@@ -10656,6 +12228,29 @@
       </w:tblBorders>
     </w:tblPr>
   </w:style>
+  <w:style w:type="character" w:styleId="Hyperlink">
+    <w:name w:val="Hyperlink"/>
+    <w:basedOn w:val="DefaultParagraphFont"/>
+    <w:uiPriority w:val="99"/>
+    <w:unhideWhenUsed/>
+    <w:rsid w:val="0073469B"/>
+    <w:rPr>
+      <w:color w:val="0563C1" w:themeColor="hyperlink"/>
+      <w:u w:val="single"/>
+    </w:rPr>
+  </w:style>
+  <w:style w:type="character" w:styleId="UnresolvedMention">
+    <w:name w:val="Unresolved Mention"/>
+    <w:basedOn w:val="DefaultParagraphFont"/>
+    <w:uiPriority w:val="99"/>
+    <w:semiHidden/>
+    <w:unhideWhenUsed/>
+    <w:rsid w:val="0073469B"/>
+    <w:rPr>
+      <w:color w:val="605E5C"/>
+      <w:shd w:val="clear" w:color="auto" w:fill="E1DFDD"/>
+    </w:rPr>
+  </w:style>
 </w:styles>
 </file>
 

</xml_diff>

<commit_message>
react and spring microservices project
</commit_message>
<xml_diff>
--- a/Phase 3 Api Endpoints.docx
+++ b/Phase 3 Api Endpoints.docx
@@ -144,11 +144,9 @@
           <w:numId w:val="3"/>
         </w:numPr>
       </w:pPr>
-      <w:proofErr w:type="spellStart"/>
       <w:r>
         <w:t>assertEquals</w:t>
       </w:r>
-      <w:proofErr w:type="spellEnd"/>
     </w:p>
     <w:p>
       <w:pPr>
@@ -158,11 +156,9 @@
           <w:numId w:val="3"/>
         </w:numPr>
       </w:pPr>
-      <w:proofErr w:type="spellStart"/>
       <w:r>
         <w:t>assertArrayEquals</w:t>
       </w:r>
-      <w:proofErr w:type="spellEnd"/>
     </w:p>
     <w:p>
       <w:pPr>
@@ -172,11 +168,9 @@
           <w:numId w:val="3"/>
         </w:numPr>
       </w:pPr>
-      <w:proofErr w:type="spellStart"/>
       <w:r>
         <w:t>assertThrows</w:t>
       </w:r>
-      <w:proofErr w:type="spellEnd"/>
     </w:p>
     <w:p>
       <w:pPr>
@@ -210,13 +204,8 @@
         <w:ind w:left="0" w:firstLine="0"/>
       </w:pPr>
       <w:r>
-        <w:t xml:space="preserve">Framework is like a semi implemented application which provides all the common functionalities an application </w:t>
-      </w:r>
-      <w:proofErr w:type="gramStart"/>
-      <w:r>
-        <w:t>needs</w:t>
-      </w:r>
-      <w:proofErr w:type="gramEnd"/>
+        <w:t>Framework is like a semi implemented application which provides all the common functionalities an application needs</w:t>
+      </w:r>
     </w:p>
     <w:p>
       <w:pPr>
@@ -274,15 +263,7 @@
         <w:t>Spring Framework:</w:t>
       </w:r>
       <w:r>
-        <w:t xml:space="preserve"> It is an application framework helps you to develop various types of applications like desktop, web, enterprise, </w:t>
-      </w:r>
-      <w:proofErr w:type="gramStart"/>
-      <w:r>
-        <w:t>cloud based</w:t>
-      </w:r>
-      <w:proofErr w:type="gramEnd"/>
-      <w:r>
-        <w:t xml:space="preserve"> applications</w:t>
+        <w:t xml:space="preserve"> It is an application framework helps you to develop various types of applications like desktop, web, enterprise, cloud based applications</w:t>
       </w:r>
     </w:p>
     <w:p>
@@ -350,37 +331,18 @@
         <w:ind w:left="0" w:firstLine="0"/>
       </w:pPr>
       <w:r>
-        <w:t xml:space="preserve">EmployeeDAO </w:t>
-      </w:r>
-      <w:proofErr w:type="spellStart"/>
-      <w:r>
-        <w:t>employeeDao</w:t>
-      </w:r>
-      <w:proofErr w:type="spellEnd"/>
+        <w:t>EmployeeDAO employeeDao</w:t>
+      </w:r>
       <w:r>
         <w:t xml:space="preserve">; </w:t>
       </w:r>
       <w:r>
         <w:br/>
-      </w:r>
-      <w:proofErr w:type="gramStart"/>
-      <w:r>
-        <w:t>EmployeeService(</w:t>
-      </w:r>
-      <w:proofErr w:type="gramEnd"/>
-      <w:r>
-        <w:t>) {</w:t>
+        <w:t>EmployeeService() {</w:t>
       </w:r>
       <w:r>
         <w:br/>
-      </w:r>
-      <w:proofErr w:type="spellStart"/>
-      <w:r>
-        <w:t>employeeDao</w:t>
-      </w:r>
-      <w:proofErr w:type="spellEnd"/>
-      <w:r>
-        <w:t xml:space="preserve"> </w:t>
+        <w:t xml:space="preserve">employeeDao </w:t>
       </w:r>
       <w:r>
         <w:t>= new EmployeeDao</w:t>
@@ -416,26 +378,11 @@
         <w:ind w:left="0" w:firstLine="0"/>
       </w:pPr>
       <w:r>
-        <w:t xml:space="preserve">EmployeeDAO </w:t>
-      </w:r>
-      <w:proofErr w:type="spellStart"/>
-      <w:r>
-        <w:t>employeeDao</w:t>
-      </w:r>
-      <w:proofErr w:type="spellEnd"/>
-      <w:r>
-        <w:t>;</w:t>
+        <w:t>EmployeeDAO employeeDao;</w:t>
       </w:r>
       <w:r>
         <w:br/>
-      </w:r>
-      <w:proofErr w:type="gramStart"/>
-      <w:r>
-        <w:t>EmployeeService(</w:t>
-      </w:r>
-      <w:proofErr w:type="gramEnd"/>
-      <w:r>
-        <w:t>EmployeeDao dao) {</w:t>
+        <w:t>EmployeeService(EmployeeDao dao) {</w:t>
       </w:r>
       <w:r>
         <w:br/>
@@ -467,15 +414,7 @@
         <w:ind w:left="0" w:firstLine="0"/>
       </w:pPr>
       <w:r>
-        <w:t xml:space="preserve">It implements the design pattern to create objects and supply </w:t>
-      </w:r>
-      <w:proofErr w:type="gramStart"/>
-      <w:r>
-        <w:t>objects,</w:t>
-      </w:r>
-      <w:proofErr w:type="gramEnd"/>
-      <w:r>
-        <w:t xml:space="preserve"> IOC is like a container that will maintain the objects created by spring.</w:t>
+        <w:t>It implements the design pattern to create objects and supply objects, IOC is like a container that will maintain the objects created by spring.</w:t>
       </w:r>
     </w:p>
     <w:p>
@@ -610,15 +549,7 @@
         </w:numPr>
       </w:pPr>
       <w:r>
-        <w:t xml:space="preserve">Handlings </w:t>
-      </w:r>
-      <w:proofErr w:type="gramStart"/>
-      <w:r>
-        <w:t>requests</w:t>
-      </w:r>
-      <w:proofErr w:type="gramEnd"/>
-      <w:r>
-        <w:t xml:space="preserve"> and forwarding to the controllers</w:t>
+        <w:t>Handlings requests and forwarding to the controllers</w:t>
       </w:r>
     </w:p>
     <w:p>
@@ -661,13 +592,8 @@
       <w:pPr>
         <w:ind w:left="0" w:firstLine="0"/>
       </w:pPr>
-      <w:proofErr w:type="spellStart"/>
-      <w:r>
-        <w:t>DBUtil</w:t>
-      </w:r>
-      <w:proofErr w:type="spellEnd"/>
-      <w:r>
-        <w:t xml:space="preserve"> -&gt; spring creates </w:t>
+      <w:r>
+        <w:t xml:space="preserve">DBUtil -&gt; spring creates </w:t>
       </w:r>
       <w:r>
         <w:t xml:space="preserve">the object &amp; manages </w:t>
@@ -793,31 +719,15 @@
         <w:t>dbUtil</w:t>
       </w:r>
       <w:r>
-        <w:t>” class = “</w:t>
-      </w:r>
-      <w:proofErr w:type="gramStart"/>
-      <w:r>
-        <w:t>com.exampels</w:t>
-      </w:r>
-      <w:proofErr w:type="gramEnd"/>
-      <w:r>
-        <w:t>.DBUtil” /&gt;</w:t>
-      </w:r>
-    </w:p>
-    <w:p>
-      <w:pPr>
-        <w:ind w:left="0" w:firstLine="0"/>
-      </w:pPr>
-      <w:r>
-        <w:t>&lt;bean id = “datasource” class = “</w:t>
-      </w:r>
-      <w:proofErr w:type="gramStart"/>
-      <w:r>
-        <w:t>com.examples</w:t>
-      </w:r>
-      <w:proofErr w:type="gramEnd"/>
-      <w:r>
-        <w:t>.Datasource”&gt;</w:t>
+        <w:t>” class = “com.exampels.DBUtil” /&gt;</w:t>
+      </w:r>
+    </w:p>
+    <w:p>
+      <w:pPr>
+        <w:ind w:left="0" w:firstLine="0"/>
+      </w:pPr>
+      <w:r>
+        <w:t>&lt;bean id = “datasource” class = “com.examples.Datasource”&gt;</w:t>
       </w:r>
       <w:r>
         <w:br/>
@@ -1072,15 +982,7 @@
         <w:ind w:left="0" w:firstLine="0"/>
       </w:pPr>
       <w:r>
-        <w:t xml:space="preserve">ApplicationContext context = new </w:t>
-      </w:r>
-      <w:proofErr w:type="spellStart"/>
-      <w:r>
-        <w:t>ClassPathXMLApplicationContext</w:t>
-      </w:r>
-      <w:proofErr w:type="spellEnd"/>
-      <w:r>
-        <w:t>(“beans.xml”);</w:t>
+        <w:t>ApplicationContext context = new ClassPathXMLApplicationContext(“beans.xml”);</w:t>
       </w:r>
     </w:p>
     <w:p>
@@ -1422,15 +1324,7 @@
         <w:t>Constructor injection:</w:t>
       </w:r>
       <w:r>
-        <w:t xml:space="preserve"> Here the data is supplied through constructor argument, and in the </w:t>
-      </w:r>
-      <w:proofErr w:type="gramStart"/>
-      <w:r>
-        <w:t>XML</w:t>
-      </w:r>
-      <w:proofErr w:type="gramEnd"/>
-      <w:r>
-        <w:t xml:space="preserve"> you will use &lt;constructor-arg&gt; tag</w:t>
+        <w:t xml:space="preserve"> Here the data is supplied through constructor argument, and in the XML you will use &lt;constructor-arg&gt; tag</w:t>
       </w:r>
     </w:p>
     <w:p>
@@ -1587,20 +1481,7 @@
               <w:ind w:left="0" w:firstLine="0"/>
             </w:pPr>
             <w:r>
-              <w:t xml:space="preserve">DB Connection you must establish, using </w:t>
-            </w:r>
-            <w:proofErr w:type="spellStart"/>
-            <w:proofErr w:type="gramStart"/>
-            <w:r>
-              <w:t>getConnection</w:t>
-            </w:r>
-            <w:proofErr w:type="spellEnd"/>
-            <w:r>
-              <w:t>(</w:t>
-            </w:r>
-            <w:proofErr w:type="gramEnd"/>
-            <w:r>
-              <w:t>url, username, password)</w:t>
+              <w:t>DB Connection you must establish, using getConnection(url, username, password)</w:t>
             </w:r>
           </w:p>
         </w:tc>
@@ -1636,23 +1517,7 @@
               <w:ind w:left="0" w:firstLine="0"/>
             </w:pPr>
             <w:r>
-              <w:t xml:space="preserve">ex: </w:t>
-            </w:r>
-            <w:proofErr w:type="gramStart"/>
-            <w:r>
-              <w:t>result.getInt</w:t>
-            </w:r>
-            <w:proofErr w:type="gramEnd"/>
-            <w:r>
-              <w:t xml:space="preserve">(“ID”) or </w:t>
-            </w:r>
-            <w:proofErr w:type="gramStart"/>
-            <w:r>
-              <w:t>statement.setInt</w:t>
-            </w:r>
-            <w:proofErr w:type="gramEnd"/>
-            <w:r>
-              <w:t>(1, value)</w:t>
+              <w:t>ex: result.getInt(“ID”) or statement.setInt(1, value)</w:t>
             </w:r>
           </w:p>
         </w:tc>
@@ -1698,26 +1563,16 @@
       <w:pPr>
         <w:ind w:left="0" w:firstLine="0"/>
       </w:pPr>
-      <w:proofErr w:type="gramStart"/>
-      <w:r>
-        <w:t>update(</w:t>
-      </w:r>
-      <w:proofErr w:type="gramEnd"/>
-      <w:r>
-        <w:t>“query”, parameters): This method is used to execute insert, update &amp; delete queries</w:t>
-      </w:r>
-    </w:p>
-    <w:p>
-      <w:pPr>
-        <w:ind w:left="0" w:firstLine="0"/>
-      </w:pPr>
-      <w:proofErr w:type="gramStart"/>
-      <w:r>
-        <w:t>query(</w:t>
-      </w:r>
-      <w:proofErr w:type="gramEnd"/>
-      <w:r>
-        <w:t>“query”, RowMapper): This method is used to execute select query for multiple records, RowMapper converts ResultSet to Java object</w:t>
+      <w:r>
+        <w:t>update(“query”, parameters): This method is used to execute insert, update &amp; delete queries</w:t>
+      </w:r>
+    </w:p>
+    <w:p>
+      <w:pPr>
+        <w:ind w:left="0" w:firstLine="0"/>
+      </w:pPr>
+      <w:r>
+        <w:t>query(“query”, RowMapper): This method is used to execute select query for multiple records, RowMapper converts ResultSet to Java object</w:t>
       </w:r>
     </w:p>
     <w:p>
@@ -1758,15 +1613,7 @@
         <w:ind w:left="0" w:firstLine="0"/>
       </w:pPr>
       <w:r>
-        <w:t>&lt;bean id = “datasource” class = “</w:t>
-      </w:r>
-      <w:proofErr w:type="gramStart"/>
-      <w:r>
-        <w:t>org.springframework</w:t>
-      </w:r>
-      <w:proofErr w:type="gramEnd"/>
-      <w:r>
-        <w:t>…DriverManagerDataSource”&gt;</w:t>
+        <w:t>&lt;bean id = “datasource” class = “org.springframework…DriverManagerDataSource”&gt;</w:t>
       </w:r>
       <w:r>
         <w:br/>
@@ -1782,20 +1629,7 @@
         <w:ind w:left="0" w:firstLine="0"/>
       </w:pPr>
       <w:r>
-        <w:t>&lt;bean id = “template” class = “</w:t>
-      </w:r>
-      <w:proofErr w:type="spellStart"/>
-      <w:proofErr w:type="gramStart"/>
-      <w:r>
-        <w:t>org.spring</w:t>
-      </w:r>
-      <w:proofErr w:type="spellEnd"/>
-      <w:r>
-        <w:t>…..</w:t>
-      </w:r>
-      <w:proofErr w:type="gramEnd"/>
-      <w:r>
-        <w:t>JdbcTemplate”&gt;</w:t>
+        <w:t>&lt;bean id = “template” class = “org.spring…..JdbcTemplate”&gt;</w:t>
       </w:r>
       <w:r>
         <w:br/>
@@ -1811,20 +1645,7 @@
         <w:ind w:left="0" w:firstLine="0"/>
       </w:pPr>
       <w:r>
-        <w:t>&lt;bean id = “dao” class = “</w:t>
-      </w:r>
-      <w:proofErr w:type="spellStart"/>
-      <w:r>
-        <w:t>com.</w:t>
-      </w:r>
-      <w:proofErr w:type="gramStart"/>
-      <w:r>
-        <w:t>example.ProfileDaoImpl</w:t>
-      </w:r>
-      <w:proofErr w:type="spellEnd"/>
-      <w:proofErr w:type="gramEnd"/>
-      <w:r>
-        <w:t>”&gt;</w:t>
+        <w:t>&lt;bean id = “dao” class = “com.example.ProfileDaoImpl”&gt;</w:t>
       </w:r>
       <w:r>
         <w:br/>
@@ -2264,19 +2085,11 @@
       <w:r>
         <w:t xml:space="preserve">JdbcTemplate has a method called </w:t>
       </w:r>
-      <w:proofErr w:type="gramStart"/>
       <w:r>
         <w:rPr>
           <w:color w:val="EE0000"/>
         </w:rPr>
-        <w:t>query(</w:t>
-      </w:r>
-      <w:proofErr w:type="gramEnd"/>
-      <w:r>
-        <w:rPr>
-          <w:color w:val="EE0000"/>
-        </w:rPr>
-        <w:t xml:space="preserve">) </w:t>
+        <w:t xml:space="preserve">query() </w:t>
       </w:r>
       <w:r>
         <w:t>which accepts SQL query and takes a RowMapper object</w:t>
@@ -2293,15 +2106,7 @@
         <w:t>RowMapper:</w:t>
       </w:r>
       <w:r>
-        <w:t xml:space="preserve"> It is an interface with one abstract method, which accepts ResultSet and row number as a parameter, we must implement this interface and the object the implementation we need to pass to the </w:t>
-      </w:r>
-      <w:proofErr w:type="gramStart"/>
-      <w:r>
-        <w:t>query(</w:t>
-      </w:r>
-      <w:proofErr w:type="gramEnd"/>
-      <w:r>
-        <w:t>) method</w:t>
+        <w:t xml:space="preserve"> It is an interface with one abstract method, which accepts ResultSet and row number as a parameter, we must implement this interface and the object the implementation we need to pass to the query() method</w:t>
       </w:r>
       <w:r>
         <w:t>, the query method takes care of calling the method present in the RowMapper as per the number of records</w:t>
@@ -2671,15 +2476,7 @@
         <w:ind w:left="0" w:firstLine="0"/>
       </w:pPr>
       <w:r>
-        <w:t xml:space="preserve">In Spring </w:t>
-      </w:r>
-      <w:proofErr w:type="gramStart"/>
-      <w:r>
-        <w:t>Framework</w:t>
-      </w:r>
-      <w:proofErr w:type="gramEnd"/>
-      <w:r>
-        <w:t xml:space="preserve"> we can also configure the beans using annotations and autowire as well, spring provides various annotations that are derived from @Component which you can write on top of classes, spring automatically create object of such classes &amp; maintains them in the container, some of the annotations are</w:t>
+        <w:t>In Spring Framework we can also configure the beans using annotations and autowire as well, spring provides various annotations that are derived from @Component which you can write on top of classes, spring automatically create object of such classes &amp; maintains them in the container, some of the annotations are</w:t>
       </w:r>
     </w:p>
     <w:p>
@@ -2719,15 +2516,7 @@
         <w:ind w:left="0" w:firstLine="0"/>
       </w:pPr>
       <w:r>
-        <w:t>&lt;</w:t>
-      </w:r>
-      <w:proofErr w:type="gramStart"/>
-      <w:r>
-        <w:t>context:component</w:t>
-      </w:r>
-      <w:proofErr w:type="gramEnd"/>
-      <w:r>
-        <w:t>-scan base-package=”com” /&gt;</w:t>
+        <w:t>&lt;context:component-scan base-package=”com” /&gt;</w:t>
       </w:r>
     </w:p>
     <w:p>
@@ -2939,21 +2728,7 @@
         <w:rPr>
           <w:highlight w:val="yellow"/>
         </w:rPr>
-        <w:t xml:space="preserve">Front Controller does </w:t>
-      </w:r>
-      <w:proofErr w:type="gramStart"/>
-      <w:r>
-        <w:rPr>
-          <w:highlight w:val="yellow"/>
-        </w:rPr>
-        <w:t>following</w:t>
-      </w:r>
-      <w:proofErr w:type="gramEnd"/>
-      <w:r>
-        <w:rPr>
-          <w:highlight w:val="yellow"/>
-        </w:rPr>
-        <w:t xml:space="preserve"> tasks</w:t>
+        <w:t>Front Controller does following tasks</w:t>
       </w:r>
     </w:p>
     <w:p>
@@ -3115,13 +2890,8 @@
         </w:numPr>
       </w:pPr>
       <w:r>
-        <w:t>spring-</w:t>
-      </w:r>
-      <w:proofErr w:type="spellStart"/>
-      <w:r>
-        <w:t>webmvc</w:t>
-      </w:r>
-      <w:proofErr w:type="spellEnd"/>
+        <w:t>spring-webmvc</w:t>
+      </w:r>
     </w:p>
     <w:p>
       <w:pPr>
@@ -3424,27 +3194,11 @@
       </w:r>
       <w:r>
         <w:br/>
-        <w:t xml:space="preserve">  @</w:t>
-      </w:r>
-      <w:proofErr w:type="gramStart"/>
-      <w:r>
-        <w:t>RequestMapping(</w:t>
-      </w:r>
-      <w:proofErr w:type="gramEnd"/>
-      <w:r>
-        <w:t>path = “/test”, method = RequestMethod.GET)</w:t>
+        <w:t xml:space="preserve">  @RequestMapping(path = “/test”, method = RequestMethod.GET)</w:t>
       </w:r>
       <w:r>
         <w:br/>
-        <w:t xml:space="preserve">  public ModelAndView </w:t>
-      </w:r>
-      <w:proofErr w:type="gramStart"/>
-      <w:r>
-        <w:t>hello(</w:t>
-      </w:r>
-      <w:proofErr w:type="gramEnd"/>
-      <w:r>
-        <w:t xml:space="preserve">) { </w:t>
+        <w:t xml:space="preserve">  public ModelAndView hello() { </w:t>
       </w:r>
       <w:r>
         <w:br/>
@@ -3452,21 +3206,8 @@
       </w:r>
       <w:r>
         <w:br/>
-        <w:t xml:space="preserve">        ModelAndView </w:t>
-      </w:r>
-      <w:proofErr w:type="spellStart"/>
-      <w:r>
-        <w:t>mav</w:t>
-      </w:r>
-      <w:proofErr w:type="spellEnd"/>
-      <w:r>
-        <w:t xml:space="preserve"> = new </w:t>
-      </w:r>
-      <w:proofErr w:type="gramStart"/>
-      <w:r>
-        <w:t>ModelAndView(</w:t>
-      </w:r>
-      <w:proofErr w:type="gramEnd"/>
+        <w:t xml:space="preserve">        ModelAndView mav = new ModelAndView(</w:t>
+      </w:r>
       <w:r>
         <w:t xml:space="preserve">“display”, “obj”, </w:t>
       </w:r>
@@ -3478,15 +3219,7 @@
       </w:r>
       <w:r>
         <w:br/>
-        <w:t xml:space="preserve">        return </w:t>
-      </w:r>
-      <w:proofErr w:type="spellStart"/>
-      <w:r>
-        <w:t>mav</w:t>
-      </w:r>
-      <w:proofErr w:type="spellEnd"/>
-      <w:r>
-        <w:t>;</w:t>
+        <w:t xml:space="preserve">        return mav;</w:t>
       </w:r>
       <w:r>
         <w:br/>
@@ -3505,13 +3238,8 @@
         <w:t xml:space="preserve">Front Controller -&gt; View Resolver </w:t>
       </w:r>
       <w:r>
-        <w:t>-&gt; WEB-INF/pages/</w:t>
-      </w:r>
-      <w:proofErr w:type="spellStart"/>
-      <w:r>
-        <w:t>display.jsp</w:t>
-      </w:r>
-      <w:proofErr w:type="spellEnd"/>
+        <w:t>-&gt; WEB-INF/pages/display.jsp</w:t>
+      </w:r>
     </w:p>
     <w:p>
       <w:pPr>
@@ -3764,14 +3492,12 @@
       <w:pPr>
         <w:ind w:left="0" w:firstLine="0"/>
       </w:pPr>
-      <w:proofErr w:type="spellStart"/>
       <w:r>
         <w:rPr>
           <w:highlight w:val="yellow"/>
         </w:rPr>
         <w:t>display.jsp</w:t>
       </w:r>
-      <w:proofErr w:type="spellEnd"/>
     </w:p>
     <w:p>
       <w:pPr>
@@ -5049,11 +4775,9 @@
       <w:r>
         <w:t xml:space="preserve">Send a PUT request with phone number and profileId in the URL, read </w:t>
       </w:r>
-      <w:proofErr w:type="gramStart"/>
       <w:r>
         <w:t>those value</w:t>
       </w:r>
-      <w:proofErr w:type="gramEnd"/>
       <w:r>
         <w:t xml:space="preserve"> in the webservice and return </w:t>
       </w:r>
@@ -5181,15 +4905,7 @@
         </w:numPr>
       </w:pPr>
       <w:r>
-        <w:t>JpaRepository&lt;</w:t>
-      </w:r>
-      <w:proofErr w:type="gramStart"/>
-      <w:r>
-        <w:t>T,ID</w:t>
-      </w:r>
-      <w:proofErr w:type="gramEnd"/>
-      <w:r>
-        <w:t>&gt; extends CrudRepository&lt;T, ID&gt;</w:t>
+        <w:t>JpaRepository&lt;T,ID&gt; extends CrudRepository&lt;T, ID&gt;</w:t>
       </w:r>
     </w:p>
     <w:p>
@@ -5260,39 +4976,7 @@
         <w:ind w:left="360" w:firstLine="0"/>
       </w:pPr>
       <w:r>
-        <w:t xml:space="preserve">CrudRepository&lt;T, ID&gt;: it provides generic methods to perform CRUD operations like save(T), </w:t>
-      </w:r>
-      <w:proofErr w:type="gramStart"/>
-      <w:r>
-        <w:t>deleteById(</w:t>
-      </w:r>
-      <w:proofErr w:type="gramEnd"/>
-      <w:r>
-        <w:t xml:space="preserve">ID), </w:t>
-      </w:r>
-      <w:proofErr w:type="gramStart"/>
-      <w:r>
-        <w:t>findById(</w:t>
-      </w:r>
-      <w:proofErr w:type="gramEnd"/>
-      <w:r>
-        <w:t xml:space="preserve">ID), </w:t>
-      </w:r>
-      <w:proofErr w:type="gramStart"/>
-      <w:r>
-        <w:t>findAll(</w:t>
-      </w:r>
-      <w:proofErr w:type="gramEnd"/>
-      <w:r>
-        <w:t xml:space="preserve">), </w:t>
-      </w:r>
-      <w:proofErr w:type="gramStart"/>
-      <w:r>
-        <w:t>count(</w:t>
-      </w:r>
-      <w:proofErr w:type="gramEnd"/>
-      <w:r>
-        <w:t>)</w:t>
+        <w:t>CrudRepository&lt;T, ID&gt;: it provides generic methods to perform CRUD operations like save(T), deleteById(ID), findById(ID), findAll(), count()</w:t>
       </w:r>
     </w:p>
     <w:p>
@@ -5397,14 +5081,12 @@
       <w:r>
         <w:t xml:space="preserve">Spring Data JPA looks for </w:t>
       </w:r>
-      <w:proofErr w:type="gramStart"/>
       <w:r>
         <w:rPr>
           <w:highlight w:val="yellow"/>
         </w:rPr>
         <w:t>application.properties</w:t>
       </w:r>
-      <w:proofErr w:type="gramEnd"/>
       <w:r>
         <w:t xml:space="preserve"> for database information like </w:t>
       </w:r>
@@ -5549,23 +5231,7 @@
         </w:numPr>
       </w:pPr>
       <w:r>
-        <w:t xml:space="preserve">public T </w:t>
-      </w:r>
-      <w:proofErr w:type="gramStart"/>
-      <w:r>
-        <w:t>save(</w:t>
-      </w:r>
-      <w:proofErr w:type="gramEnd"/>
-      <w:r>
-        <w:t xml:space="preserve">T t): Here </w:t>
-      </w:r>
-      <w:proofErr w:type="spellStart"/>
-      <w:r>
-        <w:t>T</w:t>
-      </w:r>
-      <w:proofErr w:type="spellEnd"/>
-      <w:r>
-        <w:t xml:space="preserve"> is an entity class</w:t>
+        <w:t>public T save(T t): Here T is an entity class</w:t>
       </w:r>
     </w:p>
     <w:p>
@@ -5578,15 +5244,7 @@
       </w:pPr>
       <w:r>
         <w:lastRenderedPageBreak/>
-        <w:t xml:space="preserve">public Optional&lt;T&gt; </w:t>
-      </w:r>
-      <w:proofErr w:type="gramStart"/>
-      <w:r>
-        <w:t>findById(</w:t>
-      </w:r>
-      <w:proofErr w:type="gramEnd"/>
-      <w:r>
-        <w:t>ID id): Here Optional is an object that either stores entity or null</w:t>
+        <w:t>public Optional&lt;T&gt; findById(ID id): Here Optional is an object that either stores entity or null</w:t>
       </w:r>
     </w:p>
     <w:p>
@@ -5598,15 +5256,7 @@
         </w:numPr>
       </w:pPr>
       <w:r>
-        <w:t xml:space="preserve">public List&lt;T&gt; </w:t>
-      </w:r>
-      <w:proofErr w:type="gramStart"/>
-      <w:r>
-        <w:t>findAll(</w:t>
-      </w:r>
-      <w:proofErr w:type="gramEnd"/>
-      <w:r>
-        <w:t xml:space="preserve">): Here findAll returns all the entities </w:t>
+        <w:t xml:space="preserve">public List&lt;T&gt; findAll(): Here findAll returns all the entities </w:t>
       </w:r>
     </w:p>
     <w:p>
@@ -5618,15 +5268,7 @@
         </w:numPr>
       </w:pPr>
       <w:r>
-        <w:t xml:space="preserve">public void </w:t>
-      </w:r>
-      <w:proofErr w:type="gramStart"/>
-      <w:r>
-        <w:t>deleteById(</w:t>
-      </w:r>
-      <w:proofErr w:type="gramEnd"/>
-      <w:r>
-        <w:t>ID id): Here ID is a primary key value</w:t>
+        <w:t>public void deleteById(ID id): Here ID is a primary key value</w:t>
       </w:r>
     </w:p>
     <w:p>
@@ -5669,13 +5311,8 @@
         </w:numPr>
       </w:pPr>
       <w:r>
-        <w:t xml:space="preserve">Use datasource information in </w:t>
-      </w:r>
-      <w:proofErr w:type="gramStart"/>
-      <w:r>
-        <w:t>application.properties</w:t>
-      </w:r>
-      <w:proofErr w:type="gramEnd"/>
+        <w:t>Use datasource information in application.properties</w:t>
+      </w:r>
     </w:p>
     <w:p>
       <w:pPr>
@@ -5836,14 +5473,12 @@
       <w:pPr>
         <w:ind w:left="0" w:firstLine="0"/>
       </w:pPr>
-      <w:proofErr w:type="gramStart"/>
       <w:r>
         <w:rPr>
           <w:highlight w:val="yellow"/>
         </w:rPr>
         <w:t>application.properties</w:t>
       </w:r>
-      <w:proofErr w:type="gramEnd"/>
     </w:p>
     <w:p>
       <w:pPr>
@@ -6073,15 +5708,7 @@
         <w:ind w:left="0" w:firstLine="0"/>
       </w:pPr>
       <w:r>
-        <w:t xml:space="preserve">Right </w:t>
-      </w:r>
-      <w:proofErr w:type="gramStart"/>
-      <w:r>
-        <w:t>now</w:t>
-      </w:r>
-      <w:proofErr w:type="gramEnd"/>
-      <w:r>
-        <w:t xml:space="preserve"> we will keep only three operations and later we can implement update &amp; delete, now in the webservice we must create controllers to invoke create and read profiles, but we will keep same URL but different HTTP methods.</w:t>
+        <w:t>Right now we will keep only three operations and later we can implement update &amp; delete, now in the webservice we must create controllers to invoke create and read profiles, but we will keep same URL but different HTTP methods.</w:t>
       </w:r>
     </w:p>
     <w:p>
@@ -6116,42 +5743,11 @@
         <w:ind w:left="0" w:firstLine="0"/>
       </w:pPr>
       <w:r>
-        <w:t xml:space="preserve">Profile </w:t>
-      </w:r>
-      <w:proofErr w:type="spellStart"/>
-      <w:r>
-        <w:t>profile</w:t>
-      </w:r>
-      <w:proofErr w:type="spellEnd"/>
-      <w:r>
-        <w:t xml:space="preserve"> = </w:t>
-      </w:r>
-      <w:proofErr w:type="gramStart"/>
-      <w:r>
-        <w:t>findProfile(</w:t>
-      </w:r>
-      <w:proofErr w:type="gramEnd"/>
-      <w:r>
-        <w:t>100);</w:t>
+        <w:t>Profile profile = findProfile(100);</w:t>
       </w:r>
       <w:r>
         <w:br/>
-      </w:r>
-      <w:proofErr w:type="gramStart"/>
-      <w:r>
-        <w:t>if(profile !</w:t>
-      </w:r>
-      <w:proofErr w:type="gramEnd"/>
-      <w:r>
-        <w:t xml:space="preserve">= null) </w:t>
-      </w:r>
-      <w:proofErr w:type="gramStart"/>
-      <w:r>
-        <w:t>profile.setPhone</w:t>
-      </w:r>
-      <w:proofErr w:type="gramEnd"/>
-      <w:r>
-        <w:t>(93892323); // this automatically saves changes to the DB</w:t>
+        <w:t>if(profile != null) profile.setPhone(93892323); // this automatically saves changes to the DB</w:t>
       </w:r>
     </w:p>
     <w:p>
@@ -6160,30 +5756,15 @@
       </w:pPr>
       <w:r>
         <w:lastRenderedPageBreak/>
-        <w:t xml:space="preserve">For Delete you can use </w:t>
-      </w:r>
-      <w:proofErr w:type="gramStart"/>
-      <w:r>
-        <w:t>deleteById(</w:t>
-      </w:r>
-      <w:proofErr w:type="gramEnd"/>
-      <w:r>
-        <w:t>ID id) method of JpaRepository</w:t>
-      </w:r>
-    </w:p>
-    <w:p>
-      <w:pPr>
-        <w:ind w:left="0" w:firstLine="0"/>
-      </w:pPr>
-      <w:proofErr w:type="spellStart"/>
-      <w:proofErr w:type="gramStart"/>
-      <w:r>
-        <w:t>dao.deleteById</w:t>
-      </w:r>
-      <w:proofErr w:type="spellEnd"/>
-      <w:proofErr w:type="gramEnd"/>
-      <w:r>
-        <w:t>(100);</w:t>
+        <w:t>For Delete you can use deleteById(ID id) method of JpaRepository</w:t>
+      </w:r>
+    </w:p>
+    <w:p>
+      <w:pPr>
+        <w:ind w:left="0" w:firstLine="0"/>
+      </w:pPr>
+      <w:r>
+        <w:t>dao.deleteById(100);</w:t>
       </w:r>
     </w:p>
     <w:p>
@@ -6500,87 +6081,29 @@
       </w:r>
       <w:r>
         <w:br/>
-        <w:t xml:space="preserve">class </w:t>
-      </w:r>
-      <w:proofErr w:type="spellStart"/>
-      <w:r>
-        <w:t>AspectDemo</w:t>
-      </w:r>
-      <w:proofErr w:type="spellEnd"/>
-      <w:r>
-        <w:t xml:space="preserve"> { </w:t>
+        <w:t xml:space="preserve">class AspectDemo { </w:t>
       </w:r>
       <w:r>
         <w:br/>
         <w:t xml:space="preserve">  @Before</w:t>
       </w:r>
       <w:r>
-        <w:t>(“execution(“</w:t>
-      </w:r>
-      <w:proofErr w:type="gramStart"/>
-      <w:r>
-        <w:t>com.examples</w:t>
-      </w:r>
-      <w:proofErr w:type="gramEnd"/>
-      <w:r>
-        <w:t xml:space="preserve">.ProfileServiceImpl.createProfile”)”) </w:t>
+        <w:t xml:space="preserve">(“execution(“com.examples.ProfileServiceImpl.createProfile”)”) </w:t>
       </w:r>
       <w:r>
         <w:br/>
-        <w:t xml:space="preserve">  public void </w:t>
-      </w:r>
-      <w:proofErr w:type="spellStart"/>
-      <w:proofErr w:type="gramStart"/>
-      <w:r>
-        <w:t>beforeExec</w:t>
-      </w:r>
-      <w:proofErr w:type="spellEnd"/>
-      <w:r>
-        <w:t>()  { ..</w:t>
-      </w:r>
-      <w:proofErr w:type="gramEnd"/>
-      <w:r>
-        <w:t xml:space="preserve"> } </w:t>
+        <w:t xml:space="preserve">  public void beforeExec()  { .. } </w:t>
       </w:r>
       <w:r>
         <w:br/>
         <w:t xml:space="preserve">  @After</w:t>
       </w:r>
       <w:r>
-        <w:t>(“execution(“</w:t>
-      </w:r>
-      <w:proofErr w:type="gramStart"/>
-      <w:r>
-        <w:t>com.examples</w:t>
-      </w:r>
-      <w:proofErr w:type="gramEnd"/>
-      <w:r>
-        <w:t>.ProfileServiceImpl.createProfile”)”)</w:t>
+        <w:t>(“execution(“com.examples.ProfileServiceImpl.createProfile”)”)</w:t>
       </w:r>
       <w:r>
         <w:br/>
-        <w:t xml:space="preserve">      public void </w:t>
-      </w:r>
-      <w:proofErr w:type="spellStart"/>
-      <w:proofErr w:type="gramStart"/>
-      <w:r>
-        <w:t>afterExce</w:t>
-      </w:r>
-      <w:proofErr w:type="spellEnd"/>
-      <w:r>
-        <w:t>(</w:t>
-      </w:r>
-      <w:proofErr w:type="gramEnd"/>
-      <w:r>
-        <w:t>) {</w:t>
-      </w:r>
-      <w:proofErr w:type="gramStart"/>
-      <w:r>
-        <w:t xml:space="preserve"> ..</w:t>
-      </w:r>
-      <w:proofErr w:type="gramEnd"/>
-      <w:r>
-        <w:t xml:space="preserve"> }</w:t>
+        <w:t xml:space="preserve">      public void afterExce() { .. }</w:t>
       </w:r>
       <w:r>
         <w:br/>
@@ -6610,15 +6133,7 @@
         </w:numPr>
       </w:pPr>
       <w:r>
-        <w:t xml:space="preserve">spring boot </w:t>
-      </w:r>
-      <w:proofErr w:type="spellStart"/>
-      <w:r>
-        <w:t>aop</w:t>
-      </w:r>
-      <w:proofErr w:type="spellEnd"/>
-      <w:r>
-        <w:t xml:space="preserve"> starter</w:t>
+        <w:t>spring boot aop starter</w:t>
       </w:r>
     </w:p>
     <w:p>
@@ -6629,11 +6144,9 @@
           <w:numId w:val="26"/>
         </w:numPr>
       </w:pPr>
-      <w:proofErr w:type="spellStart"/>
       <w:r>
         <w:t>aspectjweaver</w:t>
       </w:r>
-      <w:proofErr w:type="spellEnd"/>
     </w:p>
     <w:p>
       <w:pPr>
@@ -6740,15 +6253,7 @@
         <w:ind w:left="0" w:firstLine="0"/>
       </w:pPr>
       <w:r>
-        <w:t xml:space="preserve">In Microservices architecture each service </w:t>
-      </w:r>
-      <w:proofErr w:type="gramStart"/>
-      <w:r>
-        <w:t>are</w:t>
-      </w:r>
-      <w:proofErr w:type="gramEnd"/>
-      <w:r>
-        <w:t xml:space="preserve"> developed, tested and deployed independently, you can scale whichever the service gets high traffic without scaling other services, if you modify any one service you can only test that service, without testing other services, if any service goes down, other services will be still working, releasing new feature is quicker</w:t>
+        <w:t>In Microservices architecture each service are developed, tested and deployed independently, you can scale whichever the service gets high traffic without scaling other services, if you modify any one service you can only test that service, without testing other services, if any service goes down, other services will be still working, releasing new feature is quicker</w:t>
       </w:r>
     </w:p>
     <w:p>
@@ -6825,15 +6330,7 @@
         </w:numPr>
       </w:pPr>
       <w:r>
-        <w:t xml:space="preserve">Discovery Server -&gt; </w:t>
-      </w:r>
-      <w:proofErr w:type="gramStart"/>
-      <w:r>
-        <w:t>This registers</w:t>
-      </w:r>
-      <w:proofErr w:type="gramEnd"/>
-      <w:r>
-        <w:t xml:space="preserve"> all the microservices, so that microservices can locate other microservices to communicate</w:t>
+        <w:t>Discovery Server -&gt; This registers all the microservices, so that microservices can locate other microservices to communicate</w:t>
       </w:r>
     </w:p>
     <w:p>
@@ -7026,15 +6523,7 @@
         </w:numPr>
       </w:pPr>
       <w:r>
-        <w:t xml:space="preserve">it allows all the clients (microservices) to register with </w:t>
-      </w:r>
-      <w:proofErr w:type="gramStart"/>
-      <w:r>
-        <w:t>an</w:t>
-      </w:r>
-      <w:proofErr w:type="gramEnd"/>
-      <w:r>
-        <w:t xml:space="preserve"> unique name called instance id</w:t>
+        <w:t>it allows all the clients (microservices) to register with an unique name called instance id</w:t>
       </w:r>
     </w:p>
     <w:p>
@@ -7069,15 +6558,7 @@
         </w:numPr>
       </w:pPr>
       <w:r>
-        <w:t xml:space="preserve">It is a microservice (will be having controller, service, dao and </w:t>
-      </w:r>
-      <w:proofErr w:type="spellStart"/>
-      <w:r>
-        <w:t>etc</w:t>
-      </w:r>
-      <w:proofErr w:type="spellEnd"/>
-      <w:r>
-        <w:t>)</w:t>
+        <w:t>It is a microservice (will be having controller, service, dao and etc)</w:t>
       </w:r>
     </w:p>
     <w:p>
@@ -7194,21 +6675,8 @@
         </w:numPr>
       </w:pPr>
       <w:r>
-        <w:t xml:space="preserve">Service Discovery - </w:t>
-      </w:r>
-      <w:proofErr w:type="gramStart"/>
-      <w:r>
-        <w:t>libraries :</w:t>
-      </w:r>
-      <w:proofErr w:type="gramEnd"/>
-      <w:r>
-        <w:t xml:space="preserve"> eureka server, </w:t>
-      </w:r>
-      <w:proofErr w:type="spellStart"/>
-      <w:r>
-        <w:t>devtools</w:t>
-      </w:r>
-      <w:proofErr w:type="spellEnd"/>
+        <w:t>Service Discovery - libraries : eureka server, devtools</w:t>
+      </w:r>
     </w:p>
     <w:p>
       <w:pPr>
@@ -7219,31 +6687,7 @@
         </w:numPr>
       </w:pPr>
       <w:r>
-        <w:t xml:space="preserve">Microservice - </w:t>
-      </w:r>
-      <w:proofErr w:type="gramStart"/>
-      <w:r>
-        <w:t>libraries :</w:t>
-      </w:r>
-      <w:proofErr w:type="gramEnd"/>
-      <w:r>
-        <w:t xml:space="preserve"> eureka client, </w:t>
-      </w:r>
-      <w:proofErr w:type="spellStart"/>
-      <w:r>
-        <w:t>devtools</w:t>
-      </w:r>
-      <w:proofErr w:type="spellEnd"/>
-      <w:r>
-        <w:t xml:space="preserve">, web, </w:t>
-      </w:r>
-      <w:proofErr w:type="spellStart"/>
-      <w:r>
-        <w:t>jpa</w:t>
-      </w:r>
-      <w:proofErr w:type="spellEnd"/>
-      <w:r>
-        <w:t xml:space="preserve"> and so on</w:t>
+        <w:t>Microservice - libraries : eureka client, devtools, web, jpa and so on</w:t>
       </w:r>
     </w:p>
     <w:p>
@@ -7265,13 +6709,8 @@
           <w:numId w:val="31"/>
         </w:numPr>
       </w:pPr>
-      <w:proofErr w:type="gramStart"/>
-      <w:r>
-        <w:t>application.properties</w:t>
-      </w:r>
-      <w:proofErr w:type="gramEnd"/>
-      <w:r>
-        <w:t xml:space="preserve"> -&gt; port = 8761, disable client features </w:t>
+      <w:r>
+        <w:t xml:space="preserve">application.properties -&gt; port = 8761, disable client features </w:t>
       </w:r>
     </w:p>
     <w:p>
@@ -7290,14 +6729,12 @@
       <w:pPr>
         <w:ind w:left="0" w:firstLine="0"/>
       </w:pPr>
-      <w:proofErr w:type="gramStart"/>
       <w:r>
         <w:rPr>
           <w:highlight w:val="yellow"/>
         </w:rPr>
         <w:t>application.properties</w:t>
       </w:r>
-      <w:proofErr w:type="gramEnd"/>
     </w:p>
     <w:p>
       <w:pPr>
@@ -7427,20 +6864,21 @@
       <w:pPr>
         <w:ind w:left="0" w:firstLine="0"/>
       </w:pPr>
-      <w:proofErr w:type="gramStart"/>
       <w:r>
         <w:rPr>
           <w:highlight w:val="yellow"/>
         </w:rPr>
         <w:t>application.properties</w:t>
       </w:r>
-      <w:proofErr w:type="gramEnd"/>
-    </w:p>
-    <w:p>
-      <w:pPr>
-        <w:ind w:left="0" w:firstLine="0"/>
-      </w:pPr>
-      <w:r>
+    </w:p>
+    <w:p>
+      <w:pPr>
+        <w:ind w:left="0" w:firstLine="0"/>
+      </w:pPr>
+      <w:r>
+        <w:rPr>
+          <w:noProof/>
+        </w:rPr>
         <w:drawing>
           <wp:inline distT="0" distB="0" distL="0" distR="0" wp14:anchorId="0F30A221" wp14:editId="57C89737">
             <wp:extent cx="5687219" cy="1143160"/>
@@ -7494,6 +6932,9 @@
         <w:ind w:left="0" w:firstLine="0"/>
       </w:pPr>
       <w:r>
+        <w:rPr>
+          <w:noProof/>
+        </w:rPr>
         <w:lastRenderedPageBreak/>
         <w:drawing>
           <wp:inline distT="0" distB="0" distL="0" distR="0" wp14:anchorId="1C26ED7A" wp14:editId="2FA0A829">
@@ -7592,15 +7033,7 @@
         <w:ind w:left="0" w:firstLine="0"/>
       </w:pPr>
       <w:r>
-        <w:t xml:space="preserve">Feign Client </w:t>
-      </w:r>
-      <w:proofErr w:type="gramStart"/>
-      <w:r>
-        <w:t>interfaces :</w:t>
-      </w:r>
-      <w:proofErr w:type="gramEnd"/>
-      <w:r>
-        <w:t xml:space="preserve"> These are rest end points of remote </w:t>
+        <w:t xml:space="preserve">Feign Client interfaces : These are rest end points of remote </w:t>
       </w:r>
       <w:r>
         <w:t>microser</w:t>
@@ -7614,15 +7047,7 @@
         <w:ind w:left="0" w:firstLine="0"/>
       </w:pPr>
       <w:r>
-        <w:t>@</w:t>
-      </w:r>
-      <w:proofErr w:type="gramStart"/>
-      <w:r>
-        <w:t>FeignClient(</w:t>
-      </w:r>
-      <w:proofErr w:type="gramEnd"/>
-      <w:r>
-        <w:t>path = “http://ACCOUNT-SERVICE”)</w:t>
+        <w:t>@FeignClient(path = “http://ACCOUNT-SERVICE”)</w:t>
       </w:r>
       <w:r>
         <w:br/>
@@ -7637,15 +7062,7 @@
       </w:r>
       <w:r>
         <w:lastRenderedPageBreak/>
-        <w:t xml:space="preserve">     public ResponseEntity&lt;Object&gt; </w:t>
-      </w:r>
-      <w:proofErr w:type="gramStart"/>
-      <w:r>
-        <w:t>fetchBalance(</w:t>
-      </w:r>
-      <w:proofErr w:type="gramEnd"/>
-      <w:r>
-        <w:t>);</w:t>
+        <w:t xml:space="preserve">     public ResponseEntity&lt;Object&gt; fetchBalance();</w:t>
       </w:r>
       <w:r>
         <w:br/>
@@ -7668,25 +7085,23 @@
       <w:pPr>
         <w:ind w:left="0" w:firstLine="0"/>
       </w:pPr>
-      <w:proofErr w:type="gramStart"/>
-      <w:r>
-        <w:t>client.fetchBalance</w:t>
-      </w:r>
-      <w:proofErr w:type="gramEnd"/>
-      <w:r>
-        <w:t>(); -&gt; send request to http://ACCOUNT-SERVICE/account/balance -&gt; Feign Client -&gt; query service discovery -&gt; finds ACCOUNT-SERVICE is mapped to which address -&gt; sends request to that address</w:t>
-      </w:r>
-    </w:p>
-    <w:p>
-      <w:pPr>
-        <w:ind w:left="0" w:firstLine="0"/>
-      </w:pPr>
-    </w:p>
-    <w:p>
-      <w:pPr>
-        <w:ind w:left="0" w:firstLine="0"/>
-      </w:pPr>
-      <w:r>
+      <w:r>
+        <w:t>client.fetchBalance(); -&gt; send request to http://ACCOUNT-SERVICE/account/balance -&gt; Feign Client -&gt; query service discovery -&gt; finds ACCOUNT-SERVICE is mapped to which address -&gt; sends request to that address</w:t>
+      </w:r>
+    </w:p>
+    <w:p>
+      <w:pPr>
+        <w:ind w:left="0" w:firstLine="0"/>
+      </w:pPr>
+    </w:p>
+    <w:p>
+      <w:pPr>
+        <w:ind w:left="0" w:firstLine="0"/>
+      </w:pPr>
+      <w:r>
+        <w:rPr>
+          <w:noProof/>
+        </w:rPr>
         <w:drawing>
           <wp:inline distT="0" distB="0" distL="0" distR="0" wp14:anchorId="50A56ACE" wp14:editId="0AEE05FF">
             <wp:extent cx="5943600" cy="2386965"/>
@@ -7745,6 +7160,9 @@
         <w:ind w:left="0" w:firstLine="0"/>
       </w:pPr>
       <w:r>
+        <w:rPr>
+          <w:noProof/>
+        </w:rPr>
         <w:lastRenderedPageBreak/>
         <w:drawing>
           <wp:inline distT="0" distB="0" distL="0" distR="0" wp14:anchorId="38ACD412" wp14:editId="73F5FB58">
@@ -7799,6 +7217,9 @@
         <w:ind w:left="0" w:firstLine="0"/>
       </w:pPr>
       <w:r>
+        <w:rPr>
+          <w:noProof/>
+        </w:rPr>
         <w:drawing>
           <wp:inline distT="0" distB="0" distL="0" distR="0" wp14:anchorId="35E2E2B9" wp14:editId="3DCD6882">
             <wp:extent cx="5943600" cy="3335020"/>
@@ -7852,6 +7273,9 @@
         <w:ind w:left="0" w:firstLine="0"/>
       </w:pPr>
       <w:r>
+        <w:rPr>
+          <w:noProof/>
+        </w:rPr>
         <w:lastRenderedPageBreak/>
         <w:drawing>
           <wp:inline distT="0" distB="0" distL="0" distR="0" wp14:anchorId="3FA2EE4A" wp14:editId="1B0B2CF6">
@@ -7949,6 +7373,9 @@
         <w:ind w:left="0" w:firstLine="0"/>
       </w:pPr>
       <w:r>
+        <w:rPr>
+          <w:noProof/>
+        </w:rPr>
         <w:lastRenderedPageBreak/>
         <w:drawing>
           <wp:inline distT="0" distB="0" distL="0" distR="0" wp14:anchorId="114264E8" wp14:editId="49B2DFF2">
@@ -7992,6 +7419,9 @@
         <w:ind w:left="0" w:firstLine="0"/>
       </w:pPr>
       <w:r>
+        <w:rPr>
+          <w:noProof/>
+        </w:rPr>
         <w:drawing>
           <wp:inline distT="0" distB="0" distL="0" distR="0" wp14:anchorId="61A9FF63" wp14:editId="5F169154">
             <wp:extent cx="5943600" cy="2746375"/>
@@ -8034,15 +7464,8 @@
         <w:ind w:left="0" w:firstLine="0"/>
       </w:pPr>
       <w:r>
-        <w:t xml:space="preserve">You can pull different property files for the same microservice using </w:t>
-      </w:r>
-      <w:proofErr w:type="spellStart"/>
-      <w:proofErr w:type="gramStart"/>
-      <w:r>
-        <w:t>profiles.active</w:t>
-      </w:r>
-      <w:proofErr w:type="spellEnd"/>
-      <w:proofErr w:type="gramEnd"/>
+        <w:t>You can pull different property files for the same microservice using profiles.active</w:t>
+      </w:r>
       <w:r>
         <w:t xml:space="preserve"> so that no need to keep these properties in local environment.</w:t>
       </w:r>
@@ -8069,41 +7492,20 @@
         <w:t>Configuration Server:</w:t>
       </w:r>
       <w:r>
-        <w:t xml:space="preserve"> @EnableConfigServer enables the application to connect to the git repository or </w:t>
-      </w:r>
-      <w:proofErr w:type="spellStart"/>
-      <w:r>
-        <w:t>aws</w:t>
-      </w:r>
-      <w:proofErr w:type="spellEnd"/>
-      <w:r>
-        <w:t xml:space="preserve"> or any cloud platform</w:t>
-      </w:r>
-      <w:r>
-        <w:t xml:space="preserve">, its </w:t>
-      </w:r>
-      <w:proofErr w:type="gramStart"/>
-      <w:r>
-        <w:t>application.properties</w:t>
-      </w:r>
-      <w:proofErr w:type="gramEnd"/>
-      <w:r>
-        <w:t xml:space="preserve"> will have the centralized configuration file location like git url or </w:t>
-      </w:r>
-      <w:proofErr w:type="spellStart"/>
-      <w:r>
-        <w:t>aws</w:t>
-      </w:r>
-      <w:proofErr w:type="spellEnd"/>
-      <w:r>
-        <w:t xml:space="preserve"> url or azure url.</w:t>
-      </w:r>
-    </w:p>
-    <w:p>
-      <w:pPr>
-        <w:ind w:left="0" w:firstLine="0"/>
-      </w:pPr>
-      <w:r>
+        <w:t xml:space="preserve"> @EnableConfigServer enables the application to connect to the git repository or aws or any cloud platform</w:t>
+      </w:r>
+      <w:r>
+        <w:t>, its application.properties will have the centralized configuration file location like git url or aws url or azure url.</w:t>
+      </w:r>
+    </w:p>
+    <w:p>
+      <w:pPr>
+        <w:ind w:left="0" w:firstLine="0"/>
+      </w:pPr>
+      <w:r>
+        <w:rPr>
+          <w:noProof/>
+        </w:rPr>
         <w:drawing>
           <wp:inline distT="0" distB="0" distL="0" distR="0" wp14:anchorId="4909CDD4" wp14:editId="5910A93C">
             <wp:extent cx="5943600" cy="3004820"/>
@@ -8157,6 +7559,9 @@
         <w:ind w:left="0" w:firstLine="0"/>
       </w:pPr>
       <w:r>
+        <w:rPr>
+          <w:noProof/>
+        </w:rPr>
         <w:drawing>
           <wp:inline distT="0" distB="0" distL="0" distR="0" wp14:anchorId="52D5B250" wp14:editId="1DB1E615">
             <wp:extent cx="5943600" cy="2357120"/>
@@ -8199,6 +7604,9 @@
         <w:ind w:left="0" w:firstLine="0"/>
       </w:pPr>
       <w:r>
+        <w:rPr>
+          <w:noProof/>
+        </w:rPr>
         <w:lastRenderedPageBreak/>
         <w:drawing>
           <wp:inline distT="0" distB="0" distL="0" distR="0" wp14:anchorId="2032DE3F" wp14:editId="4CDF8EBA">
@@ -8295,15 +7703,844 @@
         <w:t>Activity:</w:t>
       </w:r>
       <w:r>
-        <w:t xml:space="preserve"> Create DB properties in the GIT and in your project add spring data </w:t>
-      </w:r>
-      <w:proofErr w:type="spellStart"/>
-      <w:r>
-        <w:t>jpa</w:t>
-      </w:r>
-      <w:proofErr w:type="spellEnd"/>
-      <w:r>
-        <w:t xml:space="preserve"> and mysql library and test the DB connection</w:t>
+        <w:t xml:space="preserve"> Create DB properties in the GIT and in your project add spring data jpa and mysql library and test the DB connection</w:t>
+      </w:r>
+    </w:p>
+    <w:p>
+      <w:pPr>
+        <w:ind w:left="0" w:firstLine="0"/>
+      </w:pPr>
+      <w:r>
+        <w:rPr>
+          <w:highlight w:val="yellow"/>
+        </w:rPr>
+        <w:t>SOAP webservices and REST webservcies with Jersey</w:t>
+      </w:r>
+    </w:p>
+    <w:p>
+      <w:pPr>
+        <w:ind w:left="0" w:firstLine="0"/>
+      </w:pPr>
+      <w:r>
+        <w:t>SOAP: Simple Object Access Protocol</w:t>
+      </w:r>
+      <w:r>
+        <w:t>, it is a webservice where data exchange happens only through XML</w:t>
+      </w:r>
+    </w:p>
+    <w:p>
+      <w:pPr>
+        <w:ind w:left="0" w:firstLine="0"/>
+      </w:pPr>
+      <w:r>
+        <w:rPr>
+          <w:highlight w:val="yellow"/>
+        </w:rPr>
+        <w:t>REST webservices with Jersey:</w:t>
+      </w:r>
+      <w:r>
+        <w:t xml:space="preserve"> It is a webservice which you can create without using spring boot library, you get a separate library called jersey that provides API’s to create RESTful webservices</w:t>
+      </w:r>
+    </w:p>
+    <w:p>
+      <w:pPr>
+        <w:ind w:left="0" w:firstLine="0"/>
+      </w:pPr>
+    </w:p>
+    <w:p>
+      <w:pPr>
+        <w:ind w:left="0" w:firstLine="0"/>
+      </w:pPr>
+      <w:r>
+        <w:rPr>
+          <w:highlight w:val="yellow"/>
+        </w:rPr>
+        <w:t>SOAP vs REST webservcies</w:t>
+      </w:r>
+    </w:p>
+    <w:tbl>
+      <w:tblPr>
+        <w:tblStyle w:val="TableGrid"/>
+        <w:tblW w:w="0" w:type="auto"/>
+        <w:tblLook w:val="04A0" w:firstRow="1" w:lastRow="0" w:firstColumn="1" w:lastColumn="0" w:noHBand="0" w:noVBand="1"/>
+      </w:tblPr>
+      <w:tblGrid>
+        <w:gridCol w:w="4675"/>
+        <w:gridCol w:w="4675"/>
+      </w:tblGrid>
+      <w:tr>
+        <w:tc>
+          <w:tcPr>
+            <w:tcW w:w="4675" w:type="dxa"/>
+          </w:tcPr>
+          <w:p>
+            <w:pPr>
+              <w:ind w:left="0" w:firstLine="0"/>
+              <w:rPr>
+                <w:highlight w:val="yellow"/>
+              </w:rPr>
+            </w:pPr>
+            <w:r>
+              <w:rPr>
+                <w:highlight w:val="yellow"/>
+              </w:rPr>
+              <w:t>SOAP</w:t>
+            </w:r>
+          </w:p>
+        </w:tc>
+        <w:tc>
+          <w:tcPr>
+            <w:tcW w:w="4675" w:type="dxa"/>
+          </w:tcPr>
+          <w:p>
+            <w:pPr>
+              <w:ind w:left="0" w:firstLine="0"/>
+              <w:rPr>
+                <w:highlight w:val="yellow"/>
+              </w:rPr>
+            </w:pPr>
+            <w:r>
+              <w:rPr>
+                <w:highlight w:val="yellow"/>
+              </w:rPr>
+              <w:t>REST Webservices</w:t>
+            </w:r>
+          </w:p>
+        </w:tc>
+      </w:tr>
+      <w:tr>
+        <w:tc>
+          <w:tcPr>
+            <w:tcW w:w="4675" w:type="dxa"/>
+          </w:tcPr>
+          <w:p>
+            <w:pPr>
+              <w:ind w:left="0" w:firstLine="0"/>
+            </w:pPr>
+            <w:r>
+              <w:t>It is a very first webservices that was introduced</w:t>
+            </w:r>
+          </w:p>
+        </w:tc>
+        <w:tc>
+          <w:tcPr>
+            <w:tcW w:w="4675" w:type="dxa"/>
+          </w:tcPr>
+          <w:p>
+            <w:pPr>
+              <w:ind w:left="0" w:firstLine="0"/>
+            </w:pPr>
+            <w:r>
+              <w:t>It came later</w:t>
+            </w:r>
+          </w:p>
+        </w:tc>
+      </w:tr>
+      <w:tr>
+        <w:tc>
+          <w:tcPr>
+            <w:tcW w:w="4675" w:type="dxa"/>
+          </w:tcPr>
+          <w:p>
+            <w:pPr>
+              <w:ind w:left="0" w:firstLine="0"/>
+            </w:pPr>
+            <w:r>
+              <w:lastRenderedPageBreak/>
+              <w:t>It uses XML to exchange the data</w:t>
+            </w:r>
+          </w:p>
+        </w:tc>
+        <w:tc>
+          <w:tcPr>
+            <w:tcW w:w="4675" w:type="dxa"/>
+          </w:tcPr>
+          <w:p>
+            <w:pPr>
+              <w:ind w:left="0" w:firstLine="0"/>
+            </w:pPr>
+            <w:r>
+              <w:t>It uses JSON, XML, Text, CSV and many other formats</w:t>
+            </w:r>
+          </w:p>
+        </w:tc>
+      </w:tr>
+      <w:tr>
+        <w:tc>
+          <w:tcPr>
+            <w:tcW w:w="4675" w:type="dxa"/>
+          </w:tcPr>
+          <w:p>
+            <w:pPr>
+              <w:ind w:left="0" w:firstLine="0"/>
+            </w:pPr>
+            <w:r>
+              <w:t>It is almost obsolete</w:t>
+            </w:r>
+          </w:p>
+        </w:tc>
+        <w:tc>
+          <w:tcPr>
+            <w:tcW w:w="4675" w:type="dxa"/>
+          </w:tcPr>
+          <w:p>
+            <w:pPr>
+              <w:ind w:left="0" w:firstLine="0"/>
+            </w:pPr>
+            <w:r>
+              <w:t>It is used widely</w:t>
+            </w:r>
+          </w:p>
+        </w:tc>
+      </w:tr>
+      <w:tr>
+        <w:tc>
+          <w:tcPr>
+            <w:tcW w:w="4675" w:type="dxa"/>
+          </w:tcPr>
+          <w:p>
+            <w:pPr>
+              <w:ind w:left="0" w:firstLine="0"/>
+            </w:pPr>
+            <w:r>
+              <w:t xml:space="preserve">It uses SOAP protocol to communicate </w:t>
+            </w:r>
+          </w:p>
+        </w:tc>
+        <w:tc>
+          <w:tcPr>
+            <w:tcW w:w="4675" w:type="dxa"/>
+          </w:tcPr>
+          <w:p>
+            <w:pPr>
+              <w:ind w:left="0" w:firstLine="0"/>
+            </w:pPr>
+            <w:r>
+              <w:t>It uses HTTP protocol to communicate</w:t>
+            </w:r>
+          </w:p>
+        </w:tc>
+      </w:tr>
+    </w:tbl>
+    <w:p>
+      <w:pPr>
+        <w:ind w:left="0" w:firstLine="0"/>
+      </w:pPr>
+    </w:p>
+    <w:p>
+      <w:pPr>
+        <w:ind w:left="0" w:firstLine="0"/>
+      </w:pPr>
+      <w:r>
+        <w:rPr>
+          <w:highlight w:val="yellow"/>
+        </w:rPr>
+        <w:t>Implementing a Cab Booking Project</w:t>
+      </w:r>
+    </w:p>
+    <w:p>
+      <w:pPr>
+        <w:ind w:left="0" w:firstLine="0"/>
+      </w:pPr>
+      <w:r>
+        <w:t>We will create the backend service that will have two microservices connects to the same database</w:t>
+      </w:r>
+    </w:p>
+    <w:p>
+      <w:pPr>
+        <w:pStyle w:val="ListParagraph"/>
+        <w:numPr>
+          <w:ilvl w:val="0"/>
+          <w:numId w:val="33"/>
+        </w:numPr>
+      </w:pPr>
+      <w:r>
+        <w:t>Booking Cab : From and To, then Type of Cab</w:t>
+      </w:r>
+    </w:p>
+    <w:p>
+      <w:pPr>
+        <w:pStyle w:val="ListParagraph"/>
+        <w:numPr>
+          <w:ilvl w:val="0"/>
+          <w:numId w:val="33"/>
+        </w:numPr>
+      </w:pPr>
+      <w:r>
+        <w:t xml:space="preserve">Calculate Fare Details: For </w:t>
+      </w:r>
+      <w:r>
+        <w:t>Hatchback</w:t>
+      </w:r>
+      <w:r>
+        <w:t xml:space="preserve">, </w:t>
+      </w:r>
+      <w:r>
+        <w:t>Sedan, SUV</w:t>
+      </w:r>
+      <w:r>
+        <w:t>, Luxury</w:t>
+      </w:r>
+    </w:p>
+    <w:p>
+      <w:pPr>
+        <w:ind w:left="0" w:firstLine="0"/>
+      </w:pPr>
+    </w:p>
+    <w:p>
+      <w:pPr>
+        <w:ind w:left="0" w:firstLine="0"/>
+      </w:pPr>
+      <w:r>
+        <w:rPr>
+          <w:highlight w:val="yellow"/>
+        </w:rPr>
+        <w:t>Booking table:</w:t>
+      </w:r>
+      <w:r>
+        <w:t xml:space="preserve"> </w:t>
+      </w:r>
+    </w:p>
+    <w:p>
+      <w:pPr>
+        <w:ind w:left="0" w:firstLine="0"/>
+      </w:pPr>
+      <w:r>
+        <w:t xml:space="preserve">Create a table with column names like id, name, </w:t>
+      </w:r>
+      <w:r>
+        <w:t>source</w:t>
+      </w:r>
+      <w:r>
+        <w:t xml:space="preserve">, </w:t>
+      </w:r>
+      <w:r>
+        <w:t>destination</w:t>
+      </w:r>
+      <w:r>
+        <w:t xml:space="preserve">, type, distance, rate, total </w:t>
+      </w:r>
+    </w:p>
+    <w:p>
+      <w:pPr>
+        <w:ind w:left="0" w:firstLine="0"/>
+      </w:pPr>
+      <w:r>
+        <w:rPr>
+          <w:highlight w:val="yellow"/>
+        </w:rPr>
+        <w:t>Front end and backend</w:t>
+      </w:r>
+      <w:r>
+        <w:t xml:space="preserve"> </w:t>
+      </w:r>
+    </w:p>
+    <w:p>
+      <w:pPr>
+        <w:ind w:left="0" w:firstLine="0"/>
+      </w:pPr>
+      <w:r>
+        <w:drawing>
+          <wp:inline distT="0" distB="0" distL="0" distR="0" wp14:anchorId="0DDA62E7" wp14:editId="4BA101FF">
+            <wp:extent cx="5943600" cy="3100705"/>
+            <wp:effectExtent l="0" t="0" r="0" b="4445"/>
+            <wp:docPr id="511385051" name="Picture 1"/>
+            <wp:cNvGraphicFramePr>
+              <a:graphicFrameLocks xmlns:a="http://schemas.openxmlformats.org/drawingml/2006/main" noChangeAspect="1"/>
+            </wp:cNvGraphicFramePr>
+            <a:graphic xmlns:a="http://schemas.openxmlformats.org/drawingml/2006/main">
+              <a:graphicData uri="http://schemas.openxmlformats.org/drawingml/2006/picture">
+                <pic:pic xmlns:pic="http://schemas.openxmlformats.org/drawingml/2006/picture">
+                  <pic:nvPicPr>
+                    <pic:cNvPr id="511385051" name=""/>
+                    <pic:cNvPicPr/>
+                  </pic:nvPicPr>
+                  <pic:blipFill>
+                    <a:blip r:embed="rId74"/>
+                    <a:stretch>
+                      <a:fillRect/>
+                    </a:stretch>
+                  </pic:blipFill>
+                  <pic:spPr>
+                    <a:xfrm>
+                      <a:off x="0" y="0"/>
+                      <a:ext cx="5943600" cy="3100705"/>
+                    </a:xfrm>
+                    <a:prstGeom prst="rect">
+                      <a:avLst/>
+                    </a:prstGeom>
+                  </pic:spPr>
+                </pic:pic>
+              </a:graphicData>
+            </a:graphic>
+          </wp:inline>
+        </w:drawing>
+      </w:r>
+    </w:p>
+    <w:p>
+      <w:pPr>
+        <w:ind w:left="0" w:firstLine="0"/>
+      </w:pPr>
+      <w:r>
+        <w:lastRenderedPageBreak/>
+        <w:t>As per the requirement we must create 2 microservices one to book and another to calculate fare, but right now we will calculate fare within a single microservice and store all the details, later you separate calculate fare as a separate microservices that just returns the fare details to the end user.</w:t>
+      </w:r>
+    </w:p>
+    <w:p>
+      <w:pPr>
+        <w:ind w:left="0" w:firstLine="0"/>
+      </w:pPr>
+      <w:r>
+        <w:rPr>
+          <w:highlight w:val="yellow"/>
+        </w:rPr>
+        <w:t>Things to create</w:t>
+      </w:r>
+    </w:p>
+    <w:p>
+      <w:pPr>
+        <w:pStyle w:val="ListParagraph"/>
+        <w:numPr>
+          <w:ilvl w:val="0"/>
+          <w:numId w:val="34"/>
+        </w:numPr>
+      </w:pPr>
+      <w:r>
+        <w:t>One Microservice project having below libraries</w:t>
+      </w:r>
+    </w:p>
+    <w:p>
+      <w:pPr>
+        <w:pStyle w:val="ListParagraph"/>
+        <w:numPr>
+          <w:ilvl w:val="1"/>
+          <w:numId w:val="34"/>
+        </w:numPr>
+      </w:pPr>
+      <w:r>
+        <w:t>Web</w:t>
+      </w:r>
+    </w:p>
+    <w:p>
+      <w:pPr>
+        <w:pStyle w:val="ListParagraph"/>
+        <w:numPr>
+          <w:ilvl w:val="1"/>
+          <w:numId w:val="34"/>
+        </w:numPr>
+      </w:pPr>
+      <w:r>
+        <w:t>JPA</w:t>
+      </w:r>
+    </w:p>
+    <w:p>
+      <w:pPr>
+        <w:pStyle w:val="ListParagraph"/>
+        <w:numPr>
+          <w:ilvl w:val="1"/>
+          <w:numId w:val="34"/>
+        </w:numPr>
+      </w:pPr>
+      <w:r>
+        <w:t>Devtools</w:t>
+      </w:r>
+    </w:p>
+    <w:p>
+      <w:pPr>
+        <w:pStyle w:val="ListParagraph"/>
+        <w:numPr>
+          <w:ilvl w:val="1"/>
+          <w:numId w:val="34"/>
+        </w:numPr>
+      </w:pPr>
+      <w:r>
+        <w:t>MySQL Connector</w:t>
+      </w:r>
+    </w:p>
+    <w:p>
+      <w:pPr>
+        <w:pStyle w:val="ListParagraph"/>
+        <w:numPr>
+          <w:ilvl w:val="1"/>
+          <w:numId w:val="34"/>
+        </w:numPr>
+      </w:pPr>
+      <w:r>
+        <w:t>Eureka Client</w:t>
+      </w:r>
+    </w:p>
+    <w:p>
+      <w:pPr>
+        <w:pStyle w:val="ListParagraph"/>
+        <w:numPr>
+          <w:ilvl w:val="0"/>
+          <w:numId w:val="34"/>
+        </w:numPr>
+      </w:pPr>
+      <w:r>
+        <w:t>Entity class - Booking</w:t>
+      </w:r>
+    </w:p>
+    <w:p>
+      <w:pPr>
+        <w:pStyle w:val="ListParagraph"/>
+        <w:numPr>
+          <w:ilvl w:val="0"/>
+          <w:numId w:val="34"/>
+        </w:numPr>
+      </w:pPr>
+      <w:r>
+        <w:t>Repository - BookingRepo</w:t>
+      </w:r>
+    </w:p>
+    <w:p>
+      <w:pPr>
+        <w:pStyle w:val="ListParagraph"/>
+        <w:numPr>
+          <w:ilvl w:val="0"/>
+          <w:numId w:val="34"/>
+        </w:numPr>
+      </w:pPr>
+      <w:r>
+        <w:t>Service - BookingService - must store all the booking details, with fare details</w:t>
+      </w:r>
+    </w:p>
+    <w:p>
+      <w:pPr>
+        <w:pStyle w:val="ListParagraph"/>
+        <w:numPr>
+          <w:ilvl w:val="0"/>
+          <w:numId w:val="34"/>
+        </w:numPr>
+      </w:pPr>
+      <w:r>
+        <w:t>Controller - accepting the booking details</w:t>
+      </w:r>
+    </w:p>
+    <w:p>
+      <w:pPr>
+        <w:ind w:left="0" w:firstLine="0"/>
+      </w:pPr>
+      <w:r>
+        <w:rPr>
+          <w:highlight w:val="yellow"/>
+        </w:rPr>
+        <w:t>Assignment:</w:t>
+      </w:r>
+      <w:r>
+        <w:t xml:space="preserve"> Separate the calculate fare logics </w:t>
+      </w:r>
+      <w:r>
+        <w:t xml:space="preserve">in a second </w:t>
+      </w:r>
+      <w:r>
+        <w:t>microservice and when you book</w:t>
+      </w:r>
+      <w:r>
+        <w:t xml:space="preserve">, </w:t>
+      </w:r>
+      <w:r>
+        <w:t>the front end must send booking details with fare details so that First microservice will store them</w:t>
+      </w:r>
+    </w:p>
+    <w:p>
+      <w:pPr>
+        <w:ind w:left="0" w:firstLine="0"/>
+      </w:pPr>
+      <w:r>
+        <w:rPr>
+          <w:highlight w:val="yellow"/>
+        </w:rPr>
+        <w:t>application.properties</w:t>
+      </w:r>
+    </w:p>
+    <w:p>
+      <w:pPr>
+        <w:ind w:left="0" w:firstLine="0"/>
+      </w:pPr>
+      <w:r>
+        <w:drawing>
+          <wp:inline distT="0" distB="0" distL="0" distR="0" wp14:anchorId="213235CE" wp14:editId="7830DF5A">
+            <wp:extent cx="5943600" cy="2357755"/>
+            <wp:effectExtent l="0" t="0" r="0" b="4445"/>
+            <wp:docPr id="1331596261" name="Picture 1"/>
+            <wp:cNvGraphicFramePr>
+              <a:graphicFrameLocks xmlns:a="http://schemas.openxmlformats.org/drawingml/2006/main" noChangeAspect="1"/>
+            </wp:cNvGraphicFramePr>
+            <a:graphic xmlns:a="http://schemas.openxmlformats.org/drawingml/2006/main">
+              <a:graphicData uri="http://schemas.openxmlformats.org/drawingml/2006/picture">
+                <pic:pic xmlns:pic="http://schemas.openxmlformats.org/drawingml/2006/picture">
+                  <pic:nvPicPr>
+                    <pic:cNvPr id="1331596261" name=""/>
+                    <pic:cNvPicPr/>
+                  </pic:nvPicPr>
+                  <pic:blipFill>
+                    <a:blip r:embed="rId75"/>
+                    <a:stretch>
+                      <a:fillRect/>
+                    </a:stretch>
+                  </pic:blipFill>
+                  <pic:spPr>
+                    <a:xfrm>
+                      <a:off x="0" y="0"/>
+                      <a:ext cx="5943600" cy="2357755"/>
+                    </a:xfrm>
+                    <a:prstGeom prst="rect">
+                      <a:avLst/>
+                    </a:prstGeom>
+                  </pic:spPr>
+                </pic:pic>
+              </a:graphicData>
+            </a:graphic>
+          </wp:inline>
+        </w:drawing>
+      </w:r>
+    </w:p>
+    <w:p>
+      <w:pPr>
+        <w:ind w:left="0" w:firstLine="0"/>
+      </w:pPr>
+      <w:r>
+        <w:rPr>
+          <w:highlight w:val="yellow"/>
+        </w:rPr>
+        <w:lastRenderedPageBreak/>
+        <w:t>Entity class</w:t>
+      </w:r>
+      <w:r>
+        <w:t>: Booking</w:t>
+      </w:r>
+    </w:p>
+    <w:p>
+      <w:pPr>
+        <w:ind w:left="0" w:firstLine="0"/>
+      </w:pPr>
+      <w:r>
+        <w:drawing>
+          <wp:inline distT="0" distB="0" distL="0" distR="0" wp14:anchorId="2F8D3F01" wp14:editId="2948801E">
+            <wp:extent cx="5943600" cy="4892040"/>
+            <wp:effectExtent l="0" t="0" r="0" b="3810"/>
+            <wp:docPr id="1002008662" name="Picture 1"/>
+            <wp:cNvGraphicFramePr>
+              <a:graphicFrameLocks xmlns:a="http://schemas.openxmlformats.org/drawingml/2006/main" noChangeAspect="1"/>
+            </wp:cNvGraphicFramePr>
+            <a:graphic xmlns:a="http://schemas.openxmlformats.org/drawingml/2006/main">
+              <a:graphicData uri="http://schemas.openxmlformats.org/drawingml/2006/picture">
+                <pic:pic xmlns:pic="http://schemas.openxmlformats.org/drawingml/2006/picture">
+                  <pic:nvPicPr>
+                    <pic:cNvPr id="1002008662" name=""/>
+                    <pic:cNvPicPr/>
+                  </pic:nvPicPr>
+                  <pic:blipFill>
+                    <a:blip r:embed="rId76"/>
+                    <a:stretch>
+                      <a:fillRect/>
+                    </a:stretch>
+                  </pic:blipFill>
+                  <pic:spPr>
+                    <a:xfrm>
+                      <a:off x="0" y="0"/>
+                      <a:ext cx="5943600" cy="4892040"/>
+                    </a:xfrm>
+                    <a:prstGeom prst="rect">
+                      <a:avLst/>
+                    </a:prstGeom>
+                  </pic:spPr>
+                </pic:pic>
+              </a:graphicData>
+            </a:graphic>
+          </wp:inline>
+        </w:drawing>
+      </w:r>
+    </w:p>
+    <w:p>
+      <w:pPr>
+        <w:ind w:left="0" w:firstLine="0"/>
+      </w:pPr>
+      <w:r>
+        <w:rPr>
+          <w:highlight w:val="yellow"/>
+        </w:rPr>
+        <w:t>Repository interface</w:t>
+      </w:r>
+    </w:p>
+    <w:p>
+      <w:pPr>
+        <w:ind w:left="0" w:firstLine="0"/>
+      </w:pPr>
+      <w:r>
+        <w:drawing>
+          <wp:inline distT="0" distB="0" distL="0" distR="0" wp14:anchorId="1E656313" wp14:editId="6279E1AA">
+            <wp:extent cx="5943600" cy="1813560"/>
+            <wp:effectExtent l="0" t="0" r="0" b="0"/>
+            <wp:docPr id="1973566595" name="Picture 1"/>
+            <wp:cNvGraphicFramePr>
+              <a:graphicFrameLocks xmlns:a="http://schemas.openxmlformats.org/drawingml/2006/main" noChangeAspect="1"/>
+            </wp:cNvGraphicFramePr>
+            <a:graphic xmlns:a="http://schemas.openxmlformats.org/drawingml/2006/main">
+              <a:graphicData uri="http://schemas.openxmlformats.org/drawingml/2006/picture">
+                <pic:pic xmlns:pic="http://schemas.openxmlformats.org/drawingml/2006/picture">
+                  <pic:nvPicPr>
+                    <pic:cNvPr id="1973566595" name=""/>
+                    <pic:cNvPicPr/>
+                  </pic:nvPicPr>
+                  <pic:blipFill>
+                    <a:blip r:embed="rId77"/>
+                    <a:stretch>
+                      <a:fillRect/>
+                    </a:stretch>
+                  </pic:blipFill>
+                  <pic:spPr>
+                    <a:xfrm>
+                      <a:off x="0" y="0"/>
+                      <a:ext cx="5943600" cy="1813560"/>
+                    </a:xfrm>
+                    <a:prstGeom prst="rect">
+                      <a:avLst/>
+                    </a:prstGeom>
+                  </pic:spPr>
+                </pic:pic>
+              </a:graphicData>
+            </a:graphic>
+          </wp:inline>
+        </w:drawing>
+      </w:r>
+    </w:p>
+    <w:p>
+      <w:pPr>
+        <w:ind w:left="0" w:firstLine="0"/>
+      </w:pPr>
+    </w:p>
+    <w:p>
+      <w:pPr>
+        <w:ind w:left="0" w:firstLine="0"/>
+      </w:pPr>
+      <w:r>
+        <w:rPr>
+          <w:highlight w:val="yellow"/>
+        </w:rPr>
+        <w:lastRenderedPageBreak/>
+        <w:t>Service layer</w:t>
+      </w:r>
+    </w:p>
+    <w:p>
+      <w:pPr>
+        <w:ind w:left="0" w:firstLine="0"/>
+      </w:pPr>
+      <w:r>
+        <w:drawing>
+          <wp:inline distT="0" distB="0" distL="0" distR="0" wp14:anchorId="035F96D5" wp14:editId="401F686B">
+            <wp:extent cx="5943600" cy="4674870"/>
+            <wp:effectExtent l="0" t="0" r="0" b="0"/>
+            <wp:docPr id="1302355533" name="Picture 1"/>
+            <wp:cNvGraphicFramePr>
+              <a:graphicFrameLocks xmlns:a="http://schemas.openxmlformats.org/drawingml/2006/main" noChangeAspect="1"/>
+            </wp:cNvGraphicFramePr>
+            <a:graphic xmlns:a="http://schemas.openxmlformats.org/drawingml/2006/main">
+              <a:graphicData uri="http://schemas.openxmlformats.org/drawingml/2006/picture">
+                <pic:pic xmlns:pic="http://schemas.openxmlformats.org/drawingml/2006/picture">
+                  <pic:nvPicPr>
+                    <pic:cNvPr id="1302355533" name=""/>
+                    <pic:cNvPicPr/>
+                  </pic:nvPicPr>
+                  <pic:blipFill>
+                    <a:blip r:embed="rId78"/>
+                    <a:stretch>
+                      <a:fillRect/>
+                    </a:stretch>
+                  </pic:blipFill>
+                  <pic:spPr>
+                    <a:xfrm>
+                      <a:off x="0" y="0"/>
+                      <a:ext cx="5943600" cy="4674870"/>
+                    </a:xfrm>
+                    <a:prstGeom prst="rect">
+                      <a:avLst/>
+                    </a:prstGeom>
+                  </pic:spPr>
+                </pic:pic>
+              </a:graphicData>
+            </a:graphic>
+          </wp:inline>
+        </w:drawing>
+      </w:r>
+    </w:p>
+    <w:p>
+      <w:pPr>
+        <w:ind w:left="0" w:firstLine="0"/>
+      </w:pPr>
+      <w:r>
+        <w:rPr>
+          <w:highlight w:val="yellow"/>
+        </w:rPr>
+        <w:t>Controller layer</w:t>
+      </w:r>
+    </w:p>
+    <w:p>
+      <w:pPr>
+        <w:ind w:left="0" w:firstLine="0"/>
+      </w:pPr>
+      <w:r>
+        <w:lastRenderedPageBreak/>
+        <w:drawing>
+          <wp:inline distT="0" distB="0" distL="0" distR="0" wp14:anchorId="03D3743A" wp14:editId="1367D4B3">
+            <wp:extent cx="5943600" cy="2697480"/>
+            <wp:effectExtent l="0" t="0" r="0" b="7620"/>
+            <wp:docPr id="1435383353" name="Picture 1"/>
+            <wp:cNvGraphicFramePr>
+              <a:graphicFrameLocks xmlns:a="http://schemas.openxmlformats.org/drawingml/2006/main" noChangeAspect="1"/>
+            </wp:cNvGraphicFramePr>
+            <a:graphic xmlns:a="http://schemas.openxmlformats.org/drawingml/2006/main">
+              <a:graphicData uri="http://schemas.openxmlformats.org/drawingml/2006/picture">
+                <pic:pic xmlns:pic="http://schemas.openxmlformats.org/drawingml/2006/picture">
+                  <pic:nvPicPr>
+                    <pic:cNvPr id="1435383353" name=""/>
+                    <pic:cNvPicPr/>
+                  </pic:nvPicPr>
+                  <pic:blipFill>
+                    <a:blip r:embed="rId79"/>
+                    <a:stretch>
+                      <a:fillRect/>
+                    </a:stretch>
+                  </pic:blipFill>
+                  <pic:spPr>
+                    <a:xfrm>
+                      <a:off x="0" y="0"/>
+                      <a:ext cx="5943600" cy="2697480"/>
+                    </a:xfrm>
+                    <a:prstGeom prst="rect">
+                      <a:avLst/>
+                    </a:prstGeom>
+                  </pic:spPr>
+                </pic:pic>
+              </a:graphicData>
+            </a:graphic>
+          </wp:inline>
+        </w:drawing>
+      </w:r>
+    </w:p>
+    <w:p>
+      <w:pPr>
+        <w:ind w:left="0" w:firstLine="0"/>
+      </w:pPr>
+      <w:r>
+        <w:t>We will use front end applications to access this backend</w:t>
+      </w:r>
+    </w:p>
+    <w:p>
+      <w:pPr>
+        <w:ind w:left="0" w:firstLine="0"/>
+      </w:pPr>
+      <w:r>
+        <w:t>React uses axios library to make an HTTP request</w:t>
+      </w:r>
+    </w:p>
+    <w:p>
+      <w:pPr>
+        <w:ind w:left="0" w:firstLine="0"/>
+      </w:pPr>
+      <w:r>
+        <w:t>Angular HttpClient to make an HTTP requests</w:t>
       </w:r>
     </w:p>
     <w:sectPr>
@@ -9476,6 +9713,95 @@
     </w:lvl>
   </w:abstractNum>
   <w:abstractNum w:abstractNumId="13" w15:restartNumberingAfterBreak="0">
+    <w:nsid w:val="3FAC6AD6"/>
+    <w:multiLevelType w:val="hybridMultilevel"/>
+    <w:tmpl w:val="5C7EBB0C"/>
+    <w:lvl w:ilvl="0" w:tplc="0409000F">
+      <w:start w:val="1"/>
+      <w:numFmt w:val="decimal"/>
+      <w:lvlText w:val="%1."/>
+      <w:lvlJc w:val="left"/>
+      <w:pPr>
+        <w:ind w:left="720" w:hanging="360"/>
+      </w:pPr>
+      <w:rPr>
+        <w:rFonts w:hint="default"/>
+      </w:rPr>
+    </w:lvl>
+    <w:lvl w:ilvl="1" w:tplc="04090019">
+      <w:start w:val="1"/>
+      <w:numFmt w:val="lowerLetter"/>
+      <w:lvlText w:val="%2."/>
+      <w:lvlJc w:val="left"/>
+      <w:pPr>
+        <w:ind w:left="1440" w:hanging="360"/>
+      </w:pPr>
+    </w:lvl>
+    <w:lvl w:ilvl="2" w:tplc="0409001B" w:tentative="1">
+      <w:start w:val="1"/>
+      <w:numFmt w:val="lowerRoman"/>
+      <w:lvlText w:val="%3."/>
+      <w:lvlJc w:val="right"/>
+      <w:pPr>
+        <w:ind w:left="2160" w:hanging="180"/>
+      </w:pPr>
+    </w:lvl>
+    <w:lvl w:ilvl="3" w:tplc="0409000F" w:tentative="1">
+      <w:start w:val="1"/>
+      <w:numFmt w:val="decimal"/>
+      <w:lvlText w:val="%4."/>
+      <w:lvlJc w:val="left"/>
+      <w:pPr>
+        <w:ind w:left="2880" w:hanging="360"/>
+      </w:pPr>
+    </w:lvl>
+    <w:lvl w:ilvl="4" w:tplc="04090019" w:tentative="1">
+      <w:start w:val="1"/>
+      <w:numFmt w:val="lowerLetter"/>
+      <w:lvlText w:val="%5."/>
+      <w:lvlJc w:val="left"/>
+      <w:pPr>
+        <w:ind w:left="3600" w:hanging="360"/>
+      </w:pPr>
+    </w:lvl>
+    <w:lvl w:ilvl="5" w:tplc="0409001B" w:tentative="1">
+      <w:start w:val="1"/>
+      <w:numFmt w:val="lowerRoman"/>
+      <w:lvlText w:val="%6."/>
+      <w:lvlJc w:val="right"/>
+      <w:pPr>
+        <w:ind w:left="4320" w:hanging="180"/>
+      </w:pPr>
+    </w:lvl>
+    <w:lvl w:ilvl="6" w:tplc="0409000F" w:tentative="1">
+      <w:start w:val="1"/>
+      <w:numFmt w:val="decimal"/>
+      <w:lvlText w:val="%7."/>
+      <w:lvlJc w:val="left"/>
+      <w:pPr>
+        <w:ind w:left="5040" w:hanging="360"/>
+      </w:pPr>
+    </w:lvl>
+    <w:lvl w:ilvl="7" w:tplc="04090019" w:tentative="1">
+      <w:start w:val="1"/>
+      <w:numFmt w:val="lowerLetter"/>
+      <w:lvlText w:val="%8."/>
+      <w:lvlJc w:val="left"/>
+      <w:pPr>
+        <w:ind w:left="5760" w:hanging="360"/>
+      </w:pPr>
+    </w:lvl>
+    <w:lvl w:ilvl="8" w:tplc="0409001B" w:tentative="1">
+      <w:start w:val="1"/>
+      <w:numFmt w:val="lowerRoman"/>
+      <w:lvlText w:val="%9."/>
+      <w:lvlJc w:val="right"/>
+      <w:pPr>
+        <w:ind w:left="6480" w:hanging="180"/>
+      </w:pPr>
+    </w:lvl>
+  </w:abstractNum>
+  <w:abstractNum w:abstractNumId="14" w15:restartNumberingAfterBreak="0">
     <w:nsid w:val="44CA2C52"/>
     <w:multiLevelType w:val="hybridMultilevel"/>
     <w:tmpl w:val="CE54277C"/>
@@ -9564,7 +9890,7 @@
       </w:pPr>
     </w:lvl>
   </w:abstractNum>
-  <w:abstractNum w:abstractNumId="14" w15:restartNumberingAfterBreak="0">
+  <w:abstractNum w:abstractNumId="15" w15:restartNumberingAfterBreak="0">
     <w:nsid w:val="46044801"/>
     <w:multiLevelType w:val="hybridMultilevel"/>
     <w:tmpl w:val="5ACEF4C4"/>
@@ -9653,7 +9979,7 @@
       </w:pPr>
     </w:lvl>
   </w:abstractNum>
-  <w:abstractNum w:abstractNumId="15" w15:restartNumberingAfterBreak="0">
+  <w:abstractNum w:abstractNumId="16" w15:restartNumberingAfterBreak="0">
     <w:nsid w:val="4AC07085"/>
     <w:multiLevelType w:val="hybridMultilevel"/>
     <w:tmpl w:val="3C1447BA"/>
@@ -9742,7 +10068,7 @@
       </w:pPr>
     </w:lvl>
   </w:abstractNum>
-  <w:abstractNum w:abstractNumId="16" w15:restartNumberingAfterBreak="0">
+  <w:abstractNum w:abstractNumId="17" w15:restartNumberingAfterBreak="0">
     <w:nsid w:val="4FAA6A76"/>
     <w:multiLevelType w:val="hybridMultilevel"/>
     <w:tmpl w:val="E74AB79A"/>
@@ -9831,7 +10157,96 @@
       </w:pPr>
     </w:lvl>
   </w:abstractNum>
-  <w:abstractNum w:abstractNumId="17" w15:restartNumberingAfterBreak="0">
+  <w:abstractNum w:abstractNumId="18" w15:restartNumberingAfterBreak="0">
+    <w:nsid w:val="50D535DD"/>
+    <w:multiLevelType w:val="hybridMultilevel"/>
+    <w:tmpl w:val="ABD47FE4"/>
+    <w:lvl w:ilvl="0" w:tplc="0409000F">
+      <w:start w:val="1"/>
+      <w:numFmt w:val="decimal"/>
+      <w:lvlText w:val="%1."/>
+      <w:lvlJc w:val="left"/>
+      <w:pPr>
+        <w:ind w:left="720" w:hanging="360"/>
+      </w:pPr>
+      <w:rPr>
+        <w:rFonts w:hint="default"/>
+      </w:rPr>
+    </w:lvl>
+    <w:lvl w:ilvl="1" w:tplc="04090019" w:tentative="1">
+      <w:start w:val="1"/>
+      <w:numFmt w:val="lowerLetter"/>
+      <w:lvlText w:val="%2."/>
+      <w:lvlJc w:val="left"/>
+      <w:pPr>
+        <w:ind w:left="1440" w:hanging="360"/>
+      </w:pPr>
+    </w:lvl>
+    <w:lvl w:ilvl="2" w:tplc="0409001B" w:tentative="1">
+      <w:start w:val="1"/>
+      <w:numFmt w:val="lowerRoman"/>
+      <w:lvlText w:val="%3."/>
+      <w:lvlJc w:val="right"/>
+      <w:pPr>
+        <w:ind w:left="2160" w:hanging="180"/>
+      </w:pPr>
+    </w:lvl>
+    <w:lvl w:ilvl="3" w:tplc="0409000F" w:tentative="1">
+      <w:start w:val="1"/>
+      <w:numFmt w:val="decimal"/>
+      <w:lvlText w:val="%4."/>
+      <w:lvlJc w:val="left"/>
+      <w:pPr>
+        <w:ind w:left="2880" w:hanging="360"/>
+      </w:pPr>
+    </w:lvl>
+    <w:lvl w:ilvl="4" w:tplc="04090019" w:tentative="1">
+      <w:start w:val="1"/>
+      <w:numFmt w:val="lowerLetter"/>
+      <w:lvlText w:val="%5."/>
+      <w:lvlJc w:val="left"/>
+      <w:pPr>
+        <w:ind w:left="3600" w:hanging="360"/>
+      </w:pPr>
+    </w:lvl>
+    <w:lvl w:ilvl="5" w:tplc="0409001B" w:tentative="1">
+      <w:start w:val="1"/>
+      <w:numFmt w:val="lowerRoman"/>
+      <w:lvlText w:val="%6."/>
+      <w:lvlJc w:val="right"/>
+      <w:pPr>
+        <w:ind w:left="4320" w:hanging="180"/>
+      </w:pPr>
+    </w:lvl>
+    <w:lvl w:ilvl="6" w:tplc="0409000F" w:tentative="1">
+      <w:start w:val="1"/>
+      <w:numFmt w:val="decimal"/>
+      <w:lvlText w:val="%7."/>
+      <w:lvlJc w:val="left"/>
+      <w:pPr>
+        <w:ind w:left="5040" w:hanging="360"/>
+      </w:pPr>
+    </w:lvl>
+    <w:lvl w:ilvl="7" w:tplc="04090019" w:tentative="1">
+      <w:start w:val="1"/>
+      <w:numFmt w:val="lowerLetter"/>
+      <w:lvlText w:val="%8."/>
+      <w:lvlJc w:val="left"/>
+      <w:pPr>
+        <w:ind w:left="5760" w:hanging="360"/>
+      </w:pPr>
+    </w:lvl>
+    <w:lvl w:ilvl="8" w:tplc="0409001B" w:tentative="1">
+      <w:start w:val="1"/>
+      <w:numFmt w:val="lowerRoman"/>
+      <w:lvlText w:val="%9."/>
+      <w:lvlJc w:val="right"/>
+      <w:pPr>
+        <w:ind w:left="6480" w:hanging="180"/>
+      </w:pPr>
+    </w:lvl>
+  </w:abstractNum>
+  <w:abstractNum w:abstractNumId="19" w15:restartNumberingAfterBreak="0">
     <w:nsid w:val="51370263"/>
     <w:multiLevelType w:val="hybridMultilevel"/>
     <w:tmpl w:val="A19EA814"/>
@@ -9920,7 +10335,7 @@
       </w:pPr>
     </w:lvl>
   </w:abstractNum>
-  <w:abstractNum w:abstractNumId="18" w15:restartNumberingAfterBreak="0">
+  <w:abstractNum w:abstractNumId="20" w15:restartNumberingAfterBreak="0">
     <w:nsid w:val="5766271F"/>
     <w:multiLevelType w:val="hybridMultilevel"/>
     <w:tmpl w:val="6ABE5E62"/>
@@ -10009,7 +10424,7 @@
       </w:pPr>
     </w:lvl>
   </w:abstractNum>
-  <w:abstractNum w:abstractNumId="19" w15:restartNumberingAfterBreak="0">
+  <w:abstractNum w:abstractNumId="21" w15:restartNumberingAfterBreak="0">
     <w:nsid w:val="582E2516"/>
     <w:multiLevelType w:val="hybridMultilevel"/>
     <w:tmpl w:val="E55C935C"/>
@@ -10098,7 +10513,7 @@
       </w:pPr>
     </w:lvl>
   </w:abstractNum>
-  <w:abstractNum w:abstractNumId="20" w15:restartNumberingAfterBreak="0">
+  <w:abstractNum w:abstractNumId="22" w15:restartNumberingAfterBreak="0">
     <w:nsid w:val="58EC0FA2"/>
     <w:multiLevelType w:val="hybridMultilevel"/>
     <w:tmpl w:val="CE3EAE10"/>
@@ -10187,7 +10602,7 @@
       </w:pPr>
     </w:lvl>
   </w:abstractNum>
-  <w:abstractNum w:abstractNumId="21" w15:restartNumberingAfterBreak="0">
+  <w:abstractNum w:abstractNumId="23" w15:restartNumberingAfterBreak="0">
     <w:nsid w:val="5B3F3CEC"/>
     <w:multiLevelType w:val="hybridMultilevel"/>
     <w:tmpl w:val="71460F90"/>
@@ -10276,7 +10691,7 @@
       </w:pPr>
     </w:lvl>
   </w:abstractNum>
-  <w:abstractNum w:abstractNumId="22" w15:restartNumberingAfterBreak="0">
+  <w:abstractNum w:abstractNumId="24" w15:restartNumberingAfterBreak="0">
     <w:nsid w:val="5E176280"/>
     <w:multiLevelType w:val="hybridMultilevel"/>
     <w:tmpl w:val="A412E02A"/>
@@ -10365,7 +10780,7 @@
       </w:pPr>
     </w:lvl>
   </w:abstractNum>
-  <w:abstractNum w:abstractNumId="23" w15:restartNumberingAfterBreak="0">
+  <w:abstractNum w:abstractNumId="25" w15:restartNumberingAfterBreak="0">
     <w:nsid w:val="5ED30FF7"/>
     <w:multiLevelType w:val="hybridMultilevel"/>
     <w:tmpl w:val="B3AC66B8"/>
@@ -10454,7 +10869,7 @@
       </w:pPr>
     </w:lvl>
   </w:abstractNum>
-  <w:abstractNum w:abstractNumId="24" w15:restartNumberingAfterBreak="0">
+  <w:abstractNum w:abstractNumId="26" w15:restartNumberingAfterBreak="0">
     <w:nsid w:val="6561046C"/>
     <w:multiLevelType w:val="hybridMultilevel"/>
     <w:tmpl w:val="54BC4562"/>
@@ -10543,7 +10958,7 @@
       </w:pPr>
     </w:lvl>
   </w:abstractNum>
-  <w:abstractNum w:abstractNumId="25" w15:restartNumberingAfterBreak="0">
+  <w:abstractNum w:abstractNumId="27" w15:restartNumberingAfterBreak="0">
     <w:nsid w:val="664C2B59"/>
     <w:multiLevelType w:val="hybridMultilevel"/>
     <w:tmpl w:val="1CF0A4EA"/>
@@ -10632,7 +11047,7 @@
       </w:pPr>
     </w:lvl>
   </w:abstractNum>
-  <w:abstractNum w:abstractNumId="26" w15:restartNumberingAfterBreak="0">
+  <w:abstractNum w:abstractNumId="28" w15:restartNumberingAfterBreak="0">
     <w:nsid w:val="676E2B6B"/>
     <w:multiLevelType w:val="hybridMultilevel"/>
     <w:tmpl w:val="E7204440"/>
@@ -10745,7 +11160,7 @@
       </w:rPr>
     </w:lvl>
   </w:abstractNum>
-  <w:abstractNum w:abstractNumId="27" w15:restartNumberingAfterBreak="0">
+  <w:abstractNum w:abstractNumId="29" w15:restartNumberingAfterBreak="0">
     <w:nsid w:val="6F9628B0"/>
     <w:multiLevelType w:val="hybridMultilevel"/>
     <w:tmpl w:val="58B2F9FA"/>
@@ -10834,7 +11249,7 @@
       </w:pPr>
     </w:lvl>
   </w:abstractNum>
-  <w:abstractNum w:abstractNumId="28" w15:restartNumberingAfterBreak="0">
+  <w:abstractNum w:abstractNumId="30" w15:restartNumberingAfterBreak="0">
     <w:nsid w:val="78CF66F5"/>
     <w:multiLevelType w:val="hybridMultilevel"/>
     <w:tmpl w:val="FD460E22"/>
@@ -10923,7 +11338,7 @@
       </w:pPr>
     </w:lvl>
   </w:abstractNum>
-  <w:abstractNum w:abstractNumId="29" w15:restartNumberingAfterBreak="0">
+  <w:abstractNum w:abstractNumId="31" w15:restartNumberingAfterBreak="0">
     <w:nsid w:val="78FE7F30"/>
     <w:multiLevelType w:val="hybridMultilevel"/>
     <w:tmpl w:val="545CA6A2"/>
@@ -11012,7 +11427,7 @@
       </w:pPr>
     </w:lvl>
   </w:abstractNum>
-  <w:abstractNum w:abstractNumId="30" w15:restartNumberingAfterBreak="0">
+  <w:abstractNum w:abstractNumId="32" w15:restartNumberingAfterBreak="0">
     <w:nsid w:val="7C953AEA"/>
     <w:multiLevelType w:val="hybridMultilevel"/>
     <w:tmpl w:val="7CCC41C4"/>
@@ -11101,7 +11516,7 @@
       </w:pPr>
     </w:lvl>
   </w:abstractNum>
-  <w:abstractNum w:abstractNumId="31" w15:restartNumberingAfterBreak="0">
+  <w:abstractNum w:abstractNumId="33" w15:restartNumberingAfterBreak="0">
     <w:nsid w:val="7DB613C1"/>
     <w:multiLevelType w:val="hybridMultilevel"/>
     <w:tmpl w:val="CE10F88C"/>
@@ -11194,7 +11609,7 @@
     <w:abstractNumId w:val="2"/>
   </w:num>
   <w:num w:numId="2" w16cid:durableId="1596203068">
-    <w:abstractNumId w:val="20"/>
+    <w:abstractNumId w:val="22"/>
   </w:num>
   <w:num w:numId="3" w16cid:durableId="1960138834">
     <w:abstractNumId w:val="7"/>
@@ -11203,19 +11618,19 @@
     <w:abstractNumId w:val="11"/>
   </w:num>
   <w:num w:numId="5" w16cid:durableId="1785925703">
-    <w:abstractNumId w:val="27"/>
+    <w:abstractNumId w:val="29"/>
   </w:num>
   <w:num w:numId="6" w16cid:durableId="1729105484">
-    <w:abstractNumId w:val="15"/>
+    <w:abstractNumId w:val="16"/>
   </w:num>
   <w:num w:numId="7" w16cid:durableId="34280185">
-    <w:abstractNumId w:val="28"/>
+    <w:abstractNumId w:val="30"/>
   </w:num>
   <w:num w:numId="8" w16cid:durableId="1777092839">
     <w:abstractNumId w:val="1"/>
   </w:num>
   <w:num w:numId="9" w16cid:durableId="758718524">
-    <w:abstractNumId w:val="31"/>
+    <w:abstractNumId w:val="33"/>
   </w:num>
   <w:num w:numId="10" w16cid:durableId="160897060">
     <w:abstractNumId w:val="6"/>
@@ -11224,34 +11639,34 @@
     <w:abstractNumId w:val="4"/>
   </w:num>
   <w:num w:numId="12" w16cid:durableId="1721898317">
-    <w:abstractNumId w:val="23"/>
+    <w:abstractNumId w:val="25"/>
   </w:num>
   <w:num w:numId="13" w16cid:durableId="120151737">
-    <w:abstractNumId w:val="14"/>
+    <w:abstractNumId w:val="15"/>
   </w:num>
   <w:num w:numId="14" w16cid:durableId="1319262171">
     <w:abstractNumId w:val="8"/>
   </w:num>
   <w:num w:numId="15" w16cid:durableId="1268582426">
+    <w:abstractNumId w:val="21"/>
+  </w:num>
+  <w:num w:numId="16" w16cid:durableId="2088308342">
+    <w:abstractNumId w:val="28"/>
+  </w:num>
+  <w:num w:numId="17" w16cid:durableId="1731228637">
+    <w:abstractNumId w:val="26"/>
+  </w:num>
+  <w:num w:numId="18" w16cid:durableId="1541242673">
     <w:abstractNumId w:val="19"/>
   </w:num>
-  <w:num w:numId="16" w16cid:durableId="2088308342">
-    <w:abstractNumId w:val="26"/>
-  </w:num>
-  <w:num w:numId="17" w16cid:durableId="1731228637">
-    <w:abstractNumId w:val="24"/>
-  </w:num>
-  <w:num w:numId="18" w16cid:durableId="1541242673">
+  <w:num w:numId="19" w16cid:durableId="654335855">
     <w:abstractNumId w:val="17"/>
   </w:num>
-  <w:num w:numId="19" w16cid:durableId="654335855">
-    <w:abstractNumId w:val="16"/>
-  </w:num>
   <w:num w:numId="20" w16cid:durableId="1070467808">
-    <w:abstractNumId w:val="13"/>
+    <w:abstractNumId w:val="14"/>
   </w:num>
   <w:num w:numId="21" w16cid:durableId="1911192305">
-    <w:abstractNumId w:val="21"/>
+    <w:abstractNumId w:val="23"/>
   </w:num>
   <w:num w:numId="22" w16cid:durableId="1167987115">
     <w:abstractNumId w:val="12"/>
@@ -11260,10 +11675,10 @@
     <w:abstractNumId w:val="9"/>
   </w:num>
   <w:num w:numId="24" w16cid:durableId="1099522345">
-    <w:abstractNumId w:val="29"/>
+    <w:abstractNumId w:val="31"/>
   </w:num>
   <w:num w:numId="25" w16cid:durableId="56437003">
-    <w:abstractNumId w:val="22"/>
+    <w:abstractNumId w:val="24"/>
   </w:num>
   <w:num w:numId="26" w16cid:durableId="1210337143">
     <w:abstractNumId w:val="5"/>
@@ -11272,7 +11687,7 @@
     <w:abstractNumId w:val="10"/>
   </w:num>
   <w:num w:numId="28" w16cid:durableId="2003309175">
-    <w:abstractNumId w:val="25"/>
+    <w:abstractNumId w:val="27"/>
   </w:num>
   <w:num w:numId="29" w16cid:durableId="654456774">
     <w:abstractNumId w:val="0"/>
@@ -11281,10 +11696,16 @@
     <w:abstractNumId w:val="3"/>
   </w:num>
   <w:num w:numId="31" w16cid:durableId="30812947">
-    <w:abstractNumId w:val="30"/>
+    <w:abstractNumId w:val="32"/>
   </w:num>
   <w:num w:numId="32" w16cid:durableId="1839729555">
+    <w:abstractNumId w:val="20"/>
+  </w:num>
+  <w:num w:numId="33" w16cid:durableId="1479762195">
     <w:abstractNumId w:val="18"/>
+  </w:num>
+  <w:num w:numId="34" w16cid:durableId="1066101150">
+    <w:abstractNumId w:val="13"/>
   </w:num>
 </w:numbering>
 </file>

</xml_diff>